<commit_message>
Mb j'avais oublié de maj le rapport
</commit_message>
<xml_diff>
--- a/RAPPORT.docx
+++ b/RAPPORT.docx
@@ -37,14 +37,7 @@
           <w:sz w:val="50"/>
           <w:szCs w:val="50"/>
         </w:rPr>
-        <w:t xml:space="preserve">Projet : Réalisation d’un </w:t>
-      </w:r>
-      <w:r>
-        <w:rPr>
-          <w:sz w:val="50"/>
-          <w:szCs w:val="50"/>
-        </w:rPr>
-        <w:t>module personnalisé</w:t>
+        <w:t>Projet : Réalisation d’un module personnalisé</w:t>
       </w:r>
     </w:p>
     <w:p>
@@ -888,7 +881,25 @@
             <w:bCs w:val="0"/>
             <w:noProof/>
           </w:rPr>
-          <w:t>Il y a dans au moins un modèle un champ textuel, un champ numérique, un champ date un champ image et un champ select.</w:t>
+          <w:t>Il y a dans au moins un</w:t>
+        </w:r>
+        <w:r>
+          <w:rPr>
+            <w:rStyle w:val="Lienhypertexte"/>
+            <w:b w:val="0"/>
+            <w:bCs w:val="0"/>
+            <w:noProof/>
+          </w:rPr>
+          <w:t xml:space="preserve"> </w:t>
+        </w:r>
+        <w:r>
+          <w:rPr>
+            <w:rStyle w:val="Lienhypertexte"/>
+            <w:b w:val="0"/>
+            <w:bCs w:val="0"/>
+            <w:noProof/>
+          </w:rPr>
+          <w:t>modèle un champ textuel, un champ numérique, un champ date un champ image et un champ select.</w:t>
         </w:r>
         <w:r>
           <w:rPr>
@@ -1873,7 +1884,43 @@
             <w:bCs w:val="0"/>
             <w:noProof/>
           </w:rPr>
-          <w:t>Dans une des vues on trouve au moins un champ relationnel, un champ calculé, un champ related.</w:t>
+          <w:t>Dans un</w:t>
+        </w:r>
+        <w:r>
+          <w:rPr>
+            <w:rStyle w:val="Lienhypertexte"/>
+            <w:b w:val="0"/>
+            <w:bCs w:val="0"/>
+            <w:noProof/>
+          </w:rPr>
+          <w:t>e</w:t>
+        </w:r>
+        <w:r>
+          <w:rPr>
+            <w:rStyle w:val="Lienhypertexte"/>
+            <w:b w:val="0"/>
+            <w:bCs w:val="0"/>
+            <w:noProof/>
+          </w:rPr>
+          <w:t xml:space="preserve"> </w:t>
+        </w:r>
+        <w:r>
+          <w:rPr>
+            <w:rStyle w:val="Lienhypertexte"/>
+            <w:b w:val="0"/>
+            <w:bCs w:val="0"/>
+            <w:noProof/>
+          </w:rPr>
+          <w:t>d</w:t>
+        </w:r>
+        <w:r>
+          <w:rPr>
+            <w:rStyle w:val="Lienhypertexte"/>
+            <w:b w:val="0"/>
+            <w:bCs w:val="0"/>
+            <w:noProof/>
+          </w:rPr>
+          <w:t>es vues on trouve au moins un champ relationnel, un champ calculé, un champ related.</w:t>
         </w:r>
         <w:r>
           <w:rPr>
@@ -2125,6 +2172,9 @@
         <w:keepNext/>
       </w:pPr>
       <w:r>
+        <w:rPr>
+          <w:noProof/>
+        </w:rPr>
         <w:drawing>
           <wp:inline distT="0" distB="0" distL="0" distR="0" wp14:anchorId="139F97FD" wp14:editId="449441C0">
             <wp:extent cx="5760720" cy="4902200"/>
@@ -2203,7 +2253,15 @@
     <w:p>
       <w:r>
         <w:tab/>
-        <w:t xml:space="preserve">Une fois la Base de donnée créée, connectez vous a votre compte avec comme utilisateur « admin » et </w:t>
+        <w:t xml:space="preserve">Une fois la Base de </w:t>
+      </w:r>
+      <w:proofErr w:type="gramStart"/>
+      <w:r>
+        <w:t>donnée créée</w:t>
+      </w:r>
+      <w:proofErr w:type="gramEnd"/>
+      <w:r>
+        <w:t xml:space="preserve">, connectez vous a votre compte avec comme utilisateur « admin » et </w:t>
       </w:r>
       <w:proofErr w:type="spellStart"/>
       <w:r>
@@ -2342,11 +2400,16 @@
         <w:t xml:space="preserve"> Il est configuré pour hériter des droits de l’utilisateur de base Odoo (</w:t>
       </w:r>
       <w:proofErr w:type="spellStart"/>
+      <w:proofErr w:type="gramStart"/>
       <w:r>
         <w:t>base.</w:t>
       </w:r>
       <w:r>
-        <w:t>group_user</w:t>
+        <w:t>group</w:t>
+      </w:r>
+      <w:proofErr w:type="gramEnd"/>
+      <w:r>
+        <w:t>_user</w:t>
       </w:r>
       <w:proofErr w:type="spellEnd"/>
       <w:r>
@@ -2404,11 +2467,16 @@
         <w:t>de l’utilisateur de base Odoo (</w:t>
       </w:r>
       <w:proofErr w:type="spellStart"/>
+      <w:proofErr w:type="gramStart"/>
       <w:r>
         <w:t>base.</w:t>
       </w:r>
       <w:r>
-        <w:t>group_user</w:t>
+        <w:t>group</w:t>
+      </w:r>
+      <w:proofErr w:type="gramEnd"/>
+      <w:r>
+        <w:t>_user</w:t>
       </w:r>
       <w:proofErr w:type="spellEnd"/>
       <w:r>
@@ -2576,6 +2644,7 @@
       <w:r>
         <w:t xml:space="preserve">L'architecture des données du module a été construite autour de plusieurs entités distinctes, définies dans le dossier models/. Le cœur du système repose sur le modèle </w:t>
       </w:r>
+      <w:proofErr w:type="gramStart"/>
       <w:r>
         <w:rPr>
           <w:b/>
@@ -2583,10 +2652,12 @@
         </w:rPr>
         <w:t>cyberware.implant</w:t>
       </w:r>
+      <w:proofErr w:type="gramEnd"/>
       <w:r>
         <w:t xml:space="preserve">, qui gère le catalogue des produits. Il interagit avec le modèle </w:t>
       </w:r>
       <w:proofErr w:type="spellStart"/>
+      <w:proofErr w:type="gramStart"/>
       <w:r>
         <w:rPr>
           <w:b/>
@@ -2595,10 +2666,12 @@
         <w:t>cyberware.client</w:t>
       </w:r>
       <w:proofErr w:type="spellEnd"/>
+      <w:proofErr w:type="gramEnd"/>
       <w:r>
         <w:t xml:space="preserve">, représentant les patients, et le modèle </w:t>
       </w:r>
       <w:proofErr w:type="spellStart"/>
+      <w:proofErr w:type="gramStart"/>
       <w:r>
         <w:rPr>
           <w:b/>
@@ -2607,10 +2680,12 @@
         <w:t>cyberware.manufacturer</w:t>
       </w:r>
       <w:proofErr w:type="spellEnd"/>
+      <w:proofErr w:type="gramEnd"/>
       <w:r>
         <w:t xml:space="preserve">, référençant les entreprises fabricantes. Un modèle intermédiaire, </w:t>
       </w:r>
       <w:proofErr w:type="spellStart"/>
+      <w:proofErr w:type="gramStart"/>
       <w:r>
         <w:rPr>
           <w:b/>
@@ -2619,6 +2694,7 @@
         <w:t>cyberware.implantation</w:t>
       </w:r>
       <w:proofErr w:type="spellEnd"/>
+      <w:proofErr w:type="gramEnd"/>
       <w:r>
         <w:t>, a également été créé pour historiser les opérations.</w:t>
       </w:r>
@@ -2630,27 +2706,301 @@
       <w:bookmarkStart w:id="12" w:name="_Toc215649242"/>
       <w:bookmarkStart w:id="13" w:name="_Toc215649288"/>
       <w:r>
-        <w:t>Il y a dans au moins un modèle un champ textuel, un champ numérique, un champ date un champ image et un champ select.</w:t>
+        <w:t>Il y a dans au moins un modèle un champ textuel, un champ numérique, un champ date un champ image</w:t>
+      </w:r>
+      <w:r>
+        <w:t>,</w:t>
+      </w:r>
+      <w:r>
+        <w:t xml:space="preserve"> un champ select</w:t>
       </w:r>
       <w:bookmarkEnd w:id="12"/>
       <w:bookmarkEnd w:id="13"/>
-    </w:p>
-    <w:p>
-      <w:r>
-        <w:tab/>
-      </w:r>
-      <w:r>
-        <w:t>Les modèles développés intègrent la totalité des types de champs requis. Le modèle principal,</w:t>
+      <w:r>
+        <w:t xml:space="preserve">, </w:t>
+      </w:r>
+      <w:r>
+        <w:t>un champ calculé et un champ related.</w:t>
+      </w:r>
+    </w:p>
+    <w:p>
+      <w:r>
+        <w:t xml:space="preserve">J'ai concentré l'ensemble des types de champs requis au sein du modèle principal </w:t>
+      </w:r>
+      <w:proofErr w:type="spellStart"/>
+      <w:proofErr w:type="gramStart"/>
+      <w:r>
+        <w:t>cyberware.client</w:t>
+      </w:r>
+      <w:proofErr w:type="spellEnd"/>
+      <w:proofErr w:type="gramEnd"/>
+      <w:r>
+        <w:t xml:space="preserve"> (fichier </w:t>
+      </w:r>
+      <w:r>
+        <w:rPr>
+          <w:i/>
+          <w:iCs/>
+        </w:rPr>
+        <w:t>models/cyberware_client.py</w:t>
+      </w:r>
+      <w:r>
+        <w:t>) pour offrir une fiche patient complète.</w:t>
+      </w:r>
+    </w:p>
+    <w:p>
+      <w:r>
+        <w:t>On y trouve :</w:t>
+      </w:r>
+    </w:p>
+    <w:p>
+      <w:pPr>
+        <w:pStyle w:val="Paragraphedeliste"/>
+        <w:numPr>
+          <w:ilvl w:val="0"/>
+          <w:numId w:val="9"/>
+        </w:numPr>
+      </w:pPr>
+      <w:r>
+        <w:t xml:space="preserve">Un </w:t>
       </w:r>
       <w:r>
         <w:rPr>
           <w:b/>
           <w:bCs/>
         </w:rPr>
-        <w:t xml:space="preserve"> cyberware.implant</w:t>
-      </w:r>
-      <w:r>
-        <w:t xml:space="preserve"> (fichier </w:t>
+        <w:t>champ textuel</w:t>
+      </w:r>
+      <w:r>
+        <w:t xml:space="preserve"> (</w:t>
+      </w:r>
+      <w:proofErr w:type="spellStart"/>
+      <w:r>
+        <w:t>notes_medicales</w:t>
+      </w:r>
+      <w:proofErr w:type="spellEnd"/>
+      <w:r>
+        <w:t>) pour saisir l'historique médical complet.</w:t>
+      </w:r>
+    </w:p>
+    <w:p>
+      <w:pPr>
+        <w:pStyle w:val="Paragraphedeliste"/>
+        <w:numPr>
+          <w:ilvl w:val="0"/>
+          <w:numId w:val="9"/>
+        </w:numPr>
+      </w:pPr>
+      <w:r>
+        <w:t xml:space="preserve">Un </w:t>
+      </w:r>
+      <w:r>
+        <w:rPr>
+          <w:b/>
+          <w:bCs/>
+        </w:rPr>
+        <w:t>champ numérique</w:t>
+      </w:r>
+      <w:r>
+        <w:t xml:space="preserve"> (</w:t>
+      </w:r>
+      <w:proofErr w:type="spellStart"/>
+      <w:r>
+        <w:t>niveau_essence_max</w:t>
+      </w:r>
+      <w:proofErr w:type="spellEnd"/>
+      <w:r>
+        <w:t>) définissant la capacité du patient.</w:t>
+      </w:r>
+    </w:p>
+    <w:p>
+      <w:pPr>
+        <w:pStyle w:val="Paragraphedeliste"/>
+        <w:numPr>
+          <w:ilvl w:val="0"/>
+          <w:numId w:val="9"/>
+        </w:numPr>
+      </w:pPr>
+      <w:r>
+        <w:t xml:space="preserve">Un </w:t>
+      </w:r>
+      <w:r>
+        <w:rPr>
+          <w:b/>
+          <w:bCs/>
+        </w:rPr>
+        <w:t>champ date</w:t>
+      </w:r>
+      <w:r>
+        <w:t xml:space="preserve"> (</w:t>
+      </w:r>
+      <w:proofErr w:type="spellStart"/>
+      <w:r>
+        <w:t>date_naissance</w:t>
+      </w:r>
+      <w:proofErr w:type="spellEnd"/>
+      <w:r>
+        <w:t>) indispensable pour le suivi.</w:t>
+      </w:r>
+    </w:p>
+    <w:p>
+      <w:pPr>
+        <w:pStyle w:val="Paragraphedeliste"/>
+        <w:numPr>
+          <w:ilvl w:val="0"/>
+          <w:numId w:val="9"/>
+        </w:numPr>
+      </w:pPr>
+      <w:r>
+        <w:t xml:space="preserve">Un </w:t>
+      </w:r>
+      <w:r>
+        <w:rPr>
+          <w:b/>
+          <w:bCs/>
+        </w:rPr>
+        <w:t>champ image</w:t>
+      </w:r>
+      <w:r>
+        <w:t xml:space="preserve"> (</w:t>
+      </w:r>
+      <w:proofErr w:type="spellStart"/>
+      <w:r>
+        <w:t>image_client</w:t>
+      </w:r>
+      <w:proofErr w:type="spellEnd"/>
+      <w:r>
+        <w:t>) pour l'avatar.</w:t>
+      </w:r>
+    </w:p>
+    <w:p>
+      <w:pPr>
+        <w:pStyle w:val="Paragraphedeliste"/>
+        <w:numPr>
+          <w:ilvl w:val="0"/>
+          <w:numId w:val="9"/>
+        </w:numPr>
+      </w:pPr>
+      <w:r>
+        <w:t xml:space="preserve">Un </w:t>
+      </w:r>
+      <w:r>
+        <w:rPr>
+          <w:b/>
+          <w:bCs/>
+        </w:rPr>
+        <w:t>champ select</w:t>
+      </w:r>
+      <w:r>
+        <w:t xml:space="preserve"> (</w:t>
+      </w:r>
+      <w:proofErr w:type="spellStart"/>
+      <w:r>
+        <w:t>groupe_sanguin</w:t>
+      </w:r>
+      <w:proofErr w:type="spellEnd"/>
+      <w:r>
+        <w:t xml:space="preserve">) proposant une liste de choix </w:t>
+      </w:r>
+      <w:proofErr w:type="spellStart"/>
+      <w:r>
+        <w:t>pré-définis</w:t>
+      </w:r>
+      <w:proofErr w:type="spellEnd"/>
+      <w:r>
+        <w:t xml:space="preserve"> (A+, B-, etc.).</w:t>
+      </w:r>
+    </w:p>
+    <w:p>
+      <w:pPr>
+        <w:pStyle w:val="Paragraphedeliste"/>
+        <w:numPr>
+          <w:ilvl w:val="0"/>
+          <w:numId w:val="9"/>
+        </w:numPr>
+      </w:pPr>
+      <w:r>
+        <w:t xml:space="preserve">Un </w:t>
+      </w:r>
+      <w:r>
+        <w:rPr>
+          <w:b/>
+          <w:bCs/>
+        </w:rPr>
+        <w:t>champ calculé</w:t>
+      </w:r>
+      <w:r>
+        <w:t xml:space="preserve"> (</w:t>
+      </w:r>
+      <w:proofErr w:type="spellStart"/>
+      <w:r>
+        <w:t>age</w:t>
+      </w:r>
+      <w:proofErr w:type="spellEnd"/>
+      <w:r>
+        <w:t>), qui se met à jour automatiquement selon la date de naissance.</w:t>
+      </w:r>
+    </w:p>
+    <w:p>
+      <w:pPr>
+        <w:pStyle w:val="Paragraphedeliste"/>
+        <w:numPr>
+          <w:ilvl w:val="0"/>
+          <w:numId w:val="9"/>
+        </w:numPr>
+      </w:pPr>
+      <w:r>
+        <w:t xml:space="preserve">Un </w:t>
+      </w:r>
+      <w:r>
+        <w:rPr>
+          <w:b/>
+          <w:bCs/>
+        </w:rPr>
+        <w:t>champ related</w:t>
+      </w:r>
+      <w:r>
+        <w:t xml:space="preserve"> (</w:t>
+      </w:r>
+      <w:proofErr w:type="spellStart"/>
+      <w:r>
+        <w:t>email_user</w:t>
+      </w:r>
+      <w:proofErr w:type="spellEnd"/>
+      <w:r>
+        <w:t>), qui récupère automatiquement l'adresse email depuis le compte utilisateur lié, sans duplication de données.</w:t>
+      </w:r>
+    </w:p>
+    <w:p>
+      <w:pPr>
+        <w:pStyle w:val="Titre2"/>
+      </w:pPr>
+      <w:bookmarkStart w:id="14" w:name="_Toc215649243"/>
+      <w:bookmarkStart w:id="15" w:name="_Toc215649289"/>
+      <w:r>
+        <w:t>Il y a au moins dans un modèle une méthode qui contrôle des données.</w:t>
+      </w:r>
+      <w:bookmarkEnd w:id="14"/>
+      <w:bookmarkEnd w:id="15"/>
+    </w:p>
+    <w:p>
+      <w:pPr>
+        <w:ind w:firstLine="708"/>
+      </w:pPr>
+      <w:r>
+        <w:t xml:space="preserve">Pour garantir la cohérence et la fiabilité des informations enregistrées, une logique de validation a été intégrée directement dans le modèle principal </w:t>
+      </w:r>
+      <w:proofErr w:type="gramStart"/>
+      <w:r>
+        <w:rPr>
+          <w:b/>
+          <w:bCs/>
+        </w:rPr>
+        <w:t>cyberware.implant</w:t>
+      </w:r>
+      <w:proofErr w:type="gramEnd"/>
+      <w:r>
+        <w:t xml:space="preserve"> (dans le fichier </w:t>
       </w:r>
       <w:r>
         <w:rPr>
@@ -2660,55 +3010,7 @@
         <w:t>models/cyberware_implant.py</w:t>
       </w:r>
       <w:r>
-        <w:t>), regroupe la majorité de ces types. On y trouve des champs textuels (</w:t>
-      </w:r>
-      <w:proofErr w:type="spellStart"/>
-      <w:r>
-        <w:t>nom_implant</w:t>
-      </w:r>
-      <w:proofErr w:type="spellEnd"/>
-      <w:r>
-        <w:t>, description), des champs numériques (</w:t>
-      </w:r>
-      <w:proofErr w:type="spellStart"/>
-      <w:r>
-        <w:t>prix_euro</w:t>
-      </w:r>
-      <w:proofErr w:type="spellEnd"/>
-      <w:r>
-        <w:t xml:space="preserve">, </w:t>
-      </w:r>
-      <w:proofErr w:type="spellStart"/>
-      <w:r>
-        <w:t>cout_essence</w:t>
-      </w:r>
-      <w:proofErr w:type="spellEnd"/>
-      <w:r>
-        <w:t>), un champ image pour le visuel (</w:t>
-      </w:r>
-      <w:proofErr w:type="spellStart"/>
-      <w:r>
-        <w:t>image_implant</w:t>
-      </w:r>
-      <w:proofErr w:type="spellEnd"/>
-      <w:r>
-        <w:t>) ainsi que plusieurs listes de sélection (</w:t>
-      </w:r>
-      <w:proofErr w:type="spellStart"/>
-      <w:r>
-        <w:t>type_implant</w:t>
-      </w:r>
-      <w:proofErr w:type="spellEnd"/>
-      <w:r>
-        <w:t xml:space="preserve">, </w:t>
-      </w:r>
-      <w:proofErr w:type="spellStart"/>
-      <w:r>
-        <w:t>rarete</w:t>
-      </w:r>
-      <w:proofErr w:type="spellEnd"/>
-      <w:r>
-        <w:t>, emplacement).</w:t>
+        <w:t>.)</w:t>
       </w:r>
     </w:p>
     <w:p>
@@ -2716,104 +3018,153 @@
         <w:ind w:firstLine="708"/>
       </w:pPr>
       <w:r>
-        <w:t xml:space="preserve">Pour compléter cette liste, le type de champ date est implémenté dans le modèle </w:t>
-      </w:r>
-      <w:proofErr w:type="spellStart"/>
+        <w:t xml:space="preserve">Cette validation est assurée par la méthode </w:t>
+      </w:r>
       <w:r>
         <w:rPr>
           <w:b/>
           <w:bCs/>
         </w:rPr>
-        <w:t>cyberware.client</w:t>
-      </w:r>
-      <w:proofErr w:type="spellEnd"/>
-      <w:r>
-        <w:t xml:space="preserve"> (fichier </w:t>
-      </w:r>
-      <w:r>
-        <w:rPr>
-          <w:i/>
-          <w:iCs/>
-        </w:rPr>
-        <w:t>models/cyberware_client.py</w:t>
-      </w:r>
-      <w:r>
-        <w:t xml:space="preserve">) via le champ </w:t>
-      </w:r>
-      <w:proofErr w:type="spellStart"/>
-      <w:r>
-        <w:t>date_naissance</w:t>
-      </w:r>
-      <w:proofErr w:type="spellEnd"/>
-      <w:r>
-        <w:t>, utilisé pour définir l'âge des patients.</w:t>
-      </w:r>
-    </w:p>
-    <w:p>
-      <w:pPr>
-        <w:pStyle w:val="Titre2"/>
-      </w:pPr>
-      <w:bookmarkStart w:id="14" w:name="_Toc215649243"/>
-      <w:bookmarkStart w:id="15" w:name="_Toc215649289"/>
-      <w:r>
-        <w:t xml:space="preserve">Il y a au moins dans un modèle </w:t>
-      </w:r>
-      <w:r>
-        <w:t>une méthode</w:t>
-      </w:r>
-      <w:r>
-        <w:t xml:space="preserve"> qui contrôle des données.</w:t>
-      </w:r>
-      <w:bookmarkEnd w:id="14"/>
-      <w:bookmarkEnd w:id="15"/>
-    </w:p>
-    <w:p>
-      <w:pPr>
-        <w:ind w:firstLine="708"/>
-      </w:pPr>
-      <w:r>
-        <w:t xml:space="preserve">Pour garantir la cohérence et la fiabilité des informations enregistrées, une logique de validation a été intégrée directement dans le modèle principal </w:t>
-      </w:r>
+        <w:t>_</w:t>
+      </w:r>
+      <w:proofErr w:type="spellStart"/>
       <w:r>
         <w:rPr>
           <w:b/>
           <w:bCs/>
         </w:rPr>
-        <w:t>cyberware.implant</w:t>
-      </w:r>
-      <w:r>
-        <w:t xml:space="preserve"> (</w:t>
-      </w:r>
-      <w:r>
-        <w:t xml:space="preserve">dans le fichier </w:t>
-      </w:r>
-      <w:r>
-        <w:rPr>
-          <w:i/>
-          <w:iCs/>
-        </w:rPr>
-        <w:t>models/cyberware_implant.py</w:t>
-      </w:r>
-      <w:r>
-        <w:t>.</w:t>
-      </w:r>
-      <w:r>
-        <w:t>)</w:t>
-      </w:r>
+        <w:t>check_valeurs_positives</w:t>
+      </w:r>
+      <w:proofErr w:type="spellEnd"/>
+      <w:r>
+        <w:t>, qui utilise le décorateur @</w:t>
+      </w:r>
+      <w:proofErr w:type="gramStart"/>
+      <w:r>
+        <w:t>api.constrains</w:t>
+      </w:r>
+      <w:proofErr w:type="gramEnd"/>
+      <w:r>
+        <w:t xml:space="preserve">. Cette méthode est automatiquement exécutée à chaque création ou modification d'un implant. Elle vérifie spécifiquement que les </w:t>
+      </w:r>
+      <w:r>
+        <w:lastRenderedPageBreak/>
+        <w:t xml:space="preserve">champs </w:t>
+      </w:r>
+      <w:proofErr w:type="spellStart"/>
+      <w:r>
+        <w:t>prix_euro</w:t>
+      </w:r>
+      <w:proofErr w:type="spellEnd"/>
+      <w:r>
+        <w:t xml:space="preserve"> et </w:t>
+      </w:r>
+      <w:proofErr w:type="spellStart"/>
+      <w:r>
+        <w:t>cout_essence</w:t>
+      </w:r>
+      <w:proofErr w:type="spellEnd"/>
+      <w:r>
+        <w:t xml:space="preserve"> ne contiennent pas de valeurs négatives. Si cette règle est enfreinte, le système interrompt l'opération de sauvegarde et déclenche une exception </w:t>
+      </w:r>
+      <w:proofErr w:type="spellStart"/>
+      <w:r>
+        <w:t>ValidationError</w:t>
+      </w:r>
+      <w:proofErr w:type="spellEnd"/>
+      <w:r>
+        <w:t>, affichant un message d'erreur à l'utilisateur pour l'empêcher d'enregistrer des données invalides.</w:t>
+      </w:r>
+    </w:p>
+    <w:p>
+      <w:pPr>
+        <w:pStyle w:val="Titre2"/>
+      </w:pPr>
+      <w:bookmarkStart w:id="16" w:name="_Toc215649244"/>
+      <w:bookmarkStart w:id="17" w:name="_Toc215649290"/>
+      <w:r>
+        <w:t>Il existe au moins une relation un à plusieurs et une relation plusieurs à plusieurs.</w:t>
+      </w:r>
+      <w:bookmarkEnd w:id="16"/>
+      <w:bookmarkEnd w:id="17"/>
     </w:p>
     <w:p>
       <w:pPr>
         <w:ind w:firstLine="708"/>
       </w:pPr>
       <w:r>
-        <w:t xml:space="preserve">Cette validation est assurée par la méthode </w:t>
-      </w:r>
+        <w:t>J'ai intégré les deux types de relations requises</w:t>
+      </w:r>
+      <w:r>
+        <w:t xml:space="preserve"> dans </w:t>
+      </w:r>
+      <w:proofErr w:type="gramStart"/>
+      <w:r>
+        <w:t>plusieurs  de</w:t>
+      </w:r>
+      <w:proofErr w:type="gramEnd"/>
+      <w:r>
+        <w:t xml:space="preserve"> mes modèles, mais celui que je vais prendre en exemple est le </w:t>
+      </w:r>
+      <w:r>
+        <w:t xml:space="preserve">modèle </w:t>
+      </w:r>
+      <w:proofErr w:type="spellStart"/>
+      <w:proofErr w:type="gramStart"/>
+      <w:r>
+        <w:t>cyberware.client</w:t>
+      </w:r>
+      <w:proofErr w:type="spellEnd"/>
+      <w:proofErr w:type="gramEnd"/>
+      <w:r>
+        <w:t xml:space="preserve"> (fichier cyberware_client.py).</w:t>
+      </w:r>
+    </w:p>
+    <w:p>
+      <w:pPr>
+        <w:pStyle w:val="Titre3"/>
+      </w:pPr>
+      <w:r>
+        <w:t>Relation "Un à Plusieurs"</w:t>
+      </w:r>
+    </w:p>
+    <w:p>
+      <w:pPr>
+        <w:ind w:firstLine="708"/>
+      </w:pPr>
+      <w:r>
+        <w:t>J</w:t>
+      </w:r>
+      <w:r>
+        <w:t xml:space="preserve">'ai inclus une relation de type Un à Plusieurs en utilisant le champ </w:t>
+      </w:r>
+      <w:proofErr w:type="spellStart"/>
       <w:r>
         <w:rPr>
           <w:b/>
           <w:bCs/>
         </w:rPr>
-        <w:t>_</w:t>
+        <w:t>implantation_ids</w:t>
+      </w:r>
+      <w:proofErr w:type="spellEnd"/>
+      <w:r>
+        <w:t>. Ce champ permet de relier le client à tous les enregistrements de son historique d'opérations, ce qui est essentiel pour afficher l'historique complet de toutes ses implantations passées et futures.</w:t>
+      </w:r>
+    </w:p>
+    <w:p>
+      <w:pPr>
+        <w:pStyle w:val="Titre3"/>
+      </w:pPr>
+      <w:r>
+        <w:t>Relation "Plusieurs à Plusieurs"</w:t>
+      </w:r>
+    </w:p>
+    <w:p>
+      <w:pPr>
+        <w:ind w:firstLine="708"/>
+      </w:pPr>
+      <w:r>
+        <w:t xml:space="preserve">J'ai également défini une relation de type Plusieurs à Plusieurs en utilisant le champ </w:t>
       </w:r>
       <w:proofErr w:type="spellStart"/>
       <w:r>
@@ -2821,89 +3172,31 @@
           <w:b/>
           <w:bCs/>
         </w:rPr>
-        <w:t>check_valeurs_positives</w:t>
-      </w:r>
-      <w:proofErr w:type="spellEnd"/>
-      <w:r>
-        <w:t xml:space="preserve">, qui utilise le décorateur @api.constrains. Cette méthode est automatiquement exécutée à chaque création ou modification d'un implant. Elle vérifie spécifiquement que les champs </w:t>
-      </w:r>
-      <w:proofErr w:type="spellStart"/>
-      <w:r>
-        <w:t>prix_euro</w:t>
-      </w:r>
-      <w:proofErr w:type="spellEnd"/>
-      <w:r>
-        <w:t xml:space="preserve"> et </w:t>
-      </w:r>
-      <w:proofErr w:type="spellStart"/>
-      <w:r>
-        <w:t>cout_essence</w:t>
-      </w:r>
-      <w:proofErr w:type="spellEnd"/>
-      <w:r>
-        <w:t xml:space="preserve"> ne contiennent pas de valeurs négatives. Si cette règle est enfreinte, le système interrompt l'opération de sauvegarde et déclenche une exception </w:t>
-      </w:r>
-      <w:proofErr w:type="spellStart"/>
-      <w:r>
-        <w:t>ValidationError</w:t>
-      </w:r>
-      <w:proofErr w:type="spellEnd"/>
-      <w:r>
-        <w:t>, affichant un message d'erreur à l'utilisateur pour l'empêcher d'enregistrer des données invalides.</w:t>
+        <w:t>implant_ids</w:t>
+      </w:r>
+      <w:proofErr w:type="spellEnd"/>
+      <w:r>
+        <w:t>. Cette relation permet de lister tous les implants actuellement possédés par le client. Ce type de lien est nécessaire car un client peut posséder plusieurs implants, et chaque modèle d'implant peut être installé sur de nombreux clients différents.</w:t>
       </w:r>
     </w:p>
     <w:p>
       <w:pPr>
         <w:pStyle w:val="Titre2"/>
       </w:pPr>
-      <w:bookmarkStart w:id="16" w:name="_Toc215649244"/>
-      <w:bookmarkStart w:id="17" w:name="_Toc215649290"/>
-      <w:r>
-        <w:lastRenderedPageBreak/>
-        <w:t>Il existe au moins une relation un à plusieurs et une relation plusieurs à plusieurs.</w:t>
-      </w:r>
-      <w:bookmarkEnd w:id="16"/>
-      <w:bookmarkEnd w:id="17"/>
+      <w:bookmarkStart w:id="18" w:name="_Toc215649245"/>
+      <w:bookmarkStart w:id="19" w:name="_Toc215649291"/>
+      <w:r>
+        <w:t>Il existe des données de démo au format xml. Certains enregistrements sont liés par les relations d'autres non.</w:t>
+      </w:r>
+      <w:bookmarkEnd w:id="18"/>
+      <w:bookmarkEnd w:id="19"/>
     </w:p>
     <w:p>
       <w:pPr>
         <w:ind w:firstLine="708"/>
       </w:pPr>
       <w:r>
-        <w:t>J'ai intégré les deux types de relations requises</w:t>
-      </w:r>
-      <w:r>
-        <w:t xml:space="preserve"> dans plusieurs  de mes modèles, mais celui que je vais prendre en exemple est le </w:t>
-      </w:r>
-      <w:r>
-        <w:t xml:space="preserve">modèle </w:t>
-      </w:r>
-      <w:proofErr w:type="spellStart"/>
-      <w:r>
-        <w:t>cyberware.client</w:t>
-      </w:r>
-      <w:proofErr w:type="spellEnd"/>
-      <w:r>
-        <w:t xml:space="preserve"> (fichier cyberware_client.py).</w:t>
-      </w:r>
-    </w:p>
-    <w:p>
-      <w:pPr>
-        <w:pStyle w:val="Titre3"/>
-      </w:pPr>
-      <w:r>
-        <w:t>Relation "Un à Plusieurs"</w:t>
-      </w:r>
-    </w:p>
-    <w:p>
-      <w:pPr>
-        <w:ind w:firstLine="708"/>
-      </w:pPr>
-      <w:r>
-        <w:t>J</w:t>
-      </w:r>
-      <w:r>
-        <w:t xml:space="preserve">'ai inclus une relation de type Un à Plusieurs en utilisant le champ </w:t>
+        <w:t>Le fichier principal est au format XML (</w:t>
       </w:r>
       <w:proofErr w:type="spellStart"/>
       <w:r>
@@ -2911,59 +3204,58 @@
           <w:b/>
           <w:bCs/>
         </w:rPr>
-        <w:t>implantation_ids</w:t>
-      </w:r>
-      <w:proofErr w:type="spellEnd"/>
-      <w:r>
-        <w:t>. Ce champ permet de relier le client à tous les enregistrements de son historique d'opérations, ce qui est essentiel pour afficher l'historique complet de toutes ses implantations passées et futures.</w:t>
-      </w:r>
-    </w:p>
-    <w:p>
-      <w:pPr>
-        <w:pStyle w:val="Titre3"/>
-      </w:pPr>
-      <w:r>
-        <w:t>Relation "Plusieurs à Plusieurs"</w:t>
-      </w:r>
-    </w:p>
-    <w:p>
-      <w:pPr>
-        <w:ind w:firstLine="708"/>
-      </w:pPr>
-      <w:r>
-        <w:t xml:space="preserve">J'ai également défini une relation de type Plusieurs à Plusieurs en utilisant le champ </w:t>
-      </w:r>
-      <w:proofErr w:type="spellStart"/>
+        <w:t>demo</w:t>
+      </w:r>
+      <w:proofErr w:type="spellEnd"/>
       <w:r>
         <w:rPr>
           <w:b/>
           <w:bCs/>
         </w:rPr>
-        <w:t>implant_ids</w:t>
-      </w:r>
-      <w:proofErr w:type="spellEnd"/>
-      <w:r>
-        <w:t>. Cette relation permet de lister tous les implants actuellement possédés par le client. Ce type de lien est nécessaire car un client peut posséder plusieurs implants, et chaque modèle d'implant peut être installé sur de nombreux clients différents.</w:t>
-      </w:r>
-    </w:p>
-    <w:p>
-      <w:pPr>
-        <w:pStyle w:val="Titre2"/>
-      </w:pPr>
-      <w:bookmarkStart w:id="18" w:name="_Toc215649245"/>
-      <w:bookmarkStart w:id="19" w:name="_Toc215649291"/>
-      <w:r>
-        <w:t>Il existe des données de démo au format xml. Certains enregistrements sont liés par les relations d'autres non.</w:t>
-      </w:r>
-      <w:bookmarkEnd w:id="18"/>
-      <w:bookmarkEnd w:id="19"/>
+        <w:t>/cyberware.demo.xml</w:t>
+      </w:r>
+      <w:r>
+        <w:t xml:space="preserve">), qui est utilisé pour créer la majorité des enregistrements comme les implants et les clients. Ce format est essentiel, car il permet d'établir les liens relationnels entre les différents modèles. Par exemple, pour créer un implant, j'utilise l'attribut </w:t>
+      </w:r>
+      <w:proofErr w:type="spellStart"/>
+      <w:r>
+        <w:t>ref</w:t>
+      </w:r>
+      <w:proofErr w:type="spellEnd"/>
+      <w:r>
+        <w:t xml:space="preserve"> dans le XML (</w:t>
+      </w:r>
+      <w:proofErr w:type="gramStart"/>
+      <w:r>
+        <w:t>ex:</w:t>
+      </w:r>
+      <w:proofErr w:type="gramEnd"/>
+      <w:r>
+        <w:t xml:space="preserve"> </w:t>
+      </w:r>
+      <w:proofErr w:type="spellStart"/>
+      <w:r>
+        <w:t>ref</w:t>
+      </w:r>
+      <w:proofErr w:type="spellEnd"/>
+      <w:r>
+        <w:t>="</w:t>
+      </w:r>
+      <w:proofErr w:type="spellStart"/>
+      <w:r>
+        <w:t>demo_manuf_militech</w:t>
+      </w:r>
+      <w:proofErr w:type="spellEnd"/>
+      <w:r>
+        <w:t>") afin de le lier immédiatement à un fabricant spécifique.</w:t>
+      </w:r>
     </w:p>
     <w:p>
       <w:pPr>
         <w:ind w:firstLine="708"/>
       </w:pPr>
       <w:r>
-        <w:t>Le fichier principal est au format XML (</w:t>
+        <w:t xml:space="preserve">En parallèle, certains enregistrements sont définis de manière autonome sans lien relationnel immédiat, comme les profils clients créés dans </w:t>
       </w:r>
       <w:proofErr w:type="spellStart"/>
       <w:r>
@@ -2979,207 +3271,146 @@
           <w:b/>
           <w:bCs/>
         </w:rPr>
-        <w:t>/cyberware.demo.xml</w:t>
-      </w:r>
-      <w:r>
-        <w:t xml:space="preserve">), qui est utilisé pour créer la majorité des enregistrements comme les implants et les clients. Ce format est essentiel, car il permet d'établir les liens relationnels entre les différents modèles. Par exemple, pour créer un implant, j'utilise l'attribut </w:t>
-      </w:r>
-      <w:proofErr w:type="spellStart"/>
-      <w:r>
-        <w:t>ref</w:t>
-      </w:r>
-      <w:proofErr w:type="spellEnd"/>
-      <w:r>
-        <w:t xml:space="preserve"> dans le XML (ex: </w:t>
-      </w:r>
-      <w:proofErr w:type="spellStart"/>
-      <w:r>
-        <w:t>ref</w:t>
-      </w:r>
-      <w:proofErr w:type="spellEnd"/>
-      <w:r>
-        <w:t>="</w:t>
-      </w:r>
-      <w:proofErr w:type="spellStart"/>
-      <w:r>
-        <w:t>demo_manuf_militech</w:t>
-      </w:r>
-      <w:proofErr w:type="spellEnd"/>
-      <w:r>
-        <w:t>") afin de le lier immédiatement à un fabricant spécifique.</w:t>
-      </w:r>
+        <w:t>/cyberware.client.xml</w:t>
+      </w:r>
+      <w:r>
+        <w:t>. Ces enregistrements sont définis avec leurs propres valeurs (nom, pseudo, date de naissance calculée) sans être dépendants d'autres objets du module lors de leur création initiale.</w:t>
+      </w:r>
+    </w:p>
+    <w:p>
+      <w:pPr>
+        <w:pStyle w:val="Titre2"/>
+      </w:pPr>
+      <w:bookmarkStart w:id="20" w:name="_Toc215649246"/>
+      <w:bookmarkStart w:id="21" w:name="_Toc215649292"/>
+      <w:r>
+        <w:t>Un des modèles étend un modèle d’Odoo.</w:t>
+      </w:r>
+      <w:bookmarkEnd w:id="20"/>
+      <w:bookmarkEnd w:id="21"/>
     </w:p>
     <w:p>
       <w:pPr>
         <w:ind w:firstLine="708"/>
       </w:pPr>
       <w:r>
-        <w:t xml:space="preserve">En parallèle, certains enregistrements sont définis de manière autonome sans lien relationnel immédiat, comme les profils clients créés dans </w:t>
-      </w:r>
-      <w:proofErr w:type="spellStart"/>
+        <w:t>J'ai choisi d'intégrer certaines fonctionnalités du module directement sur les fiches de contact existantes dans Odoo plutôt que de recréer une entité de personne</w:t>
+      </w:r>
+      <w:r>
+        <w:t xml:space="preserve"> </w:t>
+      </w:r>
+      <w:r>
+        <w:lastRenderedPageBreak/>
+        <w:t>(c’est pour cela qu’il fallait activer le module Contacts au début)</w:t>
+      </w:r>
+      <w:r>
+        <w:t xml:space="preserve">. Pour cela, j'ai utilisé l'héritage dans le fichier </w:t>
+      </w:r>
       <w:r>
         <w:rPr>
           <w:b/>
           <w:bCs/>
         </w:rPr>
-        <w:t>demo</w:t>
-      </w:r>
-      <w:proofErr w:type="spellEnd"/>
+        <w:t>models/res_partner.py</w:t>
+      </w:r>
+      <w:r>
+        <w:t>.</w:t>
+      </w:r>
+    </w:p>
+    <w:p/>
+    <w:p>
+      <w:pPr>
+        <w:ind w:firstLine="708"/>
+      </w:pPr>
+      <w:r>
+        <w:t>Grâce à l'attribut _</w:t>
+      </w:r>
+      <w:proofErr w:type="spellStart"/>
+      <w:r>
+        <w:t>inherit</w:t>
+      </w:r>
+      <w:proofErr w:type="spellEnd"/>
+      <w:r>
+        <w:t xml:space="preserve"> = '</w:t>
+      </w:r>
+      <w:proofErr w:type="spellStart"/>
+      <w:proofErr w:type="gramStart"/>
+      <w:r>
+        <w:t>res.partner</w:t>
+      </w:r>
+      <w:proofErr w:type="spellEnd"/>
+      <w:proofErr w:type="gramEnd"/>
+      <w:r>
+        <w:t xml:space="preserve">', je me suis basé sur le modèle natif de Contact d'Odoo pour y ajouter deux champs spécifiques. J'ai notamment ajouté une case à cocher booléenne, </w:t>
+      </w:r>
+      <w:proofErr w:type="spellStart"/>
+      <w:r>
+        <w:t>is_charcudoc</w:t>
+      </w:r>
+      <w:proofErr w:type="spellEnd"/>
+      <w:r>
+        <w:t>, et un champ pour la spécialité. Cette approche permet de transformer un contact standard en "</w:t>
+      </w:r>
+      <w:proofErr w:type="spellStart"/>
+      <w:r>
+        <w:t>Charcudoc</w:t>
+      </w:r>
+      <w:proofErr w:type="spellEnd"/>
+      <w:r>
+        <w:t>" sans dupliquer toutes les informations de base du contact.</w:t>
+      </w:r>
+    </w:p>
+    <w:p>
+      <w:r>
+        <w:br w:type="page"/>
+      </w:r>
+    </w:p>
+    <w:p>
+      <w:pPr>
+        <w:pStyle w:val="Titre1"/>
+      </w:pPr>
+      <w:bookmarkStart w:id="22" w:name="_Toc215649247"/>
+      <w:bookmarkStart w:id="23" w:name="_Toc215649293"/>
+      <w:r>
+        <w:lastRenderedPageBreak/>
+        <w:t>Vues</w:t>
+      </w:r>
+      <w:bookmarkEnd w:id="22"/>
+      <w:bookmarkEnd w:id="23"/>
+    </w:p>
+    <w:p>
+      <w:pPr>
+        <w:pStyle w:val="Titre2"/>
+      </w:pPr>
+      <w:bookmarkStart w:id="24" w:name="_Toc215649248"/>
+      <w:bookmarkStart w:id="25" w:name="_Toc215649294"/>
+      <w:r>
+        <w:t>Il existe une vue liste personnalisée.</w:t>
+      </w:r>
+      <w:bookmarkEnd w:id="24"/>
+      <w:bookmarkEnd w:id="25"/>
+    </w:p>
+    <w:p>
+      <w:pPr>
+        <w:ind w:firstLine="708"/>
+      </w:pPr>
+      <w:r>
+        <w:t xml:space="preserve">J'ai défini une vue liste personnalisée dans le fichier </w:t>
+      </w:r>
+      <w:proofErr w:type="spellStart"/>
       <w:r>
         <w:rPr>
           <w:b/>
           <w:bCs/>
         </w:rPr>
-        <w:t>/cyberware.client.xml</w:t>
-      </w:r>
-      <w:r>
-        <w:t>. Ces enregistrements sont définis avec leurs propres valeurs (nom, pseudo, date de naissance calculée) sans être dépendants d'autres objets du module lors de leur création initiale.</w:t>
-      </w:r>
-    </w:p>
-    <w:p>
-      <w:pPr>
-        <w:pStyle w:val="Titre2"/>
-      </w:pPr>
-      <w:bookmarkStart w:id="20" w:name="_Toc215649246"/>
-      <w:bookmarkStart w:id="21" w:name="_Toc215649292"/>
-      <w:r>
-        <w:t xml:space="preserve">Un </w:t>
-      </w:r>
-      <w:r>
-        <w:t>des modèles</w:t>
-      </w:r>
-      <w:r>
-        <w:t xml:space="preserve"> étend un modèle </w:t>
-      </w:r>
-      <w:r>
-        <w:t>d’Odoo</w:t>
-      </w:r>
-      <w:r>
-        <w:t>.</w:t>
-      </w:r>
-      <w:bookmarkEnd w:id="20"/>
-      <w:bookmarkEnd w:id="21"/>
-    </w:p>
-    <w:p>
-      <w:pPr>
-        <w:ind w:firstLine="708"/>
-      </w:pPr>
-      <w:r>
-        <w:t>J</w:t>
-      </w:r>
-      <w:r>
-        <w:t>'ai choisi d'intégrer certaines fonctionnalités du module directement sur les fiches de contact existantes dans Odoo plutôt que de recréer une entité de personne</w:t>
-      </w:r>
-      <w:r>
-        <w:t xml:space="preserve"> (c’est pour cela qu’il fallait activer le module Contacts au début)</w:t>
-      </w:r>
-      <w:r>
-        <w:t xml:space="preserve">. Pour cela, j'ai utilisé l'héritage dans le fichier </w:t>
-      </w:r>
+        <w:t>views</w:t>
+      </w:r>
+      <w:proofErr w:type="spellEnd"/>
       <w:r>
         <w:rPr>
           <w:b/>
           <w:bCs/>
         </w:rPr>
-        <w:t>models/res_partner.py</w:t>
-      </w:r>
-      <w:r>
-        <w:t>.</w:t>
-      </w:r>
-    </w:p>
-    <w:p/>
-    <w:p>
-      <w:pPr>
-        <w:ind w:firstLine="708"/>
-      </w:pPr>
-      <w:r>
-        <w:lastRenderedPageBreak/>
-        <w:t>Grâce à l'attribut _</w:t>
-      </w:r>
-      <w:proofErr w:type="spellStart"/>
-      <w:r>
-        <w:t>inherit</w:t>
-      </w:r>
-      <w:proofErr w:type="spellEnd"/>
-      <w:r>
-        <w:t xml:space="preserve"> = '</w:t>
-      </w:r>
-      <w:proofErr w:type="spellStart"/>
-      <w:r>
-        <w:t>res.partner</w:t>
-      </w:r>
-      <w:proofErr w:type="spellEnd"/>
-      <w:r>
-        <w:t xml:space="preserve">', je me suis basé sur le modèle natif de Contact d'Odoo pour y ajouter deux champs spécifiques. J'ai notamment ajouté une case à cocher booléenne, </w:t>
-      </w:r>
-      <w:proofErr w:type="spellStart"/>
-      <w:r>
-        <w:t>is_charcudoc</w:t>
-      </w:r>
-      <w:proofErr w:type="spellEnd"/>
-      <w:r>
-        <w:t>, et un champ pour la spécialité. Cette approche permet de transformer un contact standard en "</w:t>
-      </w:r>
-      <w:proofErr w:type="spellStart"/>
-      <w:r>
-        <w:t>Charcudoc</w:t>
-      </w:r>
-      <w:proofErr w:type="spellEnd"/>
-      <w:r>
-        <w:t>" sans dupliquer toutes les informations de base du contact.</w:t>
-      </w:r>
-    </w:p>
-    <w:p>
-      <w:r>
-        <w:br w:type="page"/>
-      </w:r>
-    </w:p>
-    <w:p>
-      <w:pPr>
-        <w:pStyle w:val="Titre1"/>
-      </w:pPr>
-      <w:bookmarkStart w:id="22" w:name="_Toc215649247"/>
-      <w:bookmarkStart w:id="23" w:name="_Toc215649293"/>
-      <w:r>
-        <w:lastRenderedPageBreak/>
-        <w:t>Vues</w:t>
-      </w:r>
-      <w:bookmarkEnd w:id="22"/>
-      <w:bookmarkEnd w:id="23"/>
-    </w:p>
-    <w:p>
-      <w:pPr>
-        <w:pStyle w:val="Titre2"/>
-      </w:pPr>
-      <w:bookmarkStart w:id="24" w:name="_Toc215649248"/>
-      <w:bookmarkStart w:id="25" w:name="_Toc215649294"/>
-      <w:r>
-        <w:t>Il existe une vue liste personnalisée.</w:t>
-      </w:r>
-      <w:bookmarkEnd w:id="24"/>
-      <w:bookmarkEnd w:id="25"/>
-    </w:p>
-    <w:p>
-      <w:pPr>
-        <w:ind w:firstLine="708"/>
-      </w:pPr>
-      <w:r>
-        <w:t xml:space="preserve">J'ai défini une vue liste personnalisée dans le fichier </w:t>
-      </w:r>
-      <w:proofErr w:type="spellStart"/>
-      <w:r>
-        <w:rPr>
-          <w:b/>
-          <w:bCs/>
-        </w:rPr>
-        <w:t>views</w:t>
-      </w:r>
-      <w:proofErr w:type="spellEnd"/>
-      <w:r>
-        <w:rPr>
-          <w:b/>
-          <w:bCs/>
-        </w:rPr>
         <w:t>/cyberware_implant_views.xml</w:t>
       </w:r>
       <w:r>
@@ -3191,13 +3422,7 @@
       </w:r>
       <w:proofErr w:type="spellEnd"/>
       <w:r>
-        <w:t>, est celle qui s'affiche par défaut lorsque l'utilisateur accède au menu des implants.</w:t>
-      </w:r>
-      <w:r>
-        <w:t xml:space="preserve"> </w:t>
-      </w:r>
-      <w:r>
-        <w:t xml:space="preserve">Pour y accéder sur le site, il suffit de naviguer via l'URL </w:t>
+        <w:t xml:space="preserve">, est celle qui s'affiche par défaut lorsque l'utilisateur accède au menu des implants. Pour y accéder sur le site, il suffit de naviguer via l'URL </w:t>
       </w:r>
       <w:hyperlink r:id="rId12" w:history="1">
         <w:r>
@@ -3355,10 +3580,7 @@
       </w:r>
       <w:proofErr w:type="spellEnd"/>
       <w:r>
-        <w:t xml:space="preserve"> puis Implants</w:t>
-      </w:r>
-      <w:r>
-        <w:t xml:space="preserve"> (</w:t>
+        <w:t xml:space="preserve"> puis Implants (</w:t>
       </w:r>
       <w:hyperlink r:id="rId14" w:history="1">
         <w:r>
@@ -3369,10 +3591,7 @@
         </w:r>
       </w:hyperlink>
       <w:r>
-        <w:t>)</w:t>
-      </w:r>
-      <w:r>
-        <w:t>.</w:t>
+        <w:t>).</w:t>
       </w:r>
     </w:p>
     <w:p>
@@ -3407,8 +3626,6 @@
     <w:p>
       <w:r>
         <w:tab/>
-      </w:r>
-      <w:r>
         <w:t xml:space="preserve">J'ai choisi d'intégrer des </w:t>
       </w:r>
       <w:r>
@@ -3629,10 +3846,7 @@
         </w:numPr>
       </w:pPr>
       <w:r>
-        <w:t>J</w:t>
-      </w:r>
-      <w:r>
-        <w:t xml:space="preserve">'ai configuré une action de type URL, qui est liée à un bouton dans le menu principal d'Odoo, à côté de l'application </w:t>
+        <w:t xml:space="preserve">J'ai configuré une action de type URL, qui est liée à un bouton dans le menu principal d'Odoo, à côté de l'application </w:t>
       </w:r>
       <w:proofErr w:type="spellStart"/>
       <w:r>
@@ -3646,6 +3860,9 @@
         <w:br/>
       </w:r>
       <w:r>
+        <w:rPr>
+          <w:noProof/>
+        </w:rPr>
         <w:drawing>
           <wp:inline distT="0" distB="0" distL="0" distR="0" wp14:anchorId="50A269D6" wp14:editId="0DA7CAAD">
             <wp:extent cx="4858428" cy="619211"/>
@@ -3720,199 +3937,575 @@
       <w:bookmarkStart w:id="34" w:name="_Toc215649253"/>
       <w:bookmarkStart w:id="35" w:name="_Toc215649299"/>
       <w:r>
-        <w:t xml:space="preserve">Dans une des vues on trouve au moins un champ relationnel, </w:t>
-      </w:r>
-      <w:r>
-        <w:t>un champ calculé</w:t>
-      </w:r>
-      <w:r>
-        <w:t>, un champ related.</w:t>
+        <w:t>D</w:t>
       </w:r>
       <w:bookmarkEnd w:id="34"/>
       <w:bookmarkEnd w:id="35"/>
+      <w:r>
+        <w:t>ans une des vues on trouve au moins un exemplaire de tous les champs exigés dans les consignes sur les modèles.</w:t>
+      </w:r>
     </w:p>
     <w:p>
       <w:pPr>
         <w:ind w:firstLine="708"/>
       </w:pPr>
       <w:r>
-        <w:t xml:space="preserve">J'ai intégré un </w:t>
+        <w:t xml:space="preserve">J'ai configuré la </w:t>
       </w:r>
       <w:r>
         <w:rPr>
           <w:b/>
           <w:bCs/>
         </w:rPr>
-        <w:t>champ relationnel</w:t>
-      </w:r>
-      <w:r>
-        <w:t xml:space="preserve"> directement dans la vue formulaire de l'implant. Il s'agit du champ </w:t>
-      </w:r>
-      <w:proofErr w:type="spellStart"/>
-      <w:r>
-        <w:t>manufacturer_id</w:t>
-      </w:r>
-      <w:proofErr w:type="spellEnd"/>
-      <w:r>
-        <w:t xml:space="preserve">, qui est défini dans le fichier </w:t>
+        <w:t>vue formulaire du client</w:t>
+      </w:r>
+      <w:r>
+        <w:t xml:space="preserve"> (</w:t>
+      </w:r>
+      <w:proofErr w:type="spellStart"/>
+      <w:r>
+        <w:t>view_cyberware_client_form</w:t>
+      </w:r>
+      <w:proofErr w:type="spellEnd"/>
+      <w:r>
+        <w:t xml:space="preserve">) dans le fichier </w:t>
+      </w:r>
+      <w:proofErr w:type="spellStart"/>
+      <w:r>
+        <w:rPr>
+          <w:i/>
+          <w:iCs/>
+        </w:rPr>
+        <w:t>views</w:t>
+      </w:r>
+      <w:proofErr w:type="spellEnd"/>
+      <w:r>
+        <w:rPr>
+          <w:i/>
+          <w:iCs/>
+        </w:rPr>
+        <w:t>/cyberware_client_views.xml</w:t>
+      </w:r>
+      <w:r>
+        <w:t xml:space="preserve"> pour qu'elle regroupe l'intégralité des types de champs exigés, offrant ainsi une démonstration technique complète sur un seul écran.</w:t>
+      </w:r>
+    </w:p>
+    <w:p>
+      <w:r>
+        <w:t xml:space="preserve">En consultant la fiche d'un client (accessible via </w:t>
+      </w:r>
+      <w:hyperlink r:id="rId19" w:history="1">
+        <w:r>
+          <w:rPr>
+            <w:rStyle w:val="Lienhypertexte"/>
+          </w:rPr>
+          <w:t>http://localhost:8069/odoo/action-90/3</w:t>
+        </w:r>
+      </w:hyperlink>
+      <w:r>
+        <w:t>), on peut identifier :</w:t>
+      </w:r>
+    </w:p>
+    <w:p>
+      <w:pPr>
+        <w:pStyle w:val="Paragraphedeliste"/>
+        <w:numPr>
+          <w:ilvl w:val="0"/>
+          <w:numId w:val="10"/>
+        </w:numPr>
+      </w:pPr>
+      <w:r>
+        <w:t>Un champ Image (</w:t>
+      </w:r>
+      <w:proofErr w:type="spellStart"/>
+      <w:r>
+        <w:t>image_client</w:t>
+      </w:r>
+      <w:proofErr w:type="spellEnd"/>
+      <w:r>
+        <w:t>) pour l'avatar.</w:t>
+      </w:r>
+    </w:p>
+    <w:p>
+      <w:pPr>
+        <w:pStyle w:val="Paragraphedeliste"/>
+        <w:numPr>
+          <w:ilvl w:val="0"/>
+          <w:numId w:val="10"/>
+        </w:numPr>
+      </w:pPr>
+      <w:r>
+        <w:lastRenderedPageBreak/>
+        <w:t>Un champ Date (</w:t>
+      </w:r>
+      <w:proofErr w:type="spellStart"/>
+      <w:r>
+        <w:t>date_naissance</w:t>
+      </w:r>
+      <w:proofErr w:type="spellEnd"/>
+      <w:r>
+        <w:t>).</w:t>
+      </w:r>
+    </w:p>
+    <w:p>
+      <w:pPr>
+        <w:pStyle w:val="Paragraphedeliste"/>
+        <w:numPr>
+          <w:ilvl w:val="0"/>
+          <w:numId w:val="10"/>
+        </w:numPr>
+      </w:pPr>
+      <w:r>
+        <w:t>Un champ Calculé (</w:t>
+      </w:r>
+      <w:proofErr w:type="spellStart"/>
+      <w:r>
+        <w:t>age</w:t>
+      </w:r>
+      <w:proofErr w:type="spellEnd"/>
+      <w:r>
+        <w:t>), dérivé de la date.</w:t>
+      </w:r>
+    </w:p>
+    <w:p>
+      <w:pPr>
+        <w:pStyle w:val="Paragraphedeliste"/>
+        <w:numPr>
+          <w:ilvl w:val="0"/>
+          <w:numId w:val="10"/>
+        </w:numPr>
+      </w:pPr>
+      <w:r>
+        <w:t>Un champ Select (</w:t>
+      </w:r>
+      <w:proofErr w:type="spellStart"/>
+      <w:r>
+        <w:t>groupe_sanguin</w:t>
+      </w:r>
+      <w:proofErr w:type="spellEnd"/>
+      <w:r>
+        <w:t>) avec liste déroulante.</w:t>
+      </w:r>
+    </w:p>
+    <w:p>
+      <w:pPr>
+        <w:pStyle w:val="Paragraphedeliste"/>
+        <w:numPr>
+          <w:ilvl w:val="0"/>
+          <w:numId w:val="10"/>
+        </w:numPr>
+      </w:pPr>
+      <w:r>
+        <w:t>Un champ Related (</w:t>
+      </w:r>
+      <w:proofErr w:type="spellStart"/>
+      <w:r>
+        <w:t>email_user</w:t>
+      </w:r>
+      <w:proofErr w:type="spellEnd"/>
+      <w:r>
+        <w:t>) affichant le login de l'utilisateur lié.</w:t>
+      </w:r>
+    </w:p>
+    <w:p>
+      <w:pPr>
+        <w:pStyle w:val="Paragraphedeliste"/>
+        <w:numPr>
+          <w:ilvl w:val="0"/>
+          <w:numId w:val="10"/>
+        </w:numPr>
+      </w:pPr>
+      <w:r>
+        <w:t>Un champ Numérique (</w:t>
+      </w:r>
+      <w:proofErr w:type="spellStart"/>
+      <w:r>
+        <w:t>niveau_essence_max</w:t>
+      </w:r>
+      <w:proofErr w:type="spellEnd"/>
+      <w:r>
+        <w:t>).</w:t>
+      </w:r>
+    </w:p>
+    <w:p>
+      <w:pPr>
+        <w:pStyle w:val="Paragraphedeliste"/>
+        <w:numPr>
+          <w:ilvl w:val="0"/>
+          <w:numId w:val="10"/>
+        </w:numPr>
+      </w:pPr>
+      <w:r>
+        <w:t>Un champ Textuel (</w:t>
+      </w:r>
+      <w:proofErr w:type="spellStart"/>
+      <w:r>
+        <w:t>notes_medicales</w:t>
+      </w:r>
+      <w:proofErr w:type="spellEnd"/>
+      <w:r>
+        <w:t>) pour les commentaires longs.</w:t>
+      </w:r>
+    </w:p>
+    <w:p>
+      <w:pPr>
+        <w:pStyle w:val="Paragraphedeliste"/>
+        <w:numPr>
+          <w:ilvl w:val="0"/>
+          <w:numId w:val="10"/>
+        </w:numPr>
+      </w:pPr>
+      <w:r>
+        <w:t>Un champ Relationnel (</w:t>
+      </w:r>
+      <w:proofErr w:type="spellStart"/>
+      <w:r>
+        <w:t>implant_ids</w:t>
+      </w:r>
+      <w:proofErr w:type="spellEnd"/>
+      <w:r>
+        <w:t>) pour la liste des implants.</w:t>
+      </w:r>
+    </w:p>
+    <w:p>
+      <w:pPr>
+        <w:pStyle w:val="Titre2"/>
+      </w:pPr>
+      <w:r>
+        <w:t>Un bouton permet d'exécuter la méthode qui contrôle les données</w:t>
+      </w:r>
+    </w:p>
+    <w:p>
+      <w:r>
+        <w:t xml:space="preserve">J'ai implémenté un mécanisme de </w:t>
       </w:r>
       <w:r>
         <w:rPr>
           <w:b/>
           <w:bCs/>
         </w:rPr>
-        <w:t>models/cyberware_implant.py</w:t>
-      </w:r>
-      <w:r>
-        <w:t xml:space="preserve"> et qui permet de lier l'implant à son fabricant. L'affichage de ce champ dans le formulaire permet à l'utilisateur de sélectionner l'entreprise productrice de l'implant.</w:t>
-      </w:r>
-      <w:r>
-        <w:t xml:space="preserve"> Il est consultable sur n’importe quel page d’implant : </w:t>
-      </w:r>
-      <w:hyperlink r:id="rId19" w:history="1">
-        <w:r>
-          <w:rPr>
-            <w:rStyle w:val="Lienhypertexte"/>
-          </w:rPr>
-          <w:t>http://localhost:8069/odoo/action-89/13</w:t>
-        </w:r>
-      </w:hyperlink>
-      <w:r>
-        <w:t>.</w:t>
-      </w:r>
-    </w:p>
-    <w:p>
-      <w:r>
-        <w:lastRenderedPageBreak/>
-        <w:t xml:space="preserve">J'ai inclus un </w:t>
+        <w:t>contrôle manuel</w:t>
+      </w:r>
+      <w:r>
+        <w:t xml:space="preserve"> directement accessible depuis l'interface. J'ai ajouté un bouton </w:t>
       </w:r>
       <w:r>
         <w:rPr>
           <w:b/>
           <w:bCs/>
         </w:rPr>
-        <w:t>champ calculé</w:t>
-      </w:r>
-      <w:r>
-        <w:t xml:space="preserve"> sur le modèle client, visible dans la vue Kanban des </w:t>
-      </w:r>
-      <w:r>
-        <w:t>clients.</w:t>
-      </w:r>
-      <w:r>
-        <w:t xml:space="preserve"> Ce champ, nommé </w:t>
-      </w:r>
-      <w:proofErr w:type="spellStart"/>
-      <w:r>
-        <w:t>age</w:t>
-      </w:r>
-      <w:proofErr w:type="spellEnd"/>
-      <w:r>
-        <w:t xml:space="preserve">, est défini dans le fichier </w:t>
+        <w:t>Vérifier le dossier</w:t>
+      </w:r>
+      <w:r>
+        <w:t xml:space="preserve"> situé dans l'en-tête de la vue formulaire du client (fichier </w:t>
+      </w:r>
+      <w:proofErr w:type="spellStart"/>
+      <w:r>
+        <w:rPr>
+          <w:i/>
+          <w:iCs/>
+        </w:rPr>
+        <w:t>views</w:t>
+      </w:r>
+      <w:proofErr w:type="spellEnd"/>
+      <w:r>
+        <w:rPr>
+          <w:i/>
+          <w:iCs/>
+        </w:rPr>
+        <w:t>/cyberware_client_views.xml</w:t>
+      </w:r>
+      <w:r>
+        <w:t xml:space="preserve">, </w:t>
+      </w:r>
+      <w:r>
+        <w:t xml:space="preserve">lien </w:t>
+      </w:r>
+      <w:hyperlink r:id="rId20" w:history="1">
+        <w:r>
+          <w:rPr>
+            <w:rStyle w:val="Lienhypertexte"/>
+          </w:rPr>
+          <w:t>http://localhost:8069/odoo/action-486/3</w:t>
+        </w:r>
+      </w:hyperlink>
+      <w:r>
+        <w:t xml:space="preserve">). Ce bouton déclenche la méthode Python </w:t>
+      </w:r>
+      <w:proofErr w:type="spellStart"/>
+      <w:r>
+        <w:t>action_controler_donnees</w:t>
+      </w:r>
+      <w:proofErr w:type="spellEnd"/>
+      <w:r>
+        <w:t xml:space="preserve"> définie dans le modèle </w:t>
+      </w:r>
+      <w:proofErr w:type="spellStart"/>
+      <w:proofErr w:type="gramStart"/>
+      <w:r>
+        <w:t>cyberware.client</w:t>
+      </w:r>
+      <w:proofErr w:type="spellEnd"/>
+      <w:proofErr w:type="gramEnd"/>
+      <w:r>
+        <w:t xml:space="preserve">. </w:t>
+      </w:r>
+    </w:p>
+    <w:p>
+      <w:pPr>
+        <w:pStyle w:val="Titre2"/>
+      </w:pPr>
+      <w:r>
+        <w:t>L'héritage du modèle étendu est utilisé dans une vue (affichage d'un champ parent ou modification d'une des vues du modèle parent)</w:t>
+      </w:r>
+    </w:p>
+    <w:p>
+      <w:r>
+        <w:t xml:space="preserve">Pour intégrer les nouvelles fonctionnalités sans altérer le code natif d'Odoo, j'ai mis en œuvre le mécanisme d'héritage de vue dans le fichier </w:t>
+      </w:r>
+      <w:proofErr w:type="spellStart"/>
+      <w:r>
+        <w:rPr>
+          <w:i/>
+          <w:iCs/>
+        </w:rPr>
+        <w:t>views</w:t>
+      </w:r>
+      <w:proofErr w:type="spellEnd"/>
+      <w:r>
+        <w:rPr>
+          <w:i/>
+          <w:iCs/>
+        </w:rPr>
+        <w:t>/res_partner_views.xml</w:t>
+      </w:r>
+      <w:r>
+        <w:t xml:space="preserve">. </w:t>
+      </w:r>
+    </w:p>
+    <w:p>
+      <w:r>
+        <w:t xml:space="preserve">Techniquement, la vue </w:t>
+      </w:r>
+      <w:proofErr w:type="spellStart"/>
+      <w:r>
+        <w:t>view_partner_form_cyberware</w:t>
+      </w:r>
+      <w:proofErr w:type="spellEnd"/>
+      <w:r>
+        <w:t xml:space="preserve"> étend la vue formulaire standard des </w:t>
+      </w:r>
+      <w:r>
+        <w:t>contacts</w:t>
+      </w:r>
+      <w:r>
+        <w:t xml:space="preserve"> (</w:t>
+      </w:r>
+      <w:proofErr w:type="spellStart"/>
+      <w:proofErr w:type="gramStart"/>
+      <w:r>
+        <w:t>base.view</w:t>
+      </w:r>
+      <w:proofErr w:type="gramEnd"/>
+      <w:r>
+        <w:t>_partner_form</w:t>
+      </w:r>
+      <w:proofErr w:type="spellEnd"/>
+      <w:r>
+        <w:t xml:space="preserve">). </w:t>
+      </w:r>
+    </w:p>
+    <w:p>
+      <w:r>
+        <w:t>L'implémentation inclut une logique d'affichage conditionnelle pour préserver l'ergonomie :</w:t>
+      </w:r>
+    </w:p>
+    <w:p>
+      <w:pPr>
+        <w:pStyle w:val="Paragraphedeliste"/>
+        <w:numPr>
+          <w:ilvl w:val="0"/>
+          <w:numId w:val="13"/>
+        </w:numPr>
+      </w:pPr>
+      <w:r>
+        <w:t xml:space="preserve">Le champ booléen </w:t>
+      </w:r>
+      <w:proofErr w:type="spellStart"/>
+      <w:r>
+        <w:t>is_charcudoc</w:t>
+      </w:r>
+      <w:proofErr w:type="spellEnd"/>
+      <w:r>
+        <w:t xml:space="preserve"> permet d'identifier le rôle du contact.</w:t>
+      </w:r>
+    </w:p>
+    <w:p>
+      <w:pPr>
+        <w:pStyle w:val="Paragraphedeliste"/>
+        <w:numPr>
+          <w:ilvl w:val="0"/>
+          <w:numId w:val="13"/>
+        </w:numPr>
+      </w:pPr>
+      <w:r>
+        <w:t xml:space="preserve">Le champ de spécialisation </w:t>
+      </w:r>
+      <w:proofErr w:type="spellStart"/>
+      <w:r>
+        <w:t>charcudoc_speciality</w:t>
+      </w:r>
+      <w:proofErr w:type="spellEnd"/>
+      <w:r>
+        <w:t xml:space="preserve"> possède l'attribut invisible="not </w:t>
+      </w:r>
+      <w:proofErr w:type="spellStart"/>
+      <w:r>
+        <w:t>is_charcudoc</w:t>
+      </w:r>
+      <w:proofErr w:type="spellEnd"/>
+      <w:r>
+        <w:t>". Il reste donc masqué par défaut et n'apparaît à l'écran que lorsque l'utilisateur définit le contact comme étant un "</w:t>
+      </w:r>
+      <w:proofErr w:type="spellStart"/>
+      <w:r>
+        <w:t>Charcudoc</w:t>
+      </w:r>
+      <w:proofErr w:type="spellEnd"/>
+      <w:r>
+        <w:t>".</w:t>
+      </w:r>
+    </w:p>
+    <w:p>
+      <w:r>
+        <w:t xml:space="preserve">Cette extension est visible pour n’importe quel contact (ex : </w:t>
+      </w:r>
+      <w:hyperlink r:id="rId21" w:history="1">
+        <w:r>
+          <w:rPr>
+            <w:rStyle w:val="Lienhypertexte"/>
+          </w:rPr>
+          <w:t>http://localhost:8069/odoo/contacts/27</w:t>
+        </w:r>
+      </w:hyperlink>
+      <w:r>
+        <w:t>).</w:t>
+      </w:r>
+    </w:p>
+    <w:p>
+      <w:pPr>
+        <w:pStyle w:val="Titre2"/>
+      </w:pPr>
+      <w:bookmarkStart w:id="36" w:name="_Toc215649254"/>
+      <w:bookmarkStart w:id="37" w:name="_Toc215649300"/>
+      <w:r>
+        <w:t>Un ou plusieurs champs ne sont visibles que pour un groupe d'utilisateur ou en fonction de la valeur d'un autre champ.</w:t>
+      </w:r>
+      <w:bookmarkEnd w:id="36"/>
+      <w:bookmarkEnd w:id="37"/>
+    </w:p>
+    <w:p>
+      <w:r>
+        <w:t xml:space="preserve">J'ai implémenté la </w:t>
       </w:r>
       <w:r>
         <w:rPr>
           <w:b/>
           <w:bCs/>
         </w:rPr>
-        <w:t>models/cyberware_client.py</w:t>
-      </w:r>
-      <w:r>
-        <w:t xml:space="preserve"> et affiche l'âge du patient. Sa valeur n'est pas saisie manuellement, mais est déterminée automatiquement par une méthode @api.depends qui utilise la date de naissance du client.</w:t>
-      </w:r>
-      <w:r>
-        <w:t xml:space="preserve"> Il est consultable sur n’importe quelle page de client : </w:t>
-      </w:r>
-      <w:hyperlink r:id="rId20" w:history="1">
-        <w:r>
-          <w:rPr>
-            <w:rStyle w:val="Lienhypertexte"/>
-          </w:rPr>
-          <w:t>http://localhost:8069/odoo/action-90/3</w:t>
-        </w:r>
-      </w:hyperlink>
-      <w:r>
-        <w:t>.</w:t>
-      </w:r>
-    </w:p>
-    <w:p>
-      <w:r>
-        <w:t xml:space="preserve">Afin de simplifier la consultation des informations, j'ai implémenté un </w:t>
+        <w:t>visibilité</w:t>
+      </w:r>
+      <w:r>
+        <w:t xml:space="preserve"> </w:t>
       </w:r>
       <w:r>
         <w:rPr>
           <w:b/>
           <w:bCs/>
         </w:rPr>
-        <w:t>champ related</w:t>
-      </w:r>
-      <w:r>
-        <w:t xml:space="preserve"> nommé </w:t>
-      </w:r>
-      <w:proofErr w:type="spellStart"/>
-      <w:r>
-        <w:t>description_fabricant</w:t>
-      </w:r>
-      <w:proofErr w:type="spellEnd"/>
-      <w:r>
-        <w:t xml:space="preserve"> sur le modèle</w:t>
-      </w:r>
-      <w:r>
-        <w:t xml:space="preserve"> </w:t>
-      </w:r>
+        <w:t>conditionnelle</w:t>
+      </w:r>
+      <w:r>
+        <w:t xml:space="preserve"> sur la vue étendue du modèle Contact (</w:t>
+      </w:r>
+      <w:proofErr w:type="spellStart"/>
+      <w:proofErr w:type="gramStart"/>
+      <w:r>
+        <w:t>res.partner</w:t>
+      </w:r>
+      <w:proofErr w:type="spellEnd"/>
+      <w:proofErr w:type="gramEnd"/>
+      <w:r>
+        <w:t xml:space="preserve">) pour ne pas surcharger l'interface. Cette fonctionnalité est mise en œuvre dans le fichier </w:t>
+      </w:r>
+      <w:proofErr w:type="spellStart"/>
       <w:r>
         <w:rPr>
           <w:b/>
           <w:bCs/>
         </w:rPr>
-        <w:t xml:space="preserve">models/ </w:t>
-      </w:r>
+        <w:t>views</w:t>
+      </w:r>
+      <w:proofErr w:type="spellEnd"/>
       <w:r>
         <w:rPr>
           <w:b/>
           <w:bCs/>
         </w:rPr>
-        <w:t>cyberware_implant.py</w:t>
-      </w:r>
-      <w:r>
-        <w:t xml:space="preserve">. Ce champ est défini dans models/cyberware_implant.py et est visible dans la vue formulaire de </w:t>
-      </w:r>
-      <w:r>
-        <w:t>l’implant.</w:t>
-      </w:r>
-      <w:r>
-        <w:t xml:space="preserve"> Il ne stocke aucune donnée ; il récupère et affiche en temps réel la description du fabricant directement depuis le modèle lié.</w:t>
-      </w:r>
-      <w:r>
-        <w:t xml:space="preserve"> Il</w:t>
-      </w:r>
-      <w:r>
-        <w:t xml:space="preserve"> est consultable sur n’importe quel page d’implant : </w:t>
-      </w:r>
-      <w:hyperlink r:id="rId21" w:history="1">
-        <w:r>
-          <w:rPr>
-            <w:rStyle w:val="Lienhypertexte"/>
-          </w:rPr>
-          <w:t>http://localhost:8069/odoo/action-89/13</w:t>
-        </w:r>
-      </w:hyperlink>
+        <w:t>/res_partner_views.xml</w:t>
+      </w:r>
       <w:r>
         <w:t>.</w:t>
       </w:r>
     </w:p>
     <w:p>
-      <w:pPr>
-        <w:pStyle w:val="Titre2"/>
-      </w:pPr>
-      <w:bookmarkStart w:id="36" w:name="_Toc215649254"/>
-      <w:bookmarkStart w:id="37" w:name="_Toc215649300"/>
-      <w:r>
-        <w:t>Un ou plusieurs champs ne sont visibles que pour un groupe d'utilisateur ou en fonction de la valeur d'un autre champ.</w:t>
-      </w:r>
-      <w:bookmarkEnd w:id="36"/>
-      <w:bookmarkEnd w:id="37"/>
-    </w:p>
+      <w:r>
+        <w:t xml:space="preserve">Le champ </w:t>
+      </w:r>
+      <w:proofErr w:type="spellStart"/>
+      <w:r>
+        <w:t>charcudoc_speciality</w:t>
+      </w:r>
+      <w:proofErr w:type="spellEnd"/>
+      <w:r>
+        <w:t xml:space="preserve">, qui définit la spécialité du praticien, est masqué par défaut. J'ai utilisé l'attribut invisible avec la condition invisible="not </w:t>
+      </w:r>
+      <w:proofErr w:type="spellStart"/>
+      <w:r>
+        <w:t>is_charcudoc</w:t>
+      </w:r>
+      <w:proofErr w:type="spellEnd"/>
+      <w:proofErr w:type="gramStart"/>
+      <w:r>
+        <w:t>" .</w:t>
+      </w:r>
+      <w:proofErr w:type="gramEnd"/>
+      <w:r>
+        <w:t xml:space="preserve"> </w:t>
+      </w:r>
+      <w:r>
+        <w:lastRenderedPageBreak/>
+        <w:t xml:space="preserve">Ainsi, ce champ n'apparaît à l'utilisateur que si la case Est </w:t>
+      </w:r>
+      <w:proofErr w:type="gramStart"/>
+      <w:r>
+        <w:t>un</w:t>
+      </w:r>
+      <w:proofErr w:type="gramEnd"/>
+      <w:r>
+        <w:t xml:space="preserve"> </w:t>
+      </w:r>
+      <w:proofErr w:type="spellStart"/>
+      <w:r>
+        <w:t>Charcudoc</w:t>
+      </w:r>
+      <w:proofErr w:type="spellEnd"/>
+      <w:r>
+        <w:t xml:space="preserve"> est cochée. Cela garantit que les informations spécifiques aux médecins ne sont affichées que pour les contacts qui ont effectivement ce rôle, simplifiant l'interface pour les autres contacts.</w:t>
+      </w:r>
+    </w:p>
+    <w:p/>
+    <w:p/>
     <w:p>
       <w:r>
         <w:t>A faire : refaire les mises en page des affichages uniques</w:t>
@@ -4215,6 +4808,155 @@
 <file path=word/numbering.xml><?xml version="1.0" encoding="utf-8"?>
 <w:numbering xmlns:wpc="http://schemas.microsoft.com/office/word/2010/wordprocessingCanvas" xmlns:cx="http://schemas.microsoft.com/office/drawing/2014/chartex" xmlns:cx1="http://schemas.microsoft.com/office/drawing/2015/9/8/chartex" xmlns:cx2="http://schemas.microsoft.com/office/drawing/2015/10/21/chartex" xmlns:cx3="http://schemas.microsoft.com/office/drawing/2016/5/9/chartex" xmlns:cx4="http://schemas.microsoft.com/office/drawing/2016/5/10/chartex" xmlns:cx5="http://schemas.microsoft.com/office/drawing/2016/5/11/chartex" xmlns:cx6="http://schemas.microsoft.com/office/drawing/2016/5/12/chartex" xmlns:cx7="http://schemas.microsoft.com/office/drawing/2016/5/13/chartex" xmlns:cx8="http://schemas.microsoft.com/office/drawing/2016/5/14/chartex" xmlns:mc="http://schemas.openxmlformats.org/markup-compatibility/2006" xmlns:aink="http://schemas.microsoft.com/office/drawing/2016/ink" xmlns:am3d="http://schemas.microsoft.com/office/drawing/2017/model3d" xmlns:o="urn:schemas-microsoft-com:office:office" xmlns:oel="http://schemas.microsoft.com/office/2019/extlst" xmlns:r="http://schemas.openxmlformats.org/officeDocument/2006/relationships" xmlns:m="http://schemas.openxmlformats.org/officeDocument/2006/math" xmlns:v="urn:schemas-microsoft-com:vml" xmlns:wp14="http://schemas.microsoft.com/office/word/2010/wordprocessingDrawing" xmlns:wp="http://schemas.openxmlformats.org/drawingml/2006/wordprocessingDrawing" xmlns:w10="urn:schemas-microsoft-com:office:word" xmlns:w="http://schemas.openxmlformats.org/wordprocessingml/2006/main" xmlns:w14="http://schemas.microsoft.com/office/word/2010/wordml" xmlns:w15="http://schemas.microsoft.com/office/word/2012/wordml" xmlns:w16cex="http://schemas.microsoft.com/office/word/2018/wordml/cex" xmlns:w16cid="http://schemas.microsoft.com/office/word/2016/wordml/cid" xmlns:w16="http://schemas.microsoft.com/office/word/2018/wordml" xmlns:w16du="http://schemas.microsoft.com/office/word/2023/wordml/word16du" xmlns:w16sdtdh="http://schemas.microsoft.com/office/word/2020/wordml/sdtdatahash" xmlns:w16sdtfl="http://schemas.microsoft.com/office/word/2024/wordml/sdtformatlock" xmlns:w16se="http://schemas.microsoft.com/office/word/2015/wordml/symex" xmlns:wpg="http://schemas.microsoft.com/office/word/2010/wordprocessingGroup" xmlns:wpi="http://schemas.microsoft.com/office/word/2010/wordprocessingInk" xmlns:wne="http://schemas.microsoft.com/office/word/2006/wordml" xmlns:wps="http://schemas.microsoft.com/office/word/2010/wordprocessingShape" mc:Ignorable="w14 w15 w16se w16cid w16 w16cex w16sdtdh w16sdtfl w16du wp14">
   <w:abstractNum w:abstractNumId="0" w15:restartNumberingAfterBreak="0">
+    <w:nsid w:val="08D752C7"/>
+    <w:multiLevelType w:val="multilevel"/>
+    <w:tmpl w:val="B590D25A"/>
+    <w:lvl w:ilvl="0">
+      <w:start w:val="1"/>
+      <w:numFmt w:val="bullet"/>
+      <w:lvlText w:val=""/>
+      <w:lvlJc w:val="left"/>
+      <w:pPr>
+        <w:tabs>
+          <w:tab w:val="num" w:pos="720"/>
+        </w:tabs>
+        <w:ind w:left="720" w:hanging="360"/>
+      </w:pPr>
+      <w:rPr>
+        <w:rFonts w:ascii="Symbol" w:hAnsi="Symbol" w:hint="default"/>
+        <w:sz w:val="20"/>
+      </w:rPr>
+    </w:lvl>
+    <w:lvl w:ilvl="1" w:tentative="1">
+      <w:start w:val="1"/>
+      <w:numFmt w:val="bullet"/>
+      <w:lvlText w:val=""/>
+      <w:lvlJc w:val="left"/>
+      <w:pPr>
+        <w:tabs>
+          <w:tab w:val="num" w:pos="1440"/>
+        </w:tabs>
+        <w:ind w:left="1440" w:hanging="360"/>
+      </w:pPr>
+      <w:rPr>
+        <w:rFonts w:ascii="Symbol" w:hAnsi="Symbol" w:hint="default"/>
+        <w:sz w:val="20"/>
+      </w:rPr>
+    </w:lvl>
+    <w:lvl w:ilvl="2" w:tentative="1">
+      <w:start w:val="1"/>
+      <w:numFmt w:val="bullet"/>
+      <w:lvlText w:val=""/>
+      <w:lvlJc w:val="left"/>
+      <w:pPr>
+        <w:tabs>
+          <w:tab w:val="num" w:pos="2160"/>
+        </w:tabs>
+        <w:ind w:left="2160" w:hanging="360"/>
+      </w:pPr>
+      <w:rPr>
+        <w:rFonts w:ascii="Symbol" w:hAnsi="Symbol" w:hint="default"/>
+        <w:sz w:val="20"/>
+      </w:rPr>
+    </w:lvl>
+    <w:lvl w:ilvl="3" w:tentative="1">
+      <w:start w:val="1"/>
+      <w:numFmt w:val="bullet"/>
+      <w:lvlText w:val=""/>
+      <w:lvlJc w:val="left"/>
+      <w:pPr>
+        <w:tabs>
+          <w:tab w:val="num" w:pos="2880"/>
+        </w:tabs>
+        <w:ind w:left="2880" w:hanging="360"/>
+      </w:pPr>
+      <w:rPr>
+        <w:rFonts w:ascii="Symbol" w:hAnsi="Symbol" w:hint="default"/>
+        <w:sz w:val="20"/>
+      </w:rPr>
+    </w:lvl>
+    <w:lvl w:ilvl="4" w:tentative="1">
+      <w:start w:val="1"/>
+      <w:numFmt w:val="bullet"/>
+      <w:lvlText w:val=""/>
+      <w:lvlJc w:val="left"/>
+      <w:pPr>
+        <w:tabs>
+          <w:tab w:val="num" w:pos="3600"/>
+        </w:tabs>
+        <w:ind w:left="3600" w:hanging="360"/>
+      </w:pPr>
+      <w:rPr>
+        <w:rFonts w:ascii="Symbol" w:hAnsi="Symbol" w:hint="default"/>
+        <w:sz w:val="20"/>
+      </w:rPr>
+    </w:lvl>
+    <w:lvl w:ilvl="5" w:tentative="1">
+      <w:start w:val="1"/>
+      <w:numFmt w:val="bullet"/>
+      <w:lvlText w:val=""/>
+      <w:lvlJc w:val="left"/>
+      <w:pPr>
+        <w:tabs>
+          <w:tab w:val="num" w:pos="4320"/>
+        </w:tabs>
+        <w:ind w:left="4320" w:hanging="360"/>
+      </w:pPr>
+      <w:rPr>
+        <w:rFonts w:ascii="Symbol" w:hAnsi="Symbol" w:hint="default"/>
+        <w:sz w:val="20"/>
+      </w:rPr>
+    </w:lvl>
+    <w:lvl w:ilvl="6" w:tentative="1">
+      <w:start w:val="1"/>
+      <w:numFmt w:val="bullet"/>
+      <w:lvlText w:val=""/>
+      <w:lvlJc w:val="left"/>
+      <w:pPr>
+        <w:tabs>
+          <w:tab w:val="num" w:pos="5040"/>
+        </w:tabs>
+        <w:ind w:left="5040" w:hanging="360"/>
+      </w:pPr>
+      <w:rPr>
+        <w:rFonts w:ascii="Symbol" w:hAnsi="Symbol" w:hint="default"/>
+        <w:sz w:val="20"/>
+      </w:rPr>
+    </w:lvl>
+    <w:lvl w:ilvl="7" w:tentative="1">
+      <w:start w:val="1"/>
+      <w:numFmt w:val="bullet"/>
+      <w:lvlText w:val=""/>
+      <w:lvlJc w:val="left"/>
+      <w:pPr>
+        <w:tabs>
+          <w:tab w:val="num" w:pos="5760"/>
+        </w:tabs>
+        <w:ind w:left="5760" w:hanging="360"/>
+      </w:pPr>
+      <w:rPr>
+        <w:rFonts w:ascii="Symbol" w:hAnsi="Symbol" w:hint="default"/>
+        <w:sz w:val="20"/>
+      </w:rPr>
+    </w:lvl>
+    <w:lvl w:ilvl="8" w:tentative="1">
+      <w:start w:val="1"/>
+      <w:numFmt w:val="bullet"/>
+      <w:lvlText w:val=""/>
+      <w:lvlJc w:val="left"/>
+      <w:pPr>
+        <w:tabs>
+          <w:tab w:val="num" w:pos="6480"/>
+        </w:tabs>
+        <w:ind w:left="6480" w:hanging="360"/>
+      </w:pPr>
+      <w:rPr>
+        <w:rFonts w:ascii="Symbol" w:hAnsi="Symbol" w:hint="default"/>
+        <w:sz w:val="20"/>
+      </w:rPr>
+    </w:lvl>
+  </w:abstractNum>
+  <w:abstractNum w:abstractNumId="1" w15:restartNumberingAfterBreak="0">
     <w:nsid w:val="0EA16355"/>
     <w:multiLevelType w:val="hybridMultilevel"/>
     <w:tmpl w:val="E286D0E8"/>
@@ -4327,7 +5069,156 @@
       </w:rPr>
     </w:lvl>
   </w:abstractNum>
-  <w:abstractNum w:abstractNumId="1" w15:restartNumberingAfterBreak="0">
+  <w:abstractNum w:abstractNumId="2" w15:restartNumberingAfterBreak="0">
+    <w:nsid w:val="110F0CC2"/>
+    <w:multiLevelType w:val="multilevel"/>
+    <w:tmpl w:val="1EBEB496"/>
+    <w:lvl w:ilvl="0">
+      <w:start w:val="1"/>
+      <w:numFmt w:val="bullet"/>
+      <w:lvlText w:val=""/>
+      <w:lvlJc w:val="left"/>
+      <w:pPr>
+        <w:tabs>
+          <w:tab w:val="num" w:pos="720"/>
+        </w:tabs>
+        <w:ind w:left="720" w:hanging="360"/>
+      </w:pPr>
+      <w:rPr>
+        <w:rFonts w:ascii="Symbol" w:hAnsi="Symbol" w:hint="default"/>
+        <w:sz w:val="20"/>
+      </w:rPr>
+    </w:lvl>
+    <w:lvl w:ilvl="1" w:tentative="1">
+      <w:start w:val="1"/>
+      <w:numFmt w:val="bullet"/>
+      <w:lvlText w:val=""/>
+      <w:lvlJc w:val="left"/>
+      <w:pPr>
+        <w:tabs>
+          <w:tab w:val="num" w:pos="1440"/>
+        </w:tabs>
+        <w:ind w:left="1440" w:hanging="360"/>
+      </w:pPr>
+      <w:rPr>
+        <w:rFonts w:ascii="Symbol" w:hAnsi="Symbol" w:hint="default"/>
+        <w:sz w:val="20"/>
+      </w:rPr>
+    </w:lvl>
+    <w:lvl w:ilvl="2" w:tentative="1">
+      <w:start w:val="1"/>
+      <w:numFmt w:val="bullet"/>
+      <w:lvlText w:val=""/>
+      <w:lvlJc w:val="left"/>
+      <w:pPr>
+        <w:tabs>
+          <w:tab w:val="num" w:pos="2160"/>
+        </w:tabs>
+        <w:ind w:left="2160" w:hanging="360"/>
+      </w:pPr>
+      <w:rPr>
+        <w:rFonts w:ascii="Symbol" w:hAnsi="Symbol" w:hint="default"/>
+        <w:sz w:val="20"/>
+      </w:rPr>
+    </w:lvl>
+    <w:lvl w:ilvl="3" w:tentative="1">
+      <w:start w:val="1"/>
+      <w:numFmt w:val="bullet"/>
+      <w:lvlText w:val=""/>
+      <w:lvlJc w:val="left"/>
+      <w:pPr>
+        <w:tabs>
+          <w:tab w:val="num" w:pos="2880"/>
+        </w:tabs>
+        <w:ind w:left="2880" w:hanging="360"/>
+      </w:pPr>
+      <w:rPr>
+        <w:rFonts w:ascii="Symbol" w:hAnsi="Symbol" w:hint="default"/>
+        <w:sz w:val="20"/>
+      </w:rPr>
+    </w:lvl>
+    <w:lvl w:ilvl="4" w:tentative="1">
+      <w:start w:val="1"/>
+      <w:numFmt w:val="bullet"/>
+      <w:lvlText w:val=""/>
+      <w:lvlJc w:val="left"/>
+      <w:pPr>
+        <w:tabs>
+          <w:tab w:val="num" w:pos="3600"/>
+        </w:tabs>
+        <w:ind w:left="3600" w:hanging="360"/>
+      </w:pPr>
+      <w:rPr>
+        <w:rFonts w:ascii="Symbol" w:hAnsi="Symbol" w:hint="default"/>
+        <w:sz w:val="20"/>
+      </w:rPr>
+    </w:lvl>
+    <w:lvl w:ilvl="5" w:tentative="1">
+      <w:start w:val="1"/>
+      <w:numFmt w:val="bullet"/>
+      <w:lvlText w:val=""/>
+      <w:lvlJc w:val="left"/>
+      <w:pPr>
+        <w:tabs>
+          <w:tab w:val="num" w:pos="4320"/>
+        </w:tabs>
+        <w:ind w:left="4320" w:hanging="360"/>
+      </w:pPr>
+      <w:rPr>
+        <w:rFonts w:ascii="Symbol" w:hAnsi="Symbol" w:hint="default"/>
+        <w:sz w:val="20"/>
+      </w:rPr>
+    </w:lvl>
+    <w:lvl w:ilvl="6" w:tentative="1">
+      <w:start w:val="1"/>
+      <w:numFmt w:val="bullet"/>
+      <w:lvlText w:val=""/>
+      <w:lvlJc w:val="left"/>
+      <w:pPr>
+        <w:tabs>
+          <w:tab w:val="num" w:pos="5040"/>
+        </w:tabs>
+        <w:ind w:left="5040" w:hanging="360"/>
+      </w:pPr>
+      <w:rPr>
+        <w:rFonts w:ascii="Symbol" w:hAnsi="Symbol" w:hint="default"/>
+        <w:sz w:val="20"/>
+      </w:rPr>
+    </w:lvl>
+    <w:lvl w:ilvl="7" w:tentative="1">
+      <w:start w:val="1"/>
+      <w:numFmt w:val="bullet"/>
+      <w:lvlText w:val=""/>
+      <w:lvlJc w:val="left"/>
+      <w:pPr>
+        <w:tabs>
+          <w:tab w:val="num" w:pos="5760"/>
+        </w:tabs>
+        <w:ind w:left="5760" w:hanging="360"/>
+      </w:pPr>
+      <w:rPr>
+        <w:rFonts w:ascii="Symbol" w:hAnsi="Symbol" w:hint="default"/>
+        <w:sz w:val="20"/>
+      </w:rPr>
+    </w:lvl>
+    <w:lvl w:ilvl="8" w:tentative="1">
+      <w:start w:val="1"/>
+      <w:numFmt w:val="bullet"/>
+      <w:lvlText w:val=""/>
+      <w:lvlJc w:val="left"/>
+      <w:pPr>
+        <w:tabs>
+          <w:tab w:val="num" w:pos="6480"/>
+        </w:tabs>
+        <w:ind w:left="6480" w:hanging="360"/>
+      </w:pPr>
+      <w:rPr>
+        <w:rFonts w:ascii="Symbol" w:hAnsi="Symbol" w:hint="default"/>
+        <w:sz w:val="20"/>
+      </w:rPr>
+    </w:lvl>
+  </w:abstractNum>
+  <w:abstractNum w:abstractNumId="3" w15:restartNumberingAfterBreak="0">
     <w:nsid w:val="1202007D"/>
     <w:multiLevelType w:val="multilevel"/>
     <w:tmpl w:val="262E0D3E"/>
@@ -4443,7 +5334,7 @@
       </w:pPr>
     </w:lvl>
   </w:abstractNum>
-  <w:abstractNum w:abstractNumId="2" w15:restartNumberingAfterBreak="0">
+  <w:abstractNum w:abstractNumId="4" w15:restartNumberingAfterBreak="0">
     <w:nsid w:val="12F86A36"/>
     <w:multiLevelType w:val="multilevel"/>
     <w:tmpl w:val="CC3E204A"/>
@@ -4592,7 +5483,156 @@
       </w:rPr>
     </w:lvl>
   </w:abstractNum>
-  <w:abstractNum w:abstractNumId="3" w15:restartNumberingAfterBreak="0">
+  <w:abstractNum w:abstractNumId="5" w15:restartNumberingAfterBreak="0">
+    <w:nsid w:val="15B32DB0"/>
+    <w:multiLevelType w:val="multilevel"/>
+    <w:tmpl w:val="C7024216"/>
+    <w:lvl w:ilvl="0">
+      <w:start w:val="1"/>
+      <w:numFmt w:val="bullet"/>
+      <w:lvlText w:val=""/>
+      <w:lvlJc w:val="left"/>
+      <w:pPr>
+        <w:tabs>
+          <w:tab w:val="num" w:pos="720"/>
+        </w:tabs>
+        <w:ind w:left="720" w:hanging="360"/>
+      </w:pPr>
+      <w:rPr>
+        <w:rFonts w:ascii="Symbol" w:hAnsi="Symbol" w:hint="default"/>
+        <w:sz w:val="20"/>
+      </w:rPr>
+    </w:lvl>
+    <w:lvl w:ilvl="1" w:tentative="1">
+      <w:start w:val="1"/>
+      <w:numFmt w:val="bullet"/>
+      <w:lvlText w:val="o"/>
+      <w:lvlJc w:val="left"/>
+      <w:pPr>
+        <w:tabs>
+          <w:tab w:val="num" w:pos="1440"/>
+        </w:tabs>
+        <w:ind w:left="1440" w:hanging="360"/>
+      </w:pPr>
+      <w:rPr>
+        <w:rFonts w:ascii="Courier New" w:hAnsi="Courier New" w:hint="default"/>
+        <w:sz w:val="20"/>
+      </w:rPr>
+    </w:lvl>
+    <w:lvl w:ilvl="2" w:tentative="1">
+      <w:start w:val="1"/>
+      <w:numFmt w:val="bullet"/>
+      <w:lvlText w:val=""/>
+      <w:lvlJc w:val="left"/>
+      <w:pPr>
+        <w:tabs>
+          <w:tab w:val="num" w:pos="2160"/>
+        </w:tabs>
+        <w:ind w:left="2160" w:hanging="360"/>
+      </w:pPr>
+      <w:rPr>
+        <w:rFonts w:ascii="Wingdings" w:hAnsi="Wingdings" w:hint="default"/>
+        <w:sz w:val="20"/>
+      </w:rPr>
+    </w:lvl>
+    <w:lvl w:ilvl="3" w:tentative="1">
+      <w:start w:val="1"/>
+      <w:numFmt w:val="bullet"/>
+      <w:lvlText w:val=""/>
+      <w:lvlJc w:val="left"/>
+      <w:pPr>
+        <w:tabs>
+          <w:tab w:val="num" w:pos="2880"/>
+        </w:tabs>
+        <w:ind w:left="2880" w:hanging="360"/>
+      </w:pPr>
+      <w:rPr>
+        <w:rFonts w:ascii="Wingdings" w:hAnsi="Wingdings" w:hint="default"/>
+        <w:sz w:val="20"/>
+      </w:rPr>
+    </w:lvl>
+    <w:lvl w:ilvl="4" w:tentative="1">
+      <w:start w:val="1"/>
+      <w:numFmt w:val="bullet"/>
+      <w:lvlText w:val=""/>
+      <w:lvlJc w:val="left"/>
+      <w:pPr>
+        <w:tabs>
+          <w:tab w:val="num" w:pos="3600"/>
+        </w:tabs>
+        <w:ind w:left="3600" w:hanging="360"/>
+      </w:pPr>
+      <w:rPr>
+        <w:rFonts w:ascii="Wingdings" w:hAnsi="Wingdings" w:hint="default"/>
+        <w:sz w:val="20"/>
+      </w:rPr>
+    </w:lvl>
+    <w:lvl w:ilvl="5" w:tentative="1">
+      <w:start w:val="1"/>
+      <w:numFmt w:val="bullet"/>
+      <w:lvlText w:val=""/>
+      <w:lvlJc w:val="left"/>
+      <w:pPr>
+        <w:tabs>
+          <w:tab w:val="num" w:pos="4320"/>
+        </w:tabs>
+        <w:ind w:left="4320" w:hanging="360"/>
+      </w:pPr>
+      <w:rPr>
+        <w:rFonts w:ascii="Wingdings" w:hAnsi="Wingdings" w:hint="default"/>
+        <w:sz w:val="20"/>
+      </w:rPr>
+    </w:lvl>
+    <w:lvl w:ilvl="6" w:tentative="1">
+      <w:start w:val="1"/>
+      <w:numFmt w:val="bullet"/>
+      <w:lvlText w:val=""/>
+      <w:lvlJc w:val="left"/>
+      <w:pPr>
+        <w:tabs>
+          <w:tab w:val="num" w:pos="5040"/>
+        </w:tabs>
+        <w:ind w:left="5040" w:hanging="360"/>
+      </w:pPr>
+      <w:rPr>
+        <w:rFonts w:ascii="Wingdings" w:hAnsi="Wingdings" w:hint="default"/>
+        <w:sz w:val="20"/>
+      </w:rPr>
+    </w:lvl>
+    <w:lvl w:ilvl="7" w:tentative="1">
+      <w:start w:val="1"/>
+      <w:numFmt w:val="bullet"/>
+      <w:lvlText w:val=""/>
+      <w:lvlJc w:val="left"/>
+      <w:pPr>
+        <w:tabs>
+          <w:tab w:val="num" w:pos="5760"/>
+        </w:tabs>
+        <w:ind w:left="5760" w:hanging="360"/>
+      </w:pPr>
+      <w:rPr>
+        <w:rFonts w:ascii="Wingdings" w:hAnsi="Wingdings" w:hint="default"/>
+        <w:sz w:val="20"/>
+      </w:rPr>
+    </w:lvl>
+    <w:lvl w:ilvl="8" w:tentative="1">
+      <w:start w:val="1"/>
+      <w:numFmt w:val="bullet"/>
+      <w:lvlText w:val=""/>
+      <w:lvlJc w:val="left"/>
+      <w:pPr>
+        <w:tabs>
+          <w:tab w:val="num" w:pos="6480"/>
+        </w:tabs>
+        <w:ind w:left="6480" w:hanging="360"/>
+      </w:pPr>
+      <w:rPr>
+        <w:rFonts w:ascii="Wingdings" w:hAnsi="Wingdings" w:hint="default"/>
+        <w:sz w:val="20"/>
+      </w:rPr>
+    </w:lvl>
+  </w:abstractNum>
+  <w:abstractNum w:abstractNumId="6" w15:restartNumberingAfterBreak="0">
     <w:nsid w:val="45B455A5"/>
     <w:multiLevelType w:val="multilevel"/>
     <w:tmpl w:val="BB240AAC"/>
@@ -4741,7 +5781,7 @@
       </w:rPr>
     </w:lvl>
   </w:abstractNum>
-  <w:abstractNum w:abstractNumId="4" w15:restartNumberingAfterBreak="0">
+  <w:abstractNum w:abstractNumId="7" w15:restartNumberingAfterBreak="0">
     <w:nsid w:val="48C0366B"/>
     <w:multiLevelType w:val="multilevel"/>
     <w:tmpl w:val="C848ED4C"/>
@@ -4890,7 +5930,120 @@
       </w:rPr>
     </w:lvl>
   </w:abstractNum>
-  <w:abstractNum w:abstractNumId="5" w15:restartNumberingAfterBreak="0">
+  <w:abstractNum w:abstractNumId="8" w15:restartNumberingAfterBreak="0">
+    <w:nsid w:val="4F874041"/>
+    <w:multiLevelType w:val="hybridMultilevel"/>
+    <w:tmpl w:val="71CC2C1A"/>
+    <w:lvl w:ilvl="0" w:tplc="040C0001">
+      <w:start w:val="1"/>
+      <w:numFmt w:val="bullet"/>
+      <w:lvlText w:val=""/>
+      <w:lvlJc w:val="left"/>
+      <w:pPr>
+        <w:ind w:left="720" w:hanging="360"/>
+      </w:pPr>
+      <w:rPr>
+        <w:rFonts w:ascii="Symbol" w:hAnsi="Symbol" w:hint="default"/>
+      </w:rPr>
+    </w:lvl>
+    <w:lvl w:ilvl="1" w:tplc="040C0003" w:tentative="1">
+      <w:start w:val="1"/>
+      <w:numFmt w:val="bullet"/>
+      <w:lvlText w:val="o"/>
+      <w:lvlJc w:val="left"/>
+      <w:pPr>
+        <w:ind w:left="1440" w:hanging="360"/>
+      </w:pPr>
+      <w:rPr>
+        <w:rFonts w:ascii="Courier New" w:hAnsi="Courier New" w:cs="Courier New" w:hint="default"/>
+      </w:rPr>
+    </w:lvl>
+    <w:lvl w:ilvl="2" w:tplc="040C0005" w:tentative="1">
+      <w:start w:val="1"/>
+      <w:numFmt w:val="bullet"/>
+      <w:lvlText w:val=""/>
+      <w:lvlJc w:val="left"/>
+      <w:pPr>
+        <w:ind w:left="2160" w:hanging="360"/>
+      </w:pPr>
+      <w:rPr>
+        <w:rFonts w:ascii="Wingdings" w:hAnsi="Wingdings" w:hint="default"/>
+      </w:rPr>
+    </w:lvl>
+    <w:lvl w:ilvl="3" w:tplc="040C0001" w:tentative="1">
+      <w:start w:val="1"/>
+      <w:numFmt w:val="bullet"/>
+      <w:lvlText w:val=""/>
+      <w:lvlJc w:val="left"/>
+      <w:pPr>
+        <w:ind w:left="2880" w:hanging="360"/>
+      </w:pPr>
+      <w:rPr>
+        <w:rFonts w:ascii="Symbol" w:hAnsi="Symbol" w:hint="default"/>
+      </w:rPr>
+    </w:lvl>
+    <w:lvl w:ilvl="4" w:tplc="040C0003" w:tentative="1">
+      <w:start w:val="1"/>
+      <w:numFmt w:val="bullet"/>
+      <w:lvlText w:val="o"/>
+      <w:lvlJc w:val="left"/>
+      <w:pPr>
+        <w:ind w:left="3600" w:hanging="360"/>
+      </w:pPr>
+      <w:rPr>
+        <w:rFonts w:ascii="Courier New" w:hAnsi="Courier New" w:cs="Courier New" w:hint="default"/>
+      </w:rPr>
+    </w:lvl>
+    <w:lvl w:ilvl="5" w:tplc="040C0005" w:tentative="1">
+      <w:start w:val="1"/>
+      <w:numFmt w:val="bullet"/>
+      <w:lvlText w:val=""/>
+      <w:lvlJc w:val="left"/>
+      <w:pPr>
+        <w:ind w:left="4320" w:hanging="360"/>
+      </w:pPr>
+      <w:rPr>
+        <w:rFonts w:ascii="Wingdings" w:hAnsi="Wingdings" w:hint="default"/>
+      </w:rPr>
+    </w:lvl>
+    <w:lvl w:ilvl="6" w:tplc="040C0001" w:tentative="1">
+      <w:start w:val="1"/>
+      <w:numFmt w:val="bullet"/>
+      <w:lvlText w:val=""/>
+      <w:lvlJc w:val="left"/>
+      <w:pPr>
+        <w:ind w:left="5040" w:hanging="360"/>
+      </w:pPr>
+      <w:rPr>
+        <w:rFonts w:ascii="Symbol" w:hAnsi="Symbol" w:hint="default"/>
+      </w:rPr>
+    </w:lvl>
+    <w:lvl w:ilvl="7" w:tplc="040C0003" w:tentative="1">
+      <w:start w:val="1"/>
+      <w:numFmt w:val="bullet"/>
+      <w:lvlText w:val="o"/>
+      <w:lvlJc w:val="left"/>
+      <w:pPr>
+        <w:ind w:left="5760" w:hanging="360"/>
+      </w:pPr>
+      <w:rPr>
+        <w:rFonts w:ascii="Courier New" w:hAnsi="Courier New" w:cs="Courier New" w:hint="default"/>
+      </w:rPr>
+    </w:lvl>
+    <w:lvl w:ilvl="8" w:tplc="040C0005" w:tentative="1">
+      <w:start w:val="1"/>
+      <w:numFmt w:val="bullet"/>
+      <w:lvlText w:val=""/>
+      <w:lvlJc w:val="left"/>
+      <w:pPr>
+        <w:ind w:left="6480" w:hanging="360"/>
+      </w:pPr>
+      <w:rPr>
+        <w:rFonts w:ascii="Wingdings" w:hAnsi="Wingdings" w:hint="default"/>
+      </w:rPr>
+    </w:lvl>
+  </w:abstractNum>
+  <w:abstractNum w:abstractNumId="9" w15:restartNumberingAfterBreak="0">
     <w:nsid w:val="5A512E60"/>
     <w:multiLevelType w:val="hybridMultilevel"/>
     <w:tmpl w:val="950A2B16"/>
@@ -5003,23 +6156,383 @@
       </w:rPr>
     </w:lvl>
   </w:abstractNum>
+  <w:abstractNum w:abstractNumId="10" w15:restartNumberingAfterBreak="0">
+    <w:nsid w:val="60B26486"/>
+    <w:multiLevelType w:val="hybridMultilevel"/>
+    <w:tmpl w:val="7EA29854"/>
+    <w:lvl w:ilvl="0" w:tplc="040C0001">
+      <w:start w:val="1"/>
+      <w:numFmt w:val="bullet"/>
+      <w:lvlText w:val=""/>
+      <w:lvlJc w:val="left"/>
+      <w:pPr>
+        <w:ind w:left="720" w:hanging="360"/>
+      </w:pPr>
+      <w:rPr>
+        <w:rFonts w:ascii="Symbol" w:hAnsi="Symbol" w:hint="default"/>
+      </w:rPr>
+    </w:lvl>
+    <w:lvl w:ilvl="1" w:tplc="040C0003" w:tentative="1">
+      <w:start w:val="1"/>
+      <w:numFmt w:val="bullet"/>
+      <w:lvlText w:val="o"/>
+      <w:lvlJc w:val="left"/>
+      <w:pPr>
+        <w:ind w:left="1440" w:hanging="360"/>
+      </w:pPr>
+      <w:rPr>
+        <w:rFonts w:ascii="Courier New" w:hAnsi="Courier New" w:cs="Courier New" w:hint="default"/>
+      </w:rPr>
+    </w:lvl>
+    <w:lvl w:ilvl="2" w:tplc="040C0005" w:tentative="1">
+      <w:start w:val="1"/>
+      <w:numFmt w:val="bullet"/>
+      <w:lvlText w:val=""/>
+      <w:lvlJc w:val="left"/>
+      <w:pPr>
+        <w:ind w:left="2160" w:hanging="360"/>
+      </w:pPr>
+      <w:rPr>
+        <w:rFonts w:ascii="Wingdings" w:hAnsi="Wingdings" w:hint="default"/>
+      </w:rPr>
+    </w:lvl>
+    <w:lvl w:ilvl="3" w:tplc="040C0001" w:tentative="1">
+      <w:start w:val="1"/>
+      <w:numFmt w:val="bullet"/>
+      <w:lvlText w:val=""/>
+      <w:lvlJc w:val="left"/>
+      <w:pPr>
+        <w:ind w:left="2880" w:hanging="360"/>
+      </w:pPr>
+      <w:rPr>
+        <w:rFonts w:ascii="Symbol" w:hAnsi="Symbol" w:hint="default"/>
+      </w:rPr>
+    </w:lvl>
+    <w:lvl w:ilvl="4" w:tplc="040C0003" w:tentative="1">
+      <w:start w:val="1"/>
+      <w:numFmt w:val="bullet"/>
+      <w:lvlText w:val="o"/>
+      <w:lvlJc w:val="left"/>
+      <w:pPr>
+        <w:ind w:left="3600" w:hanging="360"/>
+      </w:pPr>
+      <w:rPr>
+        <w:rFonts w:ascii="Courier New" w:hAnsi="Courier New" w:cs="Courier New" w:hint="default"/>
+      </w:rPr>
+    </w:lvl>
+    <w:lvl w:ilvl="5" w:tplc="040C0005" w:tentative="1">
+      <w:start w:val="1"/>
+      <w:numFmt w:val="bullet"/>
+      <w:lvlText w:val=""/>
+      <w:lvlJc w:val="left"/>
+      <w:pPr>
+        <w:ind w:left="4320" w:hanging="360"/>
+      </w:pPr>
+      <w:rPr>
+        <w:rFonts w:ascii="Wingdings" w:hAnsi="Wingdings" w:hint="default"/>
+      </w:rPr>
+    </w:lvl>
+    <w:lvl w:ilvl="6" w:tplc="040C0001" w:tentative="1">
+      <w:start w:val="1"/>
+      <w:numFmt w:val="bullet"/>
+      <w:lvlText w:val=""/>
+      <w:lvlJc w:val="left"/>
+      <w:pPr>
+        <w:ind w:left="5040" w:hanging="360"/>
+      </w:pPr>
+      <w:rPr>
+        <w:rFonts w:ascii="Symbol" w:hAnsi="Symbol" w:hint="default"/>
+      </w:rPr>
+    </w:lvl>
+    <w:lvl w:ilvl="7" w:tplc="040C0003" w:tentative="1">
+      <w:start w:val="1"/>
+      <w:numFmt w:val="bullet"/>
+      <w:lvlText w:val="o"/>
+      <w:lvlJc w:val="left"/>
+      <w:pPr>
+        <w:ind w:left="5760" w:hanging="360"/>
+      </w:pPr>
+      <w:rPr>
+        <w:rFonts w:ascii="Courier New" w:hAnsi="Courier New" w:cs="Courier New" w:hint="default"/>
+      </w:rPr>
+    </w:lvl>
+    <w:lvl w:ilvl="8" w:tplc="040C0005" w:tentative="1">
+      <w:start w:val="1"/>
+      <w:numFmt w:val="bullet"/>
+      <w:lvlText w:val=""/>
+      <w:lvlJc w:val="left"/>
+      <w:pPr>
+        <w:ind w:left="6480" w:hanging="360"/>
+      </w:pPr>
+      <w:rPr>
+        <w:rFonts w:ascii="Wingdings" w:hAnsi="Wingdings" w:hint="default"/>
+      </w:rPr>
+    </w:lvl>
+  </w:abstractNum>
+  <w:abstractNum w:abstractNumId="11" w15:restartNumberingAfterBreak="0">
+    <w:nsid w:val="69AD5CF7"/>
+    <w:multiLevelType w:val="hybridMultilevel"/>
+    <w:tmpl w:val="56E4ED3E"/>
+    <w:lvl w:ilvl="0" w:tplc="040C0001">
+      <w:start w:val="1"/>
+      <w:numFmt w:val="bullet"/>
+      <w:lvlText w:val=""/>
+      <w:lvlJc w:val="left"/>
+      <w:pPr>
+        <w:ind w:left="720" w:hanging="360"/>
+      </w:pPr>
+      <w:rPr>
+        <w:rFonts w:ascii="Symbol" w:hAnsi="Symbol" w:hint="default"/>
+      </w:rPr>
+    </w:lvl>
+    <w:lvl w:ilvl="1" w:tplc="040C0003" w:tentative="1">
+      <w:start w:val="1"/>
+      <w:numFmt w:val="bullet"/>
+      <w:lvlText w:val="o"/>
+      <w:lvlJc w:val="left"/>
+      <w:pPr>
+        <w:ind w:left="1440" w:hanging="360"/>
+      </w:pPr>
+      <w:rPr>
+        <w:rFonts w:ascii="Courier New" w:hAnsi="Courier New" w:cs="Courier New" w:hint="default"/>
+      </w:rPr>
+    </w:lvl>
+    <w:lvl w:ilvl="2" w:tplc="040C0005" w:tentative="1">
+      <w:start w:val="1"/>
+      <w:numFmt w:val="bullet"/>
+      <w:lvlText w:val=""/>
+      <w:lvlJc w:val="left"/>
+      <w:pPr>
+        <w:ind w:left="2160" w:hanging="360"/>
+      </w:pPr>
+      <w:rPr>
+        <w:rFonts w:ascii="Wingdings" w:hAnsi="Wingdings" w:hint="default"/>
+      </w:rPr>
+    </w:lvl>
+    <w:lvl w:ilvl="3" w:tplc="040C0001" w:tentative="1">
+      <w:start w:val="1"/>
+      <w:numFmt w:val="bullet"/>
+      <w:lvlText w:val=""/>
+      <w:lvlJc w:val="left"/>
+      <w:pPr>
+        <w:ind w:left="2880" w:hanging="360"/>
+      </w:pPr>
+      <w:rPr>
+        <w:rFonts w:ascii="Symbol" w:hAnsi="Symbol" w:hint="default"/>
+      </w:rPr>
+    </w:lvl>
+    <w:lvl w:ilvl="4" w:tplc="040C0003" w:tentative="1">
+      <w:start w:val="1"/>
+      <w:numFmt w:val="bullet"/>
+      <w:lvlText w:val="o"/>
+      <w:lvlJc w:val="left"/>
+      <w:pPr>
+        <w:ind w:left="3600" w:hanging="360"/>
+      </w:pPr>
+      <w:rPr>
+        <w:rFonts w:ascii="Courier New" w:hAnsi="Courier New" w:cs="Courier New" w:hint="default"/>
+      </w:rPr>
+    </w:lvl>
+    <w:lvl w:ilvl="5" w:tplc="040C0005" w:tentative="1">
+      <w:start w:val="1"/>
+      <w:numFmt w:val="bullet"/>
+      <w:lvlText w:val=""/>
+      <w:lvlJc w:val="left"/>
+      <w:pPr>
+        <w:ind w:left="4320" w:hanging="360"/>
+      </w:pPr>
+      <w:rPr>
+        <w:rFonts w:ascii="Wingdings" w:hAnsi="Wingdings" w:hint="default"/>
+      </w:rPr>
+    </w:lvl>
+    <w:lvl w:ilvl="6" w:tplc="040C0001" w:tentative="1">
+      <w:start w:val="1"/>
+      <w:numFmt w:val="bullet"/>
+      <w:lvlText w:val=""/>
+      <w:lvlJc w:val="left"/>
+      <w:pPr>
+        <w:ind w:left="5040" w:hanging="360"/>
+      </w:pPr>
+      <w:rPr>
+        <w:rFonts w:ascii="Symbol" w:hAnsi="Symbol" w:hint="default"/>
+      </w:rPr>
+    </w:lvl>
+    <w:lvl w:ilvl="7" w:tplc="040C0003" w:tentative="1">
+      <w:start w:val="1"/>
+      <w:numFmt w:val="bullet"/>
+      <w:lvlText w:val="o"/>
+      <w:lvlJc w:val="left"/>
+      <w:pPr>
+        <w:ind w:left="5760" w:hanging="360"/>
+      </w:pPr>
+      <w:rPr>
+        <w:rFonts w:ascii="Courier New" w:hAnsi="Courier New" w:cs="Courier New" w:hint="default"/>
+      </w:rPr>
+    </w:lvl>
+    <w:lvl w:ilvl="8" w:tplc="040C0005" w:tentative="1">
+      <w:start w:val="1"/>
+      <w:numFmt w:val="bullet"/>
+      <w:lvlText w:val=""/>
+      <w:lvlJc w:val="left"/>
+      <w:pPr>
+        <w:ind w:left="6480" w:hanging="360"/>
+      </w:pPr>
+      <w:rPr>
+        <w:rFonts w:ascii="Wingdings" w:hAnsi="Wingdings" w:hint="default"/>
+      </w:rPr>
+    </w:lvl>
+  </w:abstractNum>
+  <w:abstractNum w:abstractNumId="12" w15:restartNumberingAfterBreak="0">
+    <w:nsid w:val="73D050D7"/>
+    <w:multiLevelType w:val="hybridMultilevel"/>
+    <w:tmpl w:val="FDB81A6E"/>
+    <w:lvl w:ilvl="0" w:tplc="040C0001">
+      <w:start w:val="1"/>
+      <w:numFmt w:val="bullet"/>
+      <w:lvlText w:val=""/>
+      <w:lvlJc w:val="left"/>
+      <w:pPr>
+        <w:ind w:left="1080" w:hanging="360"/>
+      </w:pPr>
+      <w:rPr>
+        <w:rFonts w:ascii="Symbol" w:hAnsi="Symbol" w:hint="default"/>
+      </w:rPr>
+    </w:lvl>
+    <w:lvl w:ilvl="1" w:tplc="040C0003" w:tentative="1">
+      <w:start w:val="1"/>
+      <w:numFmt w:val="bullet"/>
+      <w:lvlText w:val="o"/>
+      <w:lvlJc w:val="left"/>
+      <w:pPr>
+        <w:ind w:left="1800" w:hanging="360"/>
+      </w:pPr>
+      <w:rPr>
+        <w:rFonts w:ascii="Courier New" w:hAnsi="Courier New" w:cs="Courier New" w:hint="default"/>
+      </w:rPr>
+    </w:lvl>
+    <w:lvl w:ilvl="2" w:tplc="040C0005" w:tentative="1">
+      <w:start w:val="1"/>
+      <w:numFmt w:val="bullet"/>
+      <w:lvlText w:val=""/>
+      <w:lvlJc w:val="left"/>
+      <w:pPr>
+        <w:ind w:left="2520" w:hanging="360"/>
+      </w:pPr>
+      <w:rPr>
+        <w:rFonts w:ascii="Wingdings" w:hAnsi="Wingdings" w:hint="default"/>
+      </w:rPr>
+    </w:lvl>
+    <w:lvl w:ilvl="3" w:tplc="040C0001" w:tentative="1">
+      <w:start w:val="1"/>
+      <w:numFmt w:val="bullet"/>
+      <w:lvlText w:val=""/>
+      <w:lvlJc w:val="left"/>
+      <w:pPr>
+        <w:ind w:left="3240" w:hanging="360"/>
+      </w:pPr>
+      <w:rPr>
+        <w:rFonts w:ascii="Symbol" w:hAnsi="Symbol" w:hint="default"/>
+      </w:rPr>
+    </w:lvl>
+    <w:lvl w:ilvl="4" w:tplc="040C0003" w:tentative="1">
+      <w:start w:val="1"/>
+      <w:numFmt w:val="bullet"/>
+      <w:lvlText w:val="o"/>
+      <w:lvlJc w:val="left"/>
+      <w:pPr>
+        <w:ind w:left="3960" w:hanging="360"/>
+      </w:pPr>
+      <w:rPr>
+        <w:rFonts w:ascii="Courier New" w:hAnsi="Courier New" w:cs="Courier New" w:hint="default"/>
+      </w:rPr>
+    </w:lvl>
+    <w:lvl w:ilvl="5" w:tplc="040C0005" w:tentative="1">
+      <w:start w:val="1"/>
+      <w:numFmt w:val="bullet"/>
+      <w:lvlText w:val=""/>
+      <w:lvlJc w:val="left"/>
+      <w:pPr>
+        <w:ind w:left="4680" w:hanging="360"/>
+      </w:pPr>
+      <w:rPr>
+        <w:rFonts w:ascii="Wingdings" w:hAnsi="Wingdings" w:hint="default"/>
+      </w:rPr>
+    </w:lvl>
+    <w:lvl w:ilvl="6" w:tplc="040C0001" w:tentative="1">
+      <w:start w:val="1"/>
+      <w:numFmt w:val="bullet"/>
+      <w:lvlText w:val=""/>
+      <w:lvlJc w:val="left"/>
+      <w:pPr>
+        <w:ind w:left="5400" w:hanging="360"/>
+      </w:pPr>
+      <w:rPr>
+        <w:rFonts w:ascii="Symbol" w:hAnsi="Symbol" w:hint="default"/>
+      </w:rPr>
+    </w:lvl>
+    <w:lvl w:ilvl="7" w:tplc="040C0003" w:tentative="1">
+      <w:start w:val="1"/>
+      <w:numFmt w:val="bullet"/>
+      <w:lvlText w:val="o"/>
+      <w:lvlJc w:val="left"/>
+      <w:pPr>
+        <w:ind w:left="6120" w:hanging="360"/>
+      </w:pPr>
+      <w:rPr>
+        <w:rFonts w:ascii="Courier New" w:hAnsi="Courier New" w:cs="Courier New" w:hint="default"/>
+      </w:rPr>
+    </w:lvl>
+    <w:lvl w:ilvl="8" w:tplc="040C0005" w:tentative="1">
+      <w:start w:val="1"/>
+      <w:numFmt w:val="bullet"/>
+      <w:lvlText w:val=""/>
+      <w:lvlJc w:val="left"/>
+      <w:pPr>
+        <w:ind w:left="6840" w:hanging="360"/>
+      </w:pPr>
+      <w:rPr>
+        <w:rFonts w:ascii="Wingdings" w:hAnsi="Wingdings" w:hint="default"/>
+      </w:rPr>
+    </w:lvl>
+  </w:abstractNum>
   <w:num w:numId="1" w16cid:durableId="435978176">
+    <w:abstractNumId w:val="4"/>
+  </w:num>
+  <w:num w:numId="2" w16cid:durableId="2120635228">
+    <w:abstractNumId w:val="7"/>
+  </w:num>
+  <w:num w:numId="3" w16cid:durableId="1772894860">
+    <w:abstractNumId w:val="6"/>
+  </w:num>
+  <w:num w:numId="4" w16cid:durableId="1832981537">
+    <w:abstractNumId w:val="9"/>
+  </w:num>
+  <w:num w:numId="5" w16cid:durableId="250161598">
+    <w:abstractNumId w:val="1"/>
+  </w:num>
+  <w:num w:numId="6" w16cid:durableId="948044162">
+    <w:abstractNumId w:val="3"/>
+  </w:num>
+  <w:num w:numId="7" w16cid:durableId="1342858463">
+    <w:abstractNumId w:val="5"/>
+  </w:num>
+  <w:num w:numId="8" w16cid:durableId="1440686581">
+    <w:abstractNumId w:val="12"/>
+  </w:num>
+  <w:num w:numId="9" w16cid:durableId="133986127">
+    <w:abstractNumId w:val="11"/>
+  </w:num>
+  <w:num w:numId="10" w16cid:durableId="1420103375">
+    <w:abstractNumId w:val="8"/>
+  </w:num>
+  <w:num w:numId="11" w16cid:durableId="882134750">
+    <w:abstractNumId w:val="0"/>
+  </w:num>
+  <w:num w:numId="12" w16cid:durableId="1260988819">
     <w:abstractNumId w:val="2"/>
   </w:num>
-  <w:num w:numId="2" w16cid:durableId="2120635228">
-    <w:abstractNumId w:val="4"/>
-  </w:num>
-  <w:num w:numId="3" w16cid:durableId="1772894860">
-    <w:abstractNumId w:val="3"/>
-  </w:num>
-  <w:num w:numId="4" w16cid:durableId="1832981537">
-    <w:abstractNumId w:val="5"/>
-  </w:num>
-  <w:num w:numId="5" w16cid:durableId="250161598">
-    <w:abstractNumId w:val="0"/>
-  </w:num>
-  <w:num w:numId="6" w16cid:durableId="948044162">
-    <w:abstractNumId w:val="1"/>
+  <w:num w:numId="13" w16cid:durableId="1143884366">
+    <w:abstractNumId w:val="10"/>
   </w:num>
 </w:numbering>
 </file>
@@ -6214,6 +7727,18 @@
       <w:rFonts w:ascii="Times New Roman" w:hAnsi="Times New Roman" w:cs="Times New Roman"/>
     </w:rPr>
   </w:style>
+  <w:style w:type="character" w:styleId="Lienhypertextesuivivisit">
+    <w:name w:val="FollowedHyperlink"/>
+    <w:basedOn w:val="Policepardfaut"/>
+    <w:uiPriority w:val="99"/>
+    <w:semiHidden/>
+    <w:unhideWhenUsed/>
+    <w:rsid w:val="009F674F"/>
+    <w:rPr>
+      <w:color w:val="96607D" w:themeColor="followedHyperlink"/>
+      <w:u w:val="single"/>
+    </w:rPr>
+  </w:style>
 </w:styles>
 </file>
 

</xml_diff>

<commit_message>
Eu ouais normalement c'est fini
</commit_message>
<xml_diff>
--- a/RAPPORT.docx
+++ b/RAPPORT.docx
@@ -330,7 +330,11 @@
           <w:rFonts w:eastAsiaTheme="minorEastAsia"/>
           <w:b w:val="0"/>
           <w:bCs w:val="0"/>
+          <w:i w:val="0"/>
+          <w:iCs w:val="0"/>
           <w:noProof/>
+          <w:sz w:val="24"/>
+          <w:szCs w:val="24"/>
           <w:lang w:eastAsia="fr-FR"/>
         </w:rPr>
       </w:pPr>
@@ -343,20 +347,16 @@
       <w:r>
         <w:fldChar w:fldCharType="separate"/>
       </w:r>
-      <w:hyperlink w:anchor="_Toc215649282" w:history="1">
+      <w:hyperlink w:anchor="_Toc218604851" w:history="1">
         <w:r>
           <w:rPr>
             <w:rStyle w:val="Lienhypertexte"/>
-            <w:b w:val="0"/>
-            <w:bCs w:val="0"/>
             <w:noProof/>
           </w:rPr>
           <w:t>Mise en place et Environnement</w:t>
         </w:r>
         <w:r>
           <w:rPr>
-            <w:b w:val="0"/>
-            <w:bCs w:val="0"/>
             <w:noProof/>
             <w:webHidden/>
           </w:rPr>
@@ -364,8 +364,6 @@
         </w:r>
         <w:r>
           <w:rPr>
-            <w:b w:val="0"/>
-            <w:bCs w:val="0"/>
             <w:noProof/>
             <w:webHidden/>
           </w:rPr>
@@ -373,25 +371,19 @@
         </w:r>
         <w:r>
           <w:rPr>
-            <w:b w:val="0"/>
-            <w:bCs w:val="0"/>
-            <w:noProof/>
-            <w:webHidden/>
-          </w:rPr>
-          <w:instrText xml:space="preserve"> PAGEREF _Toc215649282 \h </w:instrText>
-        </w:r>
-        <w:r>
-          <w:rPr>
-            <w:b w:val="0"/>
-            <w:bCs w:val="0"/>
-            <w:noProof/>
-            <w:webHidden/>
-          </w:rPr>
-        </w:r>
-        <w:r>
-          <w:rPr>
-            <w:b w:val="0"/>
-            <w:bCs w:val="0"/>
+            <w:noProof/>
+            <w:webHidden/>
+          </w:rPr>
+          <w:instrText xml:space="preserve"> PAGEREF _Toc218604851 \h </w:instrText>
+        </w:r>
+        <w:r>
+          <w:rPr>
+            <w:noProof/>
+            <w:webHidden/>
+          </w:rPr>
+        </w:r>
+        <w:r>
+          <w:rPr>
             <w:noProof/>
             <w:webHidden/>
           </w:rPr>
@@ -399,17 +391,13 @@
         </w:r>
         <w:r>
           <w:rPr>
-            <w:b w:val="0"/>
-            <w:bCs w:val="0"/>
-            <w:noProof/>
-            <w:webHidden/>
-          </w:rPr>
-          <w:t>3</w:t>
-        </w:r>
-        <w:r>
-          <w:rPr>
-            <w:b w:val="0"/>
-            <w:bCs w:val="0"/>
+            <w:noProof/>
+            <w:webHidden/>
+          </w:rPr>
+          <w:t>4</w:t>
+        </w:r>
+        <w:r>
+          <w:rPr>
             <w:noProof/>
             <w:webHidden/>
           </w:rPr>
@@ -424,24 +412,24 @@
           <w:rFonts w:eastAsiaTheme="minorEastAsia"/>
           <w:b w:val="0"/>
           <w:bCs w:val="0"/>
+          <w:i w:val="0"/>
+          <w:iCs w:val="0"/>
           <w:noProof/>
+          <w:sz w:val="24"/>
+          <w:szCs w:val="24"/>
           <w:lang w:eastAsia="fr-FR"/>
         </w:rPr>
       </w:pPr>
-      <w:hyperlink w:anchor="_Toc215649283" w:history="1">
+      <w:hyperlink w:anchor="_Toc218604852" w:history="1">
         <w:r>
           <w:rPr>
             <w:rStyle w:val="Lienhypertexte"/>
-            <w:b w:val="0"/>
-            <w:bCs w:val="0"/>
             <w:noProof/>
           </w:rPr>
           <w:t>Groupe de sécurité</w:t>
         </w:r>
         <w:r>
           <w:rPr>
-            <w:b w:val="0"/>
-            <w:bCs w:val="0"/>
             <w:noProof/>
             <w:webHidden/>
           </w:rPr>
@@ -449,8 +437,6 @@
         </w:r>
         <w:r>
           <w:rPr>
-            <w:b w:val="0"/>
-            <w:bCs w:val="0"/>
             <w:noProof/>
             <w:webHidden/>
           </w:rPr>
@@ -458,25 +444,19 @@
         </w:r>
         <w:r>
           <w:rPr>
-            <w:b w:val="0"/>
-            <w:bCs w:val="0"/>
-            <w:noProof/>
-            <w:webHidden/>
-          </w:rPr>
-          <w:instrText xml:space="preserve"> PAGEREF _Toc215649283 \h </w:instrText>
-        </w:r>
-        <w:r>
-          <w:rPr>
-            <w:b w:val="0"/>
-            <w:bCs w:val="0"/>
-            <w:noProof/>
-            <w:webHidden/>
-          </w:rPr>
-        </w:r>
-        <w:r>
-          <w:rPr>
-            <w:b w:val="0"/>
-            <w:bCs w:val="0"/>
+            <w:noProof/>
+            <w:webHidden/>
+          </w:rPr>
+          <w:instrText xml:space="preserve"> PAGEREF _Toc218604852 \h </w:instrText>
+        </w:r>
+        <w:r>
+          <w:rPr>
+            <w:noProof/>
+            <w:webHidden/>
+          </w:rPr>
+        </w:r>
+        <w:r>
+          <w:rPr>
             <w:noProof/>
             <w:webHidden/>
           </w:rPr>
@@ -484,17 +464,13 @@
         </w:r>
         <w:r>
           <w:rPr>
-            <w:b w:val="0"/>
-            <w:bCs w:val="0"/>
-            <w:noProof/>
-            <w:webHidden/>
-          </w:rPr>
-          <w:t>3</w:t>
-        </w:r>
-        <w:r>
-          <w:rPr>
-            <w:b w:val="0"/>
-            <w:bCs w:val="0"/>
+            <w:noProof/>
+            <w:webHidden/>
+          </w:rPr>
+          <w:t>5</w:t>
+        </w:r>
+        <w:r>
+          <w:rPr>
             <w:noProof/>
             <w:webHidden/>
           </w:rPr>
@@ -518,20 +494,16 @@
           <w:lang w:eastAsia="fr-FR"/>
         </w:rPr>
       </w:pPr>
-      <w:hyperlink w:anchor="_Toc215649284" w:history="1">
+      <w:hyperlink w:anchor="_Toc218604853" w:history="1">
         <w:r>
           <w:rPr>
             <w:rStyle w:val="Lienhypertexte"/>
-            <w:b w:val="0"/>
-            <w:bCs w:val="0"/>
             <w:noProof/>
           </w:rPr>
           <w:t>Il y a aux moins deux groupes de sécurité</w:t>
         </w:r>
         <w:r>
           <w:rPr>
-            <w:b w:val="0"/>
-            <w:bCs w:val="0"/>
             <w:noProof/>
             <w:webHidden/>
           </w:rPr>
@@ -539,8 +511,6 @@
         </w:r>
         <w:r>
           <w:rPr>
-            <w:b w:val="0"/>
-            <w:bCs w:val="0"/>
             <w:noProof/>
             <w:webHidden/>
           </w:rPr>
@@ -548,25 +518,19 @@
         </w:r>
         <w:r>
           <w:rPr>
-            <w:b w:val="0"/>
-            <w:bCs w:val="0"/>
-            <w:noProof/>
-            <w:webHidden/>
-          </w:rPr>
-          <w:instrText xml:space="preserve"> PAGEREF _Toc215649284 \h </w:instrText>
-        </w:r>
-        <w:r>
-          <w:rPr>
-            <w:b w:val="0"/>
-            <w:bCs w:val="0"/>
-            <w:noProof/>
-            <w:webHidden/>
-          </w:rPr>
-        </w:r>
-        <w:r>
-          <w:rPr>
-            <w:b w:val="0"/>
-            <w:bCs w:val="0"/>
+            <w:noProof/>
+            <w:webHidden/>
+          </w:rPr>
+          <w:instrText xml:space="preserve"> PAGEREF _Toc218604853 \h </w:instrText>
+        </w:r>
+        <w:r>
+          <w:rPr>
+            <w:noProof/>
+            <w:webHidden/>
+          </w:rPr>
+        </w:r>
+        <w:r>
+          <w:rPr>
             <w:noProof/>
             <w:webHidden/>
           </w:rPr>
@@ -574,17 +538,13 @@
         </w:r>
         <w:r>
           <w:rPr>
-            <w:b w:val="0"/>
-            <w:bCs w:val="0"/>
-            <w:noProof/>
-            <w:webHidden/>
-          </w:rPr>
-          <w:t>3</w:t>
-        </w:r>
-        <w:r>
-          <w:rPr>
-            <w:b w:val="0"/>
-            <w:bCs w:val="0"/>
+            <w:noProof/>
+            <w:webHidden/>
+          </w:rPr>
+          <w:t>5</w:t>
+        </w:r>
+        <w:r>
+          <w:rPr>
             <w:noProof/>
             <w:webHidden/>
           </w:rPr>
@@ -608,20 +568,16 @@
           <w:lang w:eastAsia="fr-FR"/>
         </w:rPr>
       </w:pPr>
-      <w:hyperlink w:anchor="_Toc215649285" w:history="1">
+      <w:hyperlink w:anchor="_Toc218604854" w:history="1">
         <w:r>
           <w:rPr>
             <w:rStyle w:val="Lienhypertexte"/>
-            <w:b w:val="0"/>
-            <w:bCs w:val="0"/>
             <w:noProof/>
           </w:rPr>
           <w:t>Des droits d'accès différents aux modèles ont été accordés aux groupes de sécurité</w:t>
         </w:r>
         <w:r>
           <w:rPr>
-            <w:b w:val="0"/>
-            <w:bCs w:val="0"/>
             <w:noProof/>
             <w:webHidden/>
           </w:rPr>
@@ -629,8 +585,6 @@
         </w:r>
         <w:r>
           <w:rPr>
-            <w:b w:val="0"/>
-            <w:bCs w:val="0"/>
             <w:noProof/>
             <w:webHidden/>
           </w:rPr>
@@ -638,25 +592,19 @@
         </w:r>
         <w:r>
           <w:rPr>
-            <w:b w:val="0"/>
-            <w:bCs w:val="0"/>
-            <w:noProof/>
-            <w:webHidden/>
-          </w:rPr>
-          <w:instrText xml:space="preserve"> PAGEREF _Toc215649285 \h </w:instrText>
-        </w:r>
-        <w:r>
-          <w:rPr>
-            <w:b w:val="0"/>
-            <w:bCs w:val="0"/>
-            <w:noProof/>
-            <w:webHidden/>
-          </w:rPr>
-        </w:r>
-        <w:r>
-          <w:rPr>
-            <w:b w:val="0"/>
-            <w:bCs w:val="0"/>
+            <w:noProof/>
+            <w:webHidden/>
+          </w:rPr>
+          <w:instrText xml:space="preserve"> PAGEREF _Toc218604854 \h </w:instrText>
+        </w:r>
+        <w:r>
+          <w:rPr>
+            <w:noProof/>
+            <w:webHidden/>
+          </w:rPr>
+        </w:r>
+        <w:r>
+          <w:rPr>
             <w:noProof/>
             <w:webHidden/>
           </w:rPr>
@@ -664,17 +612,13 @@
         </w:r>
         <w:r>
           <w:rPr>
-            <w:b w:val="0"/>
-            <w:bCs w:val="0"/>
-            <w:noProof/>
-            <w:webHidden/>
-          </w:rPr>
-          <w:t>3</w:t>
-        </w:r>
-        <w:r>
-          <w:rPr>
-            <w:b w:val="0"/>
-            <w:bCs w:val="0"/>
+            <w:noProof/>
+            <w:webHidden/>
+          </w:rPr>
+          <w:t>5</w:t>
+        </w:r>
+        <w:r>
+          <w:rPr>
             <w:noProof/>
             <w:webHidden/>
           </w:rPr>
@@ -689,24 +633,24 @@
           <w:rFonts w:eastAsiaTheme="minorEastAsia"/>
           <w:b w:val="0"/>
           <w:bCs w:val="0"/>
+          <w:i w:val="0"/>
+          <w:iCs w:val="0"/>
           <w:noProof/>
+          <w:sz w:val="24"/>
+          <w:szCs w:val="24"/>
           <w:lang w:eastAsia="fr-FR"/>
         </w:rPr>
       </w:pPr>
-      <w:hyperlink w:anchor="_Toc215649286" w:history="1">
+      <w:hyperlink w:anchor="_Toc218604855" w:history="1">
         <w:r>
           <w:rPr>
             <w:rStyle w:val="Lienhypertexte"/>
-            <w:b w:val="0"/>
-            <w:bCs w:val="0"/>
             <w:noProof/>
           </w:rPr>
           <w:t>Modèles</w:t>
         </w:r>
         <w:r>
           <w:rPr>
-            <w:b w:val="0"/>
-            <w:bCs w:val="0"/>
             <w:noProof/>
             <w:webHidden/>
           </w:rPr>
@@ -714,8 +658,6 @@
         </w:r>
         <w:r>
           <w:rPr>
-            <w:b w:val="0"/>
-            <w:bCs w:val="0"/>
             <w:noProof/>
             <w:webHidden/>
           </w:rPr>
@@ -723,25 +665,19 @@
         </w:r>
         <w:r>
           <w:rPr>
-            <w:b w:val="0"/>
-            <w:bCs w:val="0"/>
-            <w:noProof/>
-            <w:webHidden/>
-          </w:rPr>
-          <w:instrText xml:space="preserve"> PAGEREF _Toc215649286 \h </w:instrText>
-        </w:r>
-        <w:r>
-          <w:rPr>
-            <w:b w:val="0"/>
-            <w:bCs w:val="0"/>
-            <w:noProof/>
-            <w:webHidden/>
-          </w:rPr>
-        </w:r>
-        <w:r>
-          <w:rPr>
-            <w:b w:val="0"/>
-            <w:bCs w:val="0"/>
+            <w:noProof/>
+            <w:webHidden/>
+          </w:rPr>
+          <w:instrText xml:space="preserve"> PAGEREF _Toc218604855 \h </w:instrText>
+        </w:r>
+        <w:r>
+          <w:rPr>
+            <w:noProof/>
+            <w:webHidden/>
+          </w:rPr>
+        </w:r>
+        <w:r>
+          <w:rPr>
             <w:noProof/>
             <w:webHidden/>
           </w:rPr>
@@ -749,17 +685,13 @@
         </w:r>
         <w:r>
           <w:rPr>
-            <w:b w:val="0"/>
-            <w:bCs w:val="0"/>
-            <w:noProof/>
-            <w:webHidden/>
-          </w:rPr>
-          <w:t>4</w:t>
-        </w:r>
-        <w:r>
-          <w:rPr>
-            <w:b w:val="0"/>
-            <w:bCs w:val="0"/>
+            <w:noProof/>
+            <w:webHidden/>
+          </w:rPr>
+          <w:t>6</w:t>
+        </w:r>
+        <w:r>
+          <w:rPr>
             <w:noProof/>
             <w:webHidden/>
           </w:rPr>
@@ -783,20 +715,16 @@
           <w:lang w:eastAsia="fr-FR"/>
         </w:rPr>
       </w:pPr>
-      <w:hyperlink w:anchor="_Toc215649287" w:history="1">
+      <w:hyperlink w:anchor="_Toc218604856" w:history="1">
         <w:r>
           <w:rPr>
             <w:rStyle w:val="Lienhypertexte"/>
-            <w:b w:val="0"/>
-            <w:bCs w:val="0"/>
             <w:noProof/>
           </w:rPr>
           <w:t>Il y a plusieurs modèles.</w:t>
         </w:r>
         <w:r>
           <w:rPr>
-            <w:b w:val="0"/>
-            <w:bCs w:val="0"/>
             <w:noProof/>
             <w:webHidden/>
           </w:rPr>
@@ -804,8 +732,6 @@
         </w:r>
         <w:r>
           <w:rPr>
-            <w:b w:val="0"/>
-            <w:bCs w:val="0"/>
             <w:noProof/>
             <w:webHidden/>
           </w:rPr>
@@ -813,25 +739,19 @@
         </w:r>
         <w:r>
           <w:rPr>
-            <w:b w:val="0"/>
-            <w:bCs w:val="0"/>
-            <w:noProof/>
-            <w:webHidden/>
-          </w:rPr>
-          <w:instrText xml:space="preserve"> PAGEREF _Toc215649287 \h </w:instrText>
-        </w:r>
-        <w:r>
-          <w:rPr>
-            <w:b w:val="0"/>
-            <w:bCs w:val="0"/>
-            <w:noProof/>
-            <w:webHidden/>
-          </w:rPr>
-        </w:r>
-        <w:r>
-          <w:rPr>
-            <w:b w:val="0"/>
-            <w:bCs w:val="0"/>
+            <w:noProof/>
+            <w:webHidden/>
+          </w:rPr>
+          <w:instrText xml:space="preserve"> PAGEREF _Toc218604856 \h </w:instrText>
+        </w:r>
+        <w:r>
+          <w:rPr>
+            <w:noProof/>
+            <w:webHidden/>
+          </w:rPr>
+        </w:r>
+        <w:r>
+          <w:rPr>
             <w:noProof/>
             <w:webHidden/>
           </w:rPr>
@@ -839,17 +759,13 @@
         </w:r>
         <w:r>
           <w:rPr>
-            <w:b w:val="0"/>
-            <w:bCs w:val="0"/>
-            <w:noProof/>
-            <w:webHidden/>
-          </w:rPr>
-          <w:t>4</w:t>
-        </w:r>
-        <w:r>
-          <w:rPr>
-            <w:b w:val="0"/>
-            <w:bCs w:val="0"/>
+            <w:noProof/>
+            <w:webHidden/>
+          </w:rPr>
+          <w:t>6</w:t>
+        </w:r>
+        <w:r>
+          <w:rPr>
             <w:noProof/>
             <w:webHidden/>
           </w:rPr>
@@ -873,38 +789,16 @@
           <w:lang w:eastAsia="fr-FR"/>
         </w:rPr>
       </w:pPr>
-      <w:hyperlink w:anchor="_Toc215649288" w:history="1">
+      <w:hyperlink w:anchor="_Toc218604857" w:history="1">
         <w:r>
           <w:rPr>
             <w:rStyle w:val="Lienhypertexte"/>
-            <w:b w:val="0"/>
-            <w:bCs w:val="0"/>
-            <w:noProof/>
-          </w:rPr>
-          <w:t>Il y a dans au moins un</w:t>
-        </w:r>
-        <w:r>
-          <w:rPr>
-            <w:rStyle w:val="Lienhypertexte"/>
-            <w:b w:val="0"/>
-            <w:bCs w:val="0"/>
-            <w:noProof/>
-          </w:rPr>
-          <w:t xml:space="preserve"> </w:t>
-        </w:r>
-        <w:r>
-          <w:rPr>
-            <w:rStyle w:val="Lienhypertexte"/>
-            <w:b w:val="0"/>
-            <w:bCs w:val="0"/>
-            <w:noProof/>
-          </w:rPr>
-          <w:t>modèle un champ textuel, un champ numérique, un champ date un champ image et un champ select.</w:t>
-        </w:r>
-        <w:r>
-          <w:rPr>
-            <w:b w:val="0"/>
-            <w:bCs w:val="0"/>
+            <w:noProof/>
+          </w:rPr>
+          <w:t>Il y a dans au moins un modèle un champ textuel, un champ numérique, un champ date un champ image, un champ select, un champ calculé et un champ related.</w:t>
+        </w:r>
+        <w:r>
+          <w:rPr>
             <w:noProof/>
             <w:webHidden/>
           </w:rPr>
@@ -912,8 +806,6 @@
         </w:r>
         <w:r>
           <w:rPr>
-            <w:b w:val="0"/>
-            <w:bCs w:val="0"/>
             <w:noProof/>
             <w:webHidden/>
           </w:rPr>
@@ -921,25 +813,19 @@
         </w:r>
         <w:r>
           <w:rPr>
-            <w:b w:val="0"/>
-            <w:bCs w:val="0"/>
-            <w:noProof/>
-            <w:webHidden/>
-          </w:rPr>
-          <w:instrText xml:space="preserve"> PAGEREF _Toc215649288 \h </w:instrText>
-        </w:r>
-        <w:r>
-          <w:rPr>
-            <w:b w:val="0"/>
-            <w:bCs w:val="0"/>
-            <w:noProof/>
-            <w:webHidden/>
-          </w:rPr>
-        </w:r>
-        <w:r>
-          <w:rPr>
-            <w:b w:val="0"/>
-            <w:bCs w:val="0"/>
+            <w:noProof/>
+            <w:webHidden/>
+          </w:rPr>
+          <w:instrText xml:space="preserve"> PAGEREF _Toc218604857 \h </w:instrText>
+        </w:r>
+        <w:r>
+          <w:rPr>
+            <w:noProof/>
+            <w:webHidden/>
+          </w:rPr>
+        </w:r>
+        <w:r>
+          <w:rPr>
             <w:noProof/>
             <w:webHidden/>
           </w:rPr>
@@ -947,17 +833,13 @@
         </w:r>
         <w:r>
           <w:rPr>
-            <w:b w:val="0"/>
-            <w:bCs w:val="0"/>
-            <w:noProof/>
-            <w:webHidden/>
-          </w:rPr>
-          <w:t>4</w:t>
-        </w:r>
-        <w:r>
-          <w:rPr>
-            <w:b w:val="0"/>
-            <w:bCs w:val="0"/>
+            <w:noProof/>
+            <w:webHidden/>
+          </w:rPr>
+          <w:t>6</w:t>
+        </w:r>
+        <w:r>
+          <w:rPr>
             <w:noProof/>
             <w:webHidden/>
           </w:rPr>
@@ -981,20 +863,16 @@
           <w:lang w:eastAsia="fr-FR"/>
         </w:rPr>
       </w:pPr>
-      <w:hyperlink w:anchor="_Toc215649289" w:history="1">
+      <w:hyperlink w:anchor="_Toc218604858" w:history="1">
         <w:r>
           <w:rPr>
             <w:rStyle w:val="Lienhypertexte"/>
-            <w:b w:val="0"/>
-            <w:bCs w:val="0"/>
             <w:noProof/>
           </w:rPr>
           <w:t>Il y a au moins dans un modèle une méthode qui contrôle des données.</w:t>
         </w:r>
         <w:r>
           <w:rPr>
-            <w:b w:val="0"/>
-            <w:bCs w:val="0"/>
             <w:noProof/>
             <w:webHidden/>
           </w:rPr>
@@ -1002,8 +880,6 @@
         </w:r>
         <w:r>
           <w:rPr>
-            <w:b w:val="0"/>
-            <w:bCs w:val="0"/>
             <w:noProof/>
             <w:webHidden/>
           </w:rPr>
@@ -1011,25 +887,19 @@
         </w:r>
         <w:r>
           <w:rPr>
-            <w:b w:val="0"/>
-            <w:bCs w:val="0"/>
-            <w:noProof/>
-            <w:webHidden/>
-          </w:rPr>
-          <w:instrText xml:space="preserve"> PAGEREF _Toc215649289 \h </w:instrText>
-        </w:r>
-        <w:r>
-          <w:rPr>
-            <w:b w:val="0"/>
-            <w:bCs w:val="0"/>
-            <w:noProof/>
-            <w:webHidden/>
-          </w:rPr>
-        </w:r>
-        <w:r>
-          <w:rPr>
-            <w:b w:val="0"/>
-            <w:bCs w:val="0"/>
+            <w:noProof/>
+            <w:webHidden/>
+          </w:rPr>
+          <w:instrText xml:space="preserve"> PAGEREF _Toc218604858 \h </w:instrText>
+        </w:r>
+        <w:r>
+          <w:rPr>
+            <w:noProof/>
+            <w:webHidden/>
+          </w:rPr>
+        </w:r>
+        <w:r>
+          <w:rPr>
             <w:noProof/>
             <w:webHidden/>
           </w:rPr>
@@ -1037,17 +907,13 @@
         </w:r>
         <w:r>
           <w:rPr>
-            <w:b w:val="0"/>
-            <w:bCs w:val="0"/>
-            <w:noProof/>
-            <w:webHidden/>
-          </w:rPr>
-          <w:t>4</w:t>
-        </w:r>
-        <w:r>
-          <w:rPr>
-            <w:b w:val="0"/>
-            <w:bCs w:val="0"/>
+            <w:noProof/>
+            <w:webHidden/>
+          </w:rPr>
+          <w:t>6</w:t>
+        </w:r>
+        <w:r>
+          <w:rPr>
             <w:noProof/>
             <w:webHidden/>
           </w:rPr>
@@ -1071,20 +937,16 @@
           <w:lang w:eastAsia="fr-FR"/>
         </w:rPr>
       </w:pPr>
-      <w:hyperlink w:anchor="_Toc215649290" w:history="1">
+      <w:hyperlink w:anchor="_Toc218604859" w:history="1">
         <w:r>
           <w:rPr>
             <w:rStyle w:val="Lienhypertexte"/>
-            <w:b w:val="0"/>
-            <w:bCs w:val="0"/>
             <w:noProof/>
           </w:rPr>
           <w:t>Il existe au moins une relation un à plusieurs et une relation plusieurs à plusieurs.</w:t>
         </w:r>
         <w:r>
           <w:rPr>
-            <w:b w:val="0"/>
-            <w:bCs w:val="0"/>
             <w:noProof/>
             <w:webHidden/>
           </w:rPr>
@@ -1092,8 +954,6 @@
         </w:r>
         <w:r>
           <w:rPr>
-            <w:b w:val="0"/>
-            <w:bCs w:val="0"/>
             <w:noProof/>
             <w:webHidden/>
           </w:rPr>
@@ -1101,25 +961,19 @@
         </w:r>
         <w:r>
           <w:rPr>
-            <w:b w:val="0"/>
-            <w:bCs w:val="0"/>
-            <w:noProof/>
-            <w:webHidden/>
-          </w:rPr>
-          <w:instrText xml:space="preserve"> PAGEREF _Toc215649290 \h </w:instrText>
-        </w:r>
-        <w:r>
-          <w:rPr>
-            <w:b w:val="0"/>
-            <w:bCs w:val="0"/>
-            <w:noProof/>
-            <w:webHidden/>
-          </w:rPr>
-        </w:r>
-        <w:r>
-          <w:rPr>
-            <w:b w:val="0"/>
-            <w:bCs w:val="0"/>
+            <w:noProof/>
+            <w:webHidden/>
+          </w:rPr>
+          <w:instrText xml:space="preserve"> PAGEREF _Toc218604859 \h </w:instrText>
+        </w:r>
+        <w:r>
+          <w:rPr>
+            <w:noProof/>
+            <w:webHidden/>
+          </w:rPr>
+        </w:r>
+        <w:r>
+          <w:rPr>
             <w:noProof/>
             <w:webHidden/>
           </w:rPr>
@@ -1127,17 +981,157 @@
         </w:r>
         <w:r>
           <w:rPr>
-            <w:b w:val="0"/>
-            <w:bCs w:val="0"/>
-            <w:noProof/>
-            <w:webHidden/>
-          </w:rPr>
-          <w:t>4</w:t>
-        </w:r>
-        <w:r>
-          <w:rPr>
-            <w:b w:val="0"/>
-            <w:bCs w:val="0"/>
+            <w:noProof/>
+            <w:webHidden/>
+          </w:rPr>
+          <w:t>7</w:t>
+        </w:r>
+        <w:r>
+          <w:rPr>
+            <w:noProof/>
+            <w:webHidden/>
+          </w:rPr>
+          <w:fldChar w:fldCharType="end"/>
+        </w:r>
+      </w:hyperlink>
+    </w:p>
+    <w:p>
+      <w:pPr>
+        <w:pStyle w:val="TM3"/>
+        <w:tabs>
+          <w:tab w:val="right" w:leader="underscore" w:pos="9062"/>
+        </w:tabs>
+        <w:rPr>
+          <w:rFonts w:eastAsiaTheme="minorEastAsia"/>
+          <w:noProof/>
+          <w:sz w:val="24"/>
+          <w:szCs w:val="24"/>
+          <w:lang w:eastAsia="fr-FR"/>
+        </w:rPr>
+      </w:pPr>
+      <w:hyperlink w:anchor="_Toc218604860" w:history="1">
+        <w:r>
+          <w:rPr>
+            <w:rStyle w:val="Lienhypertexte"/>
+            <w:noProof/>
+          </w:rPr>
+          <w:t>Relation "Un à Plusieurs"</w:t>
+        </w:r>
+        <w:r>
+          <w:rPr>
+            <w:noProof/>
+            <w:webHidden/>
+          </w:rPr>
+          <w:tab/>
+        </w:r>
+        <w:r>
+          <w:rPr>
+            <w:noProof/>
+            <w:webHidden/>
+          </w:rPr>
+          <w:fldChar w:fldCharType="begin"/>
+        </w:r>
+        <w:r>
+          <w:rPr>
+            <w:noProof/>
+            <w:webHidden/>
+          </w:rPr>
+          <w:instrText xml:space="preserve"> PAGEREF _Toc218604860 \h </w:instrText>
+        </w:r>
+        <w:r>
+          <w:rPr>
+            <w:noProof/>
+            <w:webHidden/>
+          </w:rPr>
+        </w:r>
+        <w:r>
+          <w:rPr>
+            <w:noProof/>
+            <w:webHidden/>
+          </w:rPr>
+          <w:fldChar w:fldCharType="separate"/>
+        </w:r>
+        <w:r>
+          <w:rPr>
+            <w:noProof/>
+            <w:webHidden/>
+          </w:rPr>
+          <w:t>7</w:t>
+        </w:r>
+        <w:r>
+          <w:rPr>
+            <w:noProof/>
+            <w:webHidden/>
+          </w:rPr>
+          <w:fldChar w:fldCharType="end"/>
+        </w:r>
+      </w:hyperlink>
+    </w:p>
+    <w:p>
+      <w:pPr>
+        <w:pStyle w:val="TM3"/>
+        <w:tabs>
+          <w:tab w:val="right" w:leader="underscore" w:pos="9062"/>
+        </w:tabs>
+        <w:rPr>
+          <w:rFonts w:eastAsiaTheme="minorEastAsia"/>
+          <w:noProof/>
+          <w:sz w:val="24"/>
+          <w:szCs w:val="24"/>
+          <w:lang w:eastAsia="fr-FR"/>
+        </w:rPr>
+      </w:pPr>
+      <w:hyperlink w:anchor="_Toc218604861" w:history="1">
+        <w:r>
+          <w:rPr>
+            <w:rStyle w:val="Lienhypertexte"/>
+            <w:noProof/>
+          </w:rPr>
+          <w:t>Relation "Plusieurs à Plusieurs"</w:t>
+        </w:r>
+        <w:r>
+          <w:rPr>
+            <w:noProof/>
+            <w:webHidden/>
+          </w:rPr>
+          <w:tab/>
+        </w:r>
+        <w:r>
+          <w:rPr>
+            <w:noProof/>
+            <w:webHidden/>
+          </w:rPr>
+          <w:fldChar w:fldCharType="begin"/>
+        </w:r>
+        <w:r>
+          <w:rPr>
+            <w:noProof/>
+            <w:webHidden/>
+          </w:rPr>
+          <w:instrText xml:space="preserve"> PAGEREF _Toc218604861 \h </w:instrText>
+        </w:r>
+        <w:r>
+          <w:rPr>
+            <w:noProof/>
+            <w:webHidden/>
+          </w:rPr>
+        </w:r>
+        <w:r>
+          <w:rPr>
+            <w:noProof/>
+            <w:webHidden/>
+          </w:rPr>
+          <w:fldChar w:fldCharType="separate"/>
+        </w:r>
+        <w:r>
+          <w:rPr>
+            <w:noProof/>
+            <w:webHidden/>
+          </w:rPr>
+          <w:t>7</w:t>
+        </w:r>
+        <w:r>
+          <w:rPr>
             <w:noProof/>
             <w:webHidden/>
           </w:rPr>
@@ -1161,20 +1155,16 @@
           <w:lang w:eastAsia="fr-FR"/>
         </w:rPr>
       </w:pPr>
-      <w:hyperlink w:anchor="_Toc215649291" w:history="1">
+      <w:hyperlink w:anchor="_Toc218604862" w:history="1">
         <w:r>
           <w:rPr>
             <w:rStyle w:val="Lienhypertexte"/>
-            <w:b w:val="0"/>
-            <w:bCs w:val="0"/>
             <w:noProof/>
           </w:rPr>
           <w:t>Il existe des données de démo au format xml. Certains enregistrements sont liés par les relations d'autres non.</w:t>
         </w:r>
         <w:r>
           <w:rPr>
-            <w:b w:val="0"/>
-            <w:bCs w:val="0"/>
             <w:noProof/>
             <w:webHidden/>
           </w:rPr>
@@ -1182,8 +1172,6 @@
         </w:r>
         <w:r>
           <w:rPr>
-            <w:b w:val="0"/>
-            <w:bCs w:val="0"/>
             <w:noProof/>
             <w:webHidden/>
           </w:rPr>
@@ -1191,25 +1179,19 @@
         </w:r>
         <w:r>
           <w:rPr>
-            <w:b w:val="0"/>
-            <w:bCs w:val="0"/>
-            <w:noProof/>
-            <w:webHidden/>
-          </w:rPr>
-          <w:instrText xml:space="preserve"> PAGEREF _Toc215649291 \h </w:instrText>
-        </w:r>
-        <w:r>
-          <w:rPr>
-            <w:b w:val="0"/>
-            <w:bCs w:val="0"/>
-            <w:noProof/>
-            <w:webHidden/>
-          </w:rPr>
-        </w:r>
-        <w:r>
-          <w:rPr>
-            <w:b w:val="0"/>
-            <w:bCs w:val="0"/>
+            <w:noProof/>
+            <w:webHidden/>
+          </w:rPr>
+          <w:instrText xml:space="preserve"> PAGEREF _Toc218604862 \h </w:instrText>
+        </w:r>
+        <w:r>
+          <w:rPr>
+            <w:noProof/>
+            <w:webHidden/>
+          </w:rPr>
+        </w:r>
+        <w:r>
+          <w:rPr>
             <w:noProof/>
             <w:webHidden/>
           </w:rPr>
@@ -1217,17 +1199,13 @@
         </w:r>
         <w:r>
           <w:rPr>
-            <w:b w:val="0"/>
-            <w:bCs w:val="0"/>
-            <w:noProof/>
-            <w:webHidden/>
-          </w:rPr>
-          <w:t>4</w:t>
-        </w:r>
-        <w:r>
-          <w:rPr>
-            <w:b w:val="0"/>
-            <w:bCs w:val="0"/>
+            <w:noProof/>
+            <w:webHidden/>
+          </w:rPr>
+          <w:t>7</w:t>
+        </w:r>
+        <w:r>
+          <w:rPr>
             <w:noProof/>
             <w:webHidden/>
           </w:rPr>
@@ -1251,20 +1229,16 @@
           <w:lang w:eastAsia="fr-FR"/>
         </w:rPr>
       </w:pPr>
-      <w:hyperlink w:anchor="_Toc215649292" w:history="1">
+      <w:hyperlink w:anchor="_Toc218604863" w:history="1">
         <w:r>
           <w:rPr>
             <w:rStyle w:val="Lienhypertexte"/>
-            <w:b w:val="0"/>
-            <w:bCs w:val="0"/>
             <w:noProof/>
           </w:rPr>
           <w:t>Un des modèles étend un modèle d’Odoo.</w:t>
         </w:r>
         <w:r>
           <w:rPr>
-            <w:b w:val="0"/>
-            <w:bCs w:val="0"/>
             <w:noProof/>
             <w:webHidden/>
           </w:rPr>
@@ -1272,8 +1246,6 @@
         </w:r>
         <w:r>
           <w:rPr>
-            <w:b w:val="0"/>
-            <w:bCs w:val="0"/>
             <w:noProof/>
             <w:webHidden/>
           </w:rPr>
@@ -1281,25 +1253,19 @@
         </w:r>
         <w:r>
           <w:rPr>
-            <w:b w:val="0"/>
-            <w:bCs w:val="0"/>
-            <w:noProof/>
-            <w:webHidden/>
-          </w:rPr>
-          <w:instrText xml:space="preserve"> PAGEREF _Toc215649292 \h </w:instrText>
-        </w:r>
-        <w:r>
-          <w:rPr>
-            <w:b w:val="0"/>
-            <w:bCs w:val="0"/>
-            <w:noProof/>
-            <w:webHidden/>
-          </w:rPr>
-        </w:r>
-        <w:r>
-          <w:rPr>
-            <w:b w:val="0"/>
-            <w:bCs w:val="0"/>
+            <w:noProof/>
+            <w:webHidden/>
+          </w:rPr>
+          <w:instrText xml:space="preserve"> PAGEREF _Toc218604863 \h </w:instrText>
+        </w:r>
+        <w:r>
+          <w:rPr>
+            <w:noProof/>
+            <w:webHidden/>
+          </w:rPr>
+        </w:r>
+        <w:r>
+          <w:rPr>
             <w:noProof/>
             <w:webHidden/>
           </w:rPr>
@@ -1307,17 +1273,13 @@
         </w:r>
         <w:r>
           <w:rPr>
-            <w:b w:val="0"/>
-            <w:bCs w:val="0"/>
-            <w:noProof/>
-            <w:webHidden/>
-          </w:rPr>
-          <w:t>4</w:t>
-        </w:r>
-        <w:r>
-          <w:rPr>
-            <w:b w:val="0"/>
-            <w:bCs w:val="0"/>
+            <w:noProof/>
+            <w:webHidden/>
+          </w:rPr>
+          <w:t>7</w:t>
+        </w:r>
+        <w:r>
+          <w:rPr>
             <w:noProof/>
             <w:webHidden/>
           </w:rPr>
@@ -1332,24 +1294,24 @@
           <w:rFonts w:eastAsiaTheme="minorEastAsia"/>
           <w:b w:val="0"/>
           <w:bCs w:val="0"/>
+          <w:i w:val="0"/>
+          <w:iCs w:val="0"/>
           <w:noProof/>
+          <w:sz w:val="24"/>
+          <w:szCs w:val="24"/>
           <w:lang w:eastAsia="fr-FR"/>
         </w:rPr>
       </w:pPr>
-      <w:hyperlink w:anchor="_Toc215649293" w:history="1">
+      <w:hyperlink w:anchor="_Toc218604864" w:history="1">
         <w:r>
           <w:rPr>
             <w:rStyle w:val="Lienhypertexte"/>
-            <w:b w:val="0"/>
-            <w:bCs w:val="0"/>
             <w:noProof/>
           </w:rPr>
           <w:t>Vues</w:t>
         </w:r>
         <w:r>
           <w:rPr>
-            <w:b w:val="0"/>
-            <w:bCs w:val="0"/>
             <w:noProof/>
             <w:webHidden/>
           </w:rPr>
@@ -1357,8 +1319,6 @@
         </w:r>
         <w:r>
           <w:rPr>
-            <w:b w:val="0"/>
-            <w:bCs w:val="0"/>
             <w:noProof/>
             <w:webHidden/>
           </w:rPr>
@@ -1366,25 +1326,19 @@
         </w:r>
         <w:r>
           <w:rPr>
-            <w:b w:val="0"/>
-            <w:bCs w:val="0"/>
-            <w:noProof/>
-            <w:webHidden/>
-          </w:rPr>
-          <w:instrText xml:space="preserve"> PAGEREF _Toc215649293 \h </w:instrText>
-        </w:r>
-        <w:r>
-          <w:rPr>
-            <w:b w:val="0"/>
-            <w:bCs w:val="0"/>
-            <w:noProof/>
-            <w:webHidden/>
-          </w:rPr>
-        </w:r>
-        <w:r>
-          <w:rPr>
-            <w:b w:val="0"/>
-            <w:bCs w:val="0"/>
+            <w:noProof/>
+            <w:webHidden/>
+          </w:rPr>
+          <w:instrText xml:space="preserve"> PAGEREF _Toc218604864 \h </w:instrText>
+        </w:r>
+        <w:r>
+          <w:rPr>
+            <w:noProof/>
+            <w:webHidden/>
+          </w:rPr>
+        </w:r>
+        <w:r>
+          <w:rPr>
             <w:noProof/>
             <w:webHidden/>
           </w:rPr>
@@ -1392,17 +1346,13 @@
         </w:r>
         <w:r>
           <w:rPr>
-            <w:b w:val="0"/>
-            <w:bCs w:val="0"/>
-            <w:noProof/>
-            <w:webHidden/>
-          </w:rPr>
-          <w:t>5</w:t>
-        </w:r>
-        <w:r>
-          <w:rPr>
-            <w:b w:val="0"/>
-            <w:bCs w:val="0"/>
+            <w:noProof/>
+            <w:webHidden/>
+          </w:rPr>
+          <w:t>9</w:t>
+        </w:r>
+        <w:r>
+          <w:rPr>
             <w:noProof/>
             <w:webHidden/>
           </w:rPr>
@@ -1426,20 +1376,16 @@
           <w:lang w:eastAsia="fr-FR"/>
         </w:rPr>
       </w:pPr>
-      <w:hyperlink w:anchor="_Toc215649294" w:history="1">
+      <w:hyperlink w:anchor="_Toc218604865" w:history="1">
         <w:r>
           <w:rPr>
             <w:rStyle w:val="Lienhypertexte"/>
-            <w:b w:val="0"/>
-            <w:bCs w:val="0"/>
             <w:noProof/>
           </w:rPr>
           <w:t>Il existe une vue liste personnalisée.</w:t>
         </w:r>
         <w:r>
           <w:rPr>
-            <w:b w:val="0"/>
-            <w:bCs w:val="0"/>
             <w:noProof/>
             <w:webHidden/>
           </w:rPr>
@@ -1447,8 +1393,6 @@
         </w:r>
         <w:r>
           <w:rPr>
-            <w:b w:val="0"/>
-            <w:bCs w:val="0"/>
             <w:noProof/>
             <w:webHidden/>
           </w:rPr>
@@ -1456,25 +1400,19 @@
         </w:r>
         <w:r>
           <w:rPr>
-            <w:b w:val="0"/>
-            <w:bCs w:val="0"/>
-            <w:noProof/>
-            <w:webHidden/>
-          </w:rPr>
-          <w:instrText xml:space="preserve"> PAGEREF _Toc215649294 \h </w:instrText>
-        </w:r>
-        <w:r>
-          <w:rPr>
-            <w:b w:val="0"/>
-            <w:bCs w:val="0"/>
-            <w:noProof/>
-            <w:webHidden/>
-          </w:rPr>
-        </w:r>
-        <w:r>
-          <w:rPr>
-            <w:b w:val="0"/>
-            <w:bCs w:val="0"/>
+            <w:noProof/>
+            <w:webHidden/>
+          </w:rPr>
+          <w:instrText xml:space="preserve"> PAGEREF _Toc218604865 \h </w:instrText>
+        </w:r>
+        <w:r>
+          <w:rPr>
+            <w:noProof/>
+            <w:webHidden/>
+          </w:rPr>
+        </w:r>
+        <w:r>
+          <w:rPr>
             <w:noProof/>
             <w:webHidden/>
           </w:rPr>
@@ -1482,17 +1420,13 @@
         </w:r>
         <w:r>
           <w:rPr>
-            <w:b w:val="0"/>
-            <w:bCs w:val="0"/>
-            <w:noProof/>
-            <w:webHidden/>
-          </w:rPr>
-          <w:t>5</w:t>
-        </w:r>
-        <w:r>
-          <w:rPr>
-            <w:b w:val="0"/>
-            <w:bCs w:val="0"/>
+            <w:noProof/>
+            <w:webHidden/>
+          </w:rPr>
+          <w:t>9</w:t>
+        </w:r>
+        <w:r>
+          <w:rPr>
             <w:noProof/>
             <w:webHidden/>
           </w:rPr>
@@ -1516,20 +1450,16 @@
           <w:lang w:eastAsia="fr-FR"/>
         </w:rPr>
       </w:pPr>
-      <w:hyperlink w:anchor="_Toc215649295" w:history="1">
+      <w:hyperlink w:anchor="_Toc218604866" w:history="1">
         <w:r>
           <w:rPr>
             <w:rStyle w:val="Lienhypertexte"/>
-            <w:b w:val="0"/>
-            <w:bCs w:val="0"/>
             <w:noProof/>
           </w:rPr>
           <w:t>Il existe une vue formulaire personnalisée.</w:t>
         </w:r>
         <w:r>
           <w:rPr>
-            <w:b w:val="0"/>
-            <w:bCs w:val="0"/>
             <w:noProof/>
             <w:webHidden/>
           </w:rPr>
@@ -1537,8 +1467,6 @@
         </w:r>
         <w:r>
           <w:rPr>
-            <w:b w:val="0"/>
-            <w:bCs w:val="0"/>
             <w:noProof/>
             <w:webHidden/>
           </w:rPr>
@@ -1546,25 +1474,19 @@
         </w:r>
         <w:r>
           <w:rPr>
-            <w:b w:val="0"/>
-            <w:bCs w:val="0"/>
-            <w:noProof/>
-            <w:webHidden/>
-          </w:rPr>
-          <w:instrText xml:space="preserve"> PAGEREF _Toc215649295 \h </w:instrText>
-        </w:r>
-        <w:r>
-          <w:rPr>
-            <w:b w:val="0"/>
-            <w:bCs w:val="0"/>
-            <w:noProof/>
-            <w:webHidden/>
-          </w:rPr>
-        </w:r>
-        <w:r>
-          <w:rPr>
-            <w:b w:val="0"/>
-            <w:bCs w:val="0"/>
+            <w:noProof/>
+            <w:webHidden/>
+          </w:rPr>
+          <w:instrText xml:space="preserve"> PAGEREF _Toc218604866 \h </w:instrText>
+        </w:r>
+        <w:r>
+          <w:rPr>
+            <w:noProof/>
+            <w:webHidden/>
+          </w:rPr>
+        </w:r>
+        <w:r>
+          <w:rPr>
             <w:noProof/>
             <w:webHidden/>
           </w:rPr>
@@ -1572,17 +1494,13 @@
         </w:r>
         <w:r>
           <w:rPr>
-            <w:b w:val="0"/>
-            <w:bCs w:val="0"/>
-            <w:noProof/>
-            <w:webHidden/>
-          </w:rPr>
-          <w:t>5</w:t>
-        </w:r>
-        <w:r>
-          <w:rPr>
-            <w:b w:val="0"/>
-            <w:bCs w:val="0"/>
+            <w:noProof/>
+            <w:webHidden/>
+          </w:rPr>
+          <w:t>9</w:t>
+        </w:r>
+        <w:r>
+          <w:rPr>
             <w:noProof/>
             <w:webHidden/>
           </w:rPr>
@@ -1606,20 +1524,16 @@
           <w:lang w:eastAsia="fr-FR"/>
         </w:rPr>
       </w:pPr>
-      <w:hyperlink w:anchor="_Toc215649296" w:history="1">
+      <w:hyperlink w:anchor="_Toc218604867" w:history="1">
         <w:r>
           <w:rPr>
             <w:rStyle w:val="Lienhypertexte"/>
-            <w:b w:val="0"/>
-            <w:bCs w:val="0"/>
             <w:noProof/>
           </w:rPr>
           <w:t>Il existe un champ recherche personnalisé.</w:t>
         </w:r>
         <w:r>
           <w:rPr>
-            <w:b w:val="0"/>
-            <w:bCs w:val="0"/>
             <w:noProof/>
             <w:webHidden/>
           </w:rPr>
@@ -1627,8 +1541,6 @@
         </w:r>
         <w:r>
           <w:rPr>
-            <w:b w:val="0"/>
-            <w:bCs w:val="0"/>
             <w:noProof/>
             <w:webHidden/>
           </w:rPr>
@@ -1636,25 +1548,19 @@
         </w:r>
         <w:r>
           <w:rPr>
-            <w:b w:val="0"/>
-            <w:bCs w:val="0"/>
-            <w:noProof/>
-            <w:webHidden/>
-          </w:rPr>
-          <w:instrText xml:space="preserve"> PAGEREF _Toc215649296 \h </w:instrText>
-        </w:r>
-        <w:r>
-          <w:rPr>
-            <w:b w:val="0"/>
-            <w:bCs w:val="0"/>
-            <w:noProof/>
-            <w:webHidden/>
-          </w:rPr>
-        </w:r>
-        <w:r>
-          <w:rPr>
-            <w:b w:val="0"/>
-            <w:bCs w:val="0"/>
+            <w:noProof/>
+            <w:webHidden/>
+          </w:rPr>
+          <w:instrText xml:space="preserve"> PAGEREF _Toc218604867 \h </w:instrText>
+        </w:r>
+        <w:r>
+          <w:rPr>
+            <w:noProof/>
+            <w:webHidden/>
+          </w:rPr>
+        </w:r>
+        <w:r>
+          <w:rPr>
             <w:noProof/>
             <w:webHidden/>
           </w:rPr>
@@ -1662,17 +1568,13 @@
         </w:r>
         <w:r>
           <w:rPr>
-            <w:b w:val="0"/>
-            <w:bCs w:val="0"/>
-            <w:noProof/>
-            <w:webHidden/>
-          </w:rPr>
-          <w:t>5</w:t>
-        </w:r>
-        <w:r>
-          <w:rPr>
-            <w:b w:val="0"/>
-            <w:bCs w:val="0"/>
+            <w:noProof/>
+            <w:webHidden/>
+          </w:rPr>
+          <w:t>9</w:t>
+        </w:r>
+        <w:r>
+          <w:rPr>
             <w:noProof/>
             <w:webHidden/>
           </w:rPr>
@@ -1696,20 +1598,16 @@
           <w:lang w:eastAsia="fr-FR"/>
         </w:rPr>
       </w:pPr>
-      <w:hyperlink w:anchor="_Toc215649297" w:history="1">
+      <w:hyperlink w:anchor="_Toc218604868" w:history="1">
         <w:r>
           <w:rPr>
             <w:rStyle w:val="Lienhypertexte"/>
-            <w:b w:val="0"/>
-            <w:bCs w:val="0"/>
             <w:noProof/>
           </w:rPr>
           <w:t>Il existe une vue calendrier ou une vue kanban.</w:t>
         </w:r>
         <w:r>
           <w:rPr>
-            <w:b w:val="0"/>
-            <w:bCs w:val="0"/>
             <w:noProof/>
             <w:webHidden/>
           </w:rPr>
@@ -1717,8 +1615,6 @@
         </w:r>
         <w:r>
           <w:rPr>
-            <w:b w:val="0"/>
-            <w:bCs w:val="0"/>
             <w:noProof/>
             <w:webHidden/>
           </w:rPr>
@@ -1726,25 +1622,19 @@
         </w:r>
         <w:r>
           <w:rPr>
-            <w:b w:val="0"/>
-            <w:bCs w:val="0"/>
-            <w:noProof/>
-            <w:webHidden/>
-          </w:rPr>
-          <w:instrText xml:space="preserve"> PAGEREF _Toc215649297 \h </w:instrText>
-        </w:r>
-        <w:r>
-          <w:rPr>
-            <w:b w:val="0"/>
-            <w:bCs w:val="0"/>
-            <w:noProof/>
-            <w:webHidden/>
-          </w:rPr>
-        </w:r>
-        <w:r>
-          <w:rPr>
-            <w:b w:val="0"/>
-            <w:bCs w:val="0"/>
+            <w:noProof/>
+            <w:webHidden/>
+          </w:rPr>
+          <w:instrText xml:space="preserve"> PAGEREF _Toc218604868 \h </w:instrText>
+        </w:r>
+        <w:r>
+          <w:rPr>
+            <w:noProof/>
+            <w:webHidden/>
+          </w:rPr>
+        </w:r>
+        <w:r>
+          <w:rPr>
             <w:noProof/>
             <w:webHidden/>
           </w:rPr>
@@ -1752,17 +1642,13 @@
         </w:r>
         <w:r>
           <w:rPr>
-            <w:b w:val="0"/>
-            <w:bCs w:val="0"/>
-            <w:noProof/>
-            <w:webHidden/>
-          </w:rPr>
-          <w:t>5</w:t>
-        </w:r>
-        <w:r>
-          <w:rPr>
-            <w:b w:val="0"/>
-            <w:bCs w:val="0"/>
+            <w:noProof/>
+            <w:webHidden/>
+          </w:rPr>
+          <w:t>10</w:t>
+        </w:r>
+        <w:r>
+          <w:rPr>
             <w:noProof/>
             <w:webHidden/>
           </w:rPr>
@@ -1786,20 +1672,16 @@
           <w:lang w:eastAsia="fr-FR"/>
         </w:rPr>
       </w:pPr>
-      <w:hyperlink w:anchor="_Toc215649298" w:history="1">
+      <w:hyperlink w:anchor="_Toc218604869" w:history="1">
         <w:r>
           <w:rPr>
             <w:rStyle w:val="Lienhypertexte"/>
-            <w:b w:val="0"/>
-            <w:bCs w:val="0"/>
             <w:noProof/>
           </w:rPr>
           <w:t>Une page web est disponible.</w:t>
         </w:r>
         <w:r>
           <w:rPr>
-            <w:b w:val="0"/>
-            <w:bCs w:val="0"/>
             <w:noProof/>
             <w:webHidden/>
           </w:rPr>
@@ -1807,8 +1689,6 @@
         </w:r>
         <w:r>
           <w:rPr>
-            <w:b w:val="0"/>
-            <w:bCs w:val="0"/>
             <w:noProof/>
             <w:webHidden/>
           </w:rPr>
@@ -1816,25 +1696,19 @@
         </w:r>
         <w:r>
           <w:rPr>
-            <w:b w:val="0"/>
-            <w:bCs w:val="0"/>
-            <w:noProof/>
-            <w:webHidden/>
-          </w:rPr>
-          <w:instrText xml:space="preserve"> PAGEREF _Toc215649298 \h </w:instrText>
-        </w:r>
-        <w:r>
-          <w:rPr>
-            <w:b w:val="0"/>
-            <w:bCs w:val="0"/>
-            <w:noProof/>
-            <w:webHidden/>
-          </w:rPr>
-        </w:r>
-        <w:r>
-          <w:rPr>
-            <w:b w:val="0"/>
-            <w:bCs w:val="0"/>
+            <w:noProof/>
+            <w:webHidden/>
+          </w:rPr>
+          <w:instrText xml:space="preserve"> PAGEREF _Toc218604869 \h </w:instrText>
+        </w:r>
+        <w:r>
+          <w:rPr>
+            <w:noProof/>
+            <w:webHidden/>
+          </w:rPr>
+        </w:r>
+        <w:r>
+          <w:rPr>
             <w:noProof/>
             <w:webHidden/>
           </w:rPr>
@@ -1842,17 +1716,13 @@
         </w:r>
         <w:r>
           <w:rPr>
-            <w:b w:val="0"/>
-            <w:bCs w:val="0"/>
-            <w:noProof/>
-            <w:webHidden/>
-          </w:rPr>
-          <w:t>5</w:t>
-        </w:r>
-        <w:r>
-          <w:rPr>
-            <w:b w:val="0"/>
-            <w:bCs w:val="0"/>
+            <w:noProof/>
+            <w:webHidden/>
+          </w:rPr>
+          <w:t>10</w:t>
+        </w:r>
+        <w:r>
+          <w:rPr>
             <w:noProof/>
             <w:webHidden/>
           </w:rPr>
@@ -1876,56 +1746,16 @@
           <w:lang w:eastAsia="fr-FR"/>
         </w:rPr>
       </w:pPr>
-      <w:hyperlink w:anchor="_Toc215649299" w:history="1">
+      <w:hyperlink w:anchor="_Toc218604870" w:history="1">
         <w:r>
           <w:rPr>
             <w:rStyle w:val="Lienhypertexte"/>
-            <w:b w:val="0"/>
-            <w:bCs w:val="0"/>
-            <w:noProof/>
-          </w:rPr>
-          <w:t>Dans un</w:t>
-        </w:r>
-        <w:r>
-          <w:rPr>
-            <w:rStyle w:val="Lienhypertexte"/>
-            <w:b w:val="0"/>
-            <w:bCs w:val="0"/>
-            <w:noProof/>
-          </w:rPr>
-          <w:t>e</w:t>
-        </w:r>
-        <w:r>
-          <w:rPr>
-            <w:rStyle w:val="Lienhypertexte"/>
-            <w:b w:val="0"/>
-            <w:bCs w:val="0"/>
-            <w:noProof/>
-          </w:rPr>
-          <w:t xml:space="preserve"> </w:t>
-        </w:r>
-        <w:r>
-          <w:rPr>
-            <w:rStyle w:val="Lienhypertexte"/>
-            <w:b w:val="0"/>
-            <w:bCs w:val="0"/>
-            <w:noProof/>
-          </w:rPr>
-          <w:t>d</w:t>
-        </w:r>
-        <w:r>
-          <w:rPr>
-            <w:rStyle w:val="Lienhypertexte"/>
-            <w:b w:val="0"/>
-            <w:bCs w:val="0"/>
-            <w:noProof/>
-          </w:rPr>
-          <w:t>es vues on trouve au moins un champ relationnel, un champ calculé, un champ related.</w:t>
-        </w:r>
-        <w:r>
-          <w:rPr>
-            <w:b w:val="0"/>
-            <w:bCs w:val="0"/>
+            <w:noProof/>
+          </w:rPr>
+          <w:t>Dans une des vues on trouve au moins un exemplaire de tous les champs exigés dans les consignes sur les modèles.</w:t>
+        </w:r>
+        <w:r>
+          <w:rPr>
             <w:noProof/>
             <w:webHidden/>
           </w:rPr>
@@ -1933,8 +1763,6 @@
         </w:r>
         <w:r>
           <w:rPr>
-            <w:b w:val="0"/>
-            <w:bCs w:val="0"/>
             <w:noProof/>
             <w:webHidden/>
           </w:rPr>
@@ -1942,25 +1770,19 @@
         </w:r>
         <w:r>
           <w:rPr>
-            <w:b w:val="0"/>
-            <w:bCs w:val="0"/>
-            <w:noProof/>
-            <w:webHidden/>
-          </w:rPr>
-          <w:instrText xml:space="preserve"> PAGEREF _Toc215649299 \h </w:instrText>
-        </w:r>
-        <w:r>
-          <w:rPr>
-            <w:b w:val="0"/>
-            <w:bCs w:val="0"/>
-            <w:noProof/>
-            <w:webHidden/>
-          </w:rPr>
-        </w:r>
-        <w:r>
-          <w:rPr>
-            <w:b w:val="0"/>
-            <w:bCs w:val="0"/>
+            <w:noProof/>
+            <w:webHidden/>
+          </w:rPr>
+          <w:instrText xml:space="preserve"> PAGEREF _Toc218604870 \h </w:instrText>
+        </w:r>
+        <w:r>
+          <w:rPr>
+            <w:noProof/>
+            <w:webHidden/>
+          </w:rPr>
+        </w:r>
+        <w:r>
+          <w:rPr>
             <w:noProof/>
             <w:webHidden/>
           </w:rPr>
@@ -1968,17 +1790,13 @@
         </w:r>
         <w:r>
           <w:rPr>
-            <w:b w:val="0"/>
-            <w:bCs w:val="0"/>
-            <w:noProof/>
-            <w:webHidden/>
-          </w:rPr>
-          <w:t>5</w:t>
-        </w:r>
-        <w:r>
-          <w:rPr>
-            <w:b w:val="0"/>
-            <w:bCs w:val="0"/>
+            <w:noProof/>
+            <w:webHidden/>
+          </w:rPr>
+          <w:t>10</w:t>
+        </w:r>
+        <w:r>
+          <w:rPr>
             <w:noProof/>
             <w:webHidden/>
           </w:rPr>
@@ -2002,20 +1820,164 @@
           <w:lang w:eastAsia="fr-FR"/>
         </w:rPr>
       </w:pPr>
-      <w:hyperlink w:anchor="_Toc215649300" w:history="1">
+      <w:hyperlink w:anchor="_Toc218604871" w:history="1">
         <w:r>
           <w:rPr>
             <w:rStyle w:val="Lienhypertexte"/>
-            <w:b w:val="0"/>
-            <w:bCs w:val="0"/>
+            <w:noProof/>
+          </w:rPr>
+          <w:t>Un bouton permet d'exécuter la méthode qui contrôle les données</w:t>
+        </w:r>
+        <w:r>
+          <w:rPr>
+            <w:noProof/>
+            <w:webHidden/>
+          </w:rPr>
+          <w:tab/>
+        </w:r>
+        <w:r>
+          <w:rPr>
+            <w:noProof/>
+            <w:webHidden/>
+          </w:rPr>
+          <w:fldChar w:fldCharType="begin"/>
+        </w:r>
+        <w:r>
+          <w:rPr>
+            <w:noProof/>
+            <w:webHidden/>
+          </w:rPr>
+          <w:instrText xml:space="preserve"> PAGEREF _Toc218604871 \h </w:instrText>
+        </w:r>
+        <w:r>
+          <w:rPr>
+            <w:noProof/>
+            <w:webHidden/>
+          </w:rPr>
+        </w:r>
+        <w:r>
+          <w:rPr>
+            <w:noProof/>
+            <w:webHidden/>
+          </w:rPr>
+          <w:fldChar w:fldCharType="separate"/>
+        </w:r>
+        <w:r>
+          <w:rPr>
+            <w:noProof/>
+            <w:webHidden/>
+          </w:rPr>
+          <w:t>11</w:t>
+        </w:r>
+        <w:r>
+          <w:rPr>
+            <w:noProof/>
+            <w:webHidden/>
+          </w:rPr>
+          <w:fldChar w:fldCharType="end"/>
+        </w:r>
+      </w:hyperlink>
+    </w:p>
+    <w:p>
+      <w:pPr>
+        <w:pStyle w:val="TM2"/>
+        <w:tabs>
+          <w:tab w:val="right" w:leader="underscore" w:pos="9062"/>
+        </w:tabs>
+        <w:rPr>
+          <w:rFonts w:eastAsiaTheme="minorEastAsia"/>
+          <w:b w:val="0"/>
+          <w:bCs w:val="0"/>
+          <w:noProof/>
+          <w:sz w:val="24"/>
+          <w:szCs w:val="24"/>
+          <w:lang w:eastAsia="fr-FR"/>
+        </w:rPr>
+      </w:pPr>
+      <w:hyperlink w:anchor="_Toc218604872" w:history="1">
+        <w:r>
+          <w:rPr>
+            <w:rStyle w:val="Lienhypertexte"/>
+            <w:noProof/>
+          </w:rPr>
+          <w:t>L'héritage du modèle étendu est utilisé dans une vue (affichage d'un champ parent ou modification d'une des vues du modèle parent)</w:t>
+        </w:r>
+        <w:r>
+          <w:rPr>
+            <w:noProof/>
+            <w:webHidden/>
+          </w:rPr>
+          <w:tab/>
+        </w:r>
+        <w:r>
+          <w:rPr>
+            <w:noProof/>
+            <w:webHidden/>
+          </w:rPr>
+          <w:fldChar w:fldCharType="begin"/>
+        </w:r>
+        <w:r>
+          <w:rPr>
+            <w:noProof/>
+            <w:webHidden/>
+          </w:rPr>
+          <w:instrText xml:space="preserve"> PAGEREF _Toc218604872 \h </w:instrText>
+        </w:r>
+        <w:r>
+          <w:rPr>
+            <w:noProof/>
+            <w:webHidden/>
+          </w:rPr>
+        </w:r>
+        <w:r>
+          <w:rPr>
+            <w:noProof/>
+            <w:webHidden/>
+          </w:rPr>
+          <w:fldChar w:fldCharType="separate"/>
+        </w:r>
+        <w:r>
+          <w:rPr>
+            <w:noProof/>
+            <w:webHidden/>
+          </w:rPr>
+          <w:t>11</w:t>
+        </w:r>
+        <w:r>
+          <w:rPr>
+            <w:noProof/>
+            <w:webHidden/>
+          </w:rPr>
+          <w:fldChar w:fldCharType="end"/>
+        </w:r>
+      </w:hyperlink>
+    </w:p>
+    <w:p>
+      <w:pPr>
+        <w:pStyle w:val="TM2"/>
+        <w:tabs>
+          <w:tab w:val="right" w:leader="underscore" w:pos="9062"/>
+        </w:tabs>
+        <w:rPr>
+          <w:rFonts w:eastAsiaTheme="minorEastAsia"/>
+          <w:b w:val="0"/>
+          <w:bCs w:val="0"/>
+          <w:noProof/>
+          <w:sz w:val="24"/>
+          <w:szCs w:val="24"/>
+          <w:lang w:eastAsia="fr-FR"/>
+        </w:rPr>
+      </w:pPr>
+      <w:hyperlink w:anchor="_Toc218604873" w:history="1">
+        <w:r>
+          <w:rPr>
+            <w:rStyle w:val="Lienhypertexte"/>
             <w:noProof/>
           </w:rPr>
           <w:t>Un ou plusieurs champs ne sont visibles que pour un groupe d'utilisateur ou en fonction de la valeur d'un autre champ.</w:t>
         </w:r>
         <w:r>
           <w:rPr>
-            <w:b w:val="0"/>
-            <w:bCs w:val="0"/>
             <w:noProof/>
             <w:webHidden/>
           </w:rPr>
@@ -2023,8 +1985,6 @@
         </w:r>
         <w:r>
           <w:rPr>
-            <w:b w:val="0"/>
-            <w:bCs w:val="0"/>
             <w:noProof/>
             <w:webHidden/>
           </w:rPr>
@@ -2032,25 +1992,19 @@
         </w:r>
         <w:r>
           <w:rPr>
-            <w:b w:val="0"/>
-            <w:bCs w:val="0"/>
-            <w:noProof/>
-            <w:webHidden/>
-          </w:rPr>
-          <w:instrText xml:space="preserve"> PAGEREF _Toc215649300 \h </w:instrText>
-        </w:r>
-        <w:r>
-          <w:rPr>
-            <w:b w:val="0"/>
-            <w:bCs w:val="0"/>
-            <w:noProof/>
-            <w:webHidden/>
-          </w:rPr>
-        </w:r>
-        <w:r>
-          <w:rPr>
-            <w:b w:val="0"/>
-            <w:bCs w:val="0"/>
+            <w:noProof/>
+            <w:webHidden/>
+          </w:rPr>
+          <w:instrText xml:space="preserve"> PAGEREF _Toc218604873 \h </w:instrText>
+        </w:r>
+        <w:r>
+          <w:rPr>
+            <w:noProof/>
+            <w:webHidden/>
+          </w:rPr>
+        </w:r>
+        <w:r>
+          <w:rPr>
             <w:noProof/>
             <w:webHidden/>
           </w:rPr>
@@ -2058,17 +2012,13 @@
         </w:r>
         <w:r>
           <w:rPr>
-            <w:b w:val="0"/>
-            <w:bCs w:val="0"/>
-            <w:noProof/>
-            <w:webHidden/>
-          </w:rPr>
-          <w:t>5</w:t>
-        </w:r>
-        <w:r>
-          <w:rPr>
-            <w:b w:val="0"/>
-            <w:bCs w:val="0"/>
+            <w:noProof/>
+            <w:webHidden/>
+          </w:rPr>
+          <w:t>11</w:t>
+        </w:r>
+        <w:r>
+          <w:rPr>
             <w:noProof/>
             <w:webHidden/>
           </w:rPr>
@@ -2084,6 +2034,7 @@
     <w:p/>
     <w:p>
       <w:r>
+        <w:lastRenderedPageBreak/>
         <w:br w:type="page"/>
       </w:r>
     </w:p>
@@ -2092,7 +2043,7 @@
         <w:pStyle w:val="Titre1"/>
       </w:pPr>
       <w:bookmarkStart w:id="0" w:name="_Toc215649236"/>
-      <w:bookmarkStart w:id="1" w:name="_Toc215649282"/>
+      <w:bookmarkStart w:id="1" w:name="_Toc218604851"/>
       <w:r>
         <w:lastRenderedPageBreak/>
         <w:t>Mise en place et Environnement</w:t>
@@ -2145,7 +2096,17 @@
       </w:r>
       <w:r>
         <w:tab/>
-        <w:t xml:space="preserve">Une fois cela fait, attendez quelques secondes le temps que les conteneurs démarrent correctement, et rendez vous sur le lien </w:t>
+        <w:t xml:space="preserve">Une fois cela fait, </w:t>
+      </w:r>
+      <w:r>
+        <w:rPr>
+          <w:b/>
+          <w:bCs/>
+        </w:rPr>
+        <w:t>attendez quelques secondes</w:t>
+      </w:r>
+      <w:r>
+        <w:t xml:space="preserve"> le temps que les conteneurs démarrent correctement, et rendez vous sur le lien </w:t>
       </w:r>
       <w:hyperlink r:id="rId10" w:history="1">
         <w:r>
@@ -2154,7 +2115,23 @@
             <w:b/>
             <w:bCs/>
           </w:rPr>
-          <w:t>http://localhost:8069</w:t>
+          <w:t>http:</w:t>
+        </w:r>
+        <w:r>
+          <w:rPr>
+            <w:rStyle w:val="Lienhypertexte"/>
+            <w:b/>
+            <w:bCs/>
+          </w:rPr>
+          <w:t>/</w:t>
+        </w:r>
+        <w:r>
+          <w:rPr>
+            <w:rStyle w:val="Lienhypertexte"/>
+            <w:b/>
+            <w:bCs/>
+          </w:rPr>
+          <w:t>/localhost:8069</w:t>
         </w:r>
       </w:hyperlink>
       <w:r>
@@ -2255,19 +2232,39 @@
         <w:tab/>
         <w:t xml:space="preserve">Une fois la Base de </w:t>
       </w:r>
-      <w:proofErr w:type="gramStart"/>
-      <w:r>
-        <w:t>donnée créée</w:t>
-      </w:r>
-      <w:proofErr w:type="gramEnd"/>
-      <w:r>
-        <w:t xml:space="preserve">, connectez vous a votre compte avec comme utilisateur « admin » et </w:t>
-      </w:r>
-      <w:proofErr w:type="spellStart"/>
-      <w:r>
-        <w:t>mdp</w:t>
-      </w:r>
-      <w:proofErr w:type="spellEnd"/>
+      <w:r>
+        <w:t>données créée</w:t>
+      </w:r>
+      <w:r>
+        <w:t xml:space="preserve">, </w:t>
+      </w:r>
+      <w:r>
+        <w:t>connectez-vous</w:t>
+      </w:r>
+      <w:r>
+        <w:t xml:space="preserve"> </w:t>
+      </w:r>
+      <w:r>
+        <w:t>à</w:t>
+      </w:r>
+      <w:r>
+        <w:t xml:space="preserve"> votre compte avec comme utilisateur « admin » et m</w:t>
+      </w:r>
+      <w:r>
+        <w:t xml:space="preserve">ot </w:t>
+      </w:r>
+      <w:r>
+        <w:t>d</w:t>
+      </w:r>
+      <w:r>
+        <w:t xml:space="preserve">e </w:t>
+      </w:r>
+      <w:r>
+        <w:t>p</w:t>
+      </w:r>
+      <w:r>
+        <w:t>asse</w:t>
+      </w:r>
       <w:r>
         <w:t xml:space="preserve"> « admin ». </w:t>
       </w:r>
@@ -2299,69 +2296,68 @@
         <w:t xml:space="preserve">, </w:t>
       </w:r>
       <w:r>
+        <w:t>Contacts</w:t>
+      </w:r>
+      <w:r>
+        <w:t xml:space="preserve">, et évidement </w:t>
+      </w:r>
+      <w:proofErr w:type="spellStart"/>
+      <w:r>
+        <w:t>Cyberware</w:t>
+      </w:r>
+      <w:proofErr w:type="spellEnd"/>
+      <w:r>
+        <w:t xml:space="preserve">. </w:t>
+      </w:r>
+    </w:p>
+    <w:p>
+      <w:pPr>
+        <w:pStyle w:val="Titre1"/>
+      </w:pPr>
+      <w:bookmarkStart w:id="2" w:name="_Toc215649237"/>
+      <w:bookmarkStart w:id="3" w:name="_Toc218604852"/>
+      <w:r>
+        <w:lastRenderedPageBreak/>
+        <w:t>Groupe de sécurité</w:t>
+      </w:r>
+      <w:bookmarkEnd w:id="2"/>
+      <w:bookmarkEnd w:id="3"/>
+    </w:p>
+    <w:p>
+      <w:pPr>
+        <w:pStyle w:val="Titre2"/>
+      </w:pPr>
+      <w:bookmarkStart w:id="4" w:name="_Toc215649238"/>
+      <w:bookmarkStart w:id="5" w:name="_Toc218604853"/>
+      <w:r>
+        <w:t>Il y a aux moins deux groupes de sécurité</w:t>
+      </w:r>
+      <w:bookmarkEnd w:id="4"/>
+      <w:bookmarkEnd w:id="5"/>
+    </w:p>
+    <w:p>
+      <w:r>
+        <w:tab/>
+        <w:t xml:space="preserve">Mes deux groupes de sécurité sont définis dans mon fichier </w:t>
+      </w:r>
+      <w:proofErr w:type="spellStart"/>
+      <w:r>
         <w:rPr>
           <w:b/>
           <w:bCs/>
         </w:rPr>
-        <w:t>Contacts</w:t>
-      </w:r>
-      <w:r>
-        <w:t xml:space="preserve">. </w:t>
-      </w:r>
-    </w:p>
-    <w:p>
-      <w:pPr>
-        <w:pStyle w:val="Titre1"/>
-      </w:pPr>
-      <w:bookmarkStart w:id="2" w:name="_Toc215649237"/>
-      <w:bookmarkStart w:id="3" w:name="_Toc215649283"/>
-      <w:r>
-        <w:lastRenderedPageBreak/>
-        <w:t>Groupe de sécurité</w:t>
-      </w:r>
-      <w:bookmarkEnd w:id="2"/>
-      <w:bookmarkEnd w:id="3"/>
-    </w:p>
-    <w:p>
-      <w:pPr>
-        <w:pStyle w:val="Titre2"/>
-      </w:pPr>
-      <w:bookmarkStart w:id="4" w:name="_Toc215649238"/>
-      <w:bookmarkStart w:id="5" w:name="_Toc215649284"/>
-      <w:r>
-        <w:t>Il y a aux moins deux groupes de sécurité</w:t>
-      </w:r>
-      <w:bookmarkEnd w:id="4"/>
-      <w:bookmarkEnd w:id="5"/>
-    </w:p>
-    <w:p>
-      <w:r>
-        <w:tab/>
-        <w:t xml:space="preserve">Mes deux groupes de sécurité sont définis dans mon fichier </w:t>
-      </w:r>
-      <w:proofErr w:type="spellStart"/>
+        <w:t>security</w:t>
+      </w:r>
+      <w:proofErr w:type="spellEnd"/>
       <w:r>
         <w:rPr>
           <w:b/>
           <w:bCs/>
         </w:rPr>
-        <w:t>security</w:t>
-      </w:r>
-      <w:proofErr w:type="spellEnd"/>
-      <w:r>
-        <w:rPr>
-          <w:b/>
-          <w:bCs/>
-        </w:rPr>
         <w:t>/cyberware_security.xml</w:t>
       </w:r>
       <w:r>
-        <w:t>.</w:t>
-      </w:r>
-    </w:p>
-    <w:p>
-      <w:r>
-        <w:t>Dans ce fichier, deux groupes de sécurité sont définis :</w:t>
+        <w:t> :</w:t>
       </w:r>
     </w:p>
     <w:p>
@@ -2516,7 +2512,7 @@
         <w:pStyle w:val="Titre2"/>
       </w:pPr>
       <w:bookmarkStart w:id="6" w:name="_Toc215649239"/>
-      <w:bookmarkStart w:id="7" w:name="_Toc215649285"/>
+      <w:bookmarkStart w:id="7" w:name="_Toc218604854"/>
       <w:r>
         <w:t>Des droits d'accès différents aux modèles ont été accordés aux groupes de sécurité</w:t>
       </w:r>
@@ -2617,7 +2613,7 @@
         <w:pStyle w:val="Titre1"/>
       </w:pPr>
       <w:bookmarkStart w:id="8" w:name="_Toc215649240"/>
-      <w:bookmarkStart w:id="9" w:name="_Toc215649286"/>
+      <w:bookmarkStart w:id="9" w:name="_Toc218604855"/>
       <w:r>
         <w:lastRenderedPageBreak/>
         <w:t>Modèles</w:t>
@@ -2630,7 +2626,7 @@
         <w:pStyle w:val="Titre2"/>
       </w:pPr>
       <w:bookmarkStart w:id="10" w:name="_Toc215649241"/>
-      <w:bookmarkStart w:id="11" w:name="_Toc215649287"/>
+      <w:bookmarkStart w:id="11" w:name="_Toc218604856"/>
       <w:r>
         <w:t>Il y a plusieurs modèles.</w:t>
       </w:r>
@@ -2642,7 +2638,17 @@
         <w:ind w:firstLine="708"/>
       </w:pPr>
       <w:r>
-        <w:t xml:space="preserve">L'architecture des données du module a été construite autour de plusieurs entités distinctes, définies dans le dossier models/. Le cœur du système repose sur le modèle </w:t>
+        <w:t xml:space="preserve">L'architecture des données du module a été construite autour de plusieurs entités distinctes, définies dans le dossier </w:t>
+      </w:r>
+      <w:r>
+        <w:rPr>
+          <w:i/>
+          <w:iCs/>
+        </w:rPr>
+        <w:t>models/</w:t>
+      </w:r>
+      <w:r>
+        <w:t xml:space="preserve">. Le cœur du système repose sur le modèle </w:t>
       </w:r>
       <w:proofErr w:type="gramStart"/>
       <w:r>
@@ -2704,24 +2710,30 @@
         <w:pStyle w:val="Titre2"/>
       </w:pPr>
       <w:bookmarkStart w:id="12" w:name="_Toc215649242"/>
-      <w:bookmarkStart w:id="13" w:name="_Toc215649288"/>
-      <w:r>
-        <w:t>Il y a dans au moins un modèle un champ textuel, un champ numérique, un champ date un champ image</w:t>
+      <w:bookmarkStart w:id="13" w:name="_Toc218604857"/>
+      <w:r>
+        <w:t>Il y a dans au moins un modèle un champ textuel, un champ numérique, un champ date</w:t>
       </w:r>
       <w:r>
         <w:t>,</w:t>
       </w:r>
       <w:r>
+        <w:t xml:space="preserve"> un champ image</w:t>
+      </w:r>
+      <w:r>
+        <w:t>,</w:t>
+      </w:r>
+      <w:r>
         <w:t xml:space="preserve"> un champ select</w:t>
       </w:r>
       <w:bookmarkEnd w:id="12"/>
+      <w:r>
+        <w:t xml:space="preserve">, </w:t>
+      </w:r>
+      <w:r>
+        <w:t>un champ calculé et un champ related.</w:t>
+      </w:r>
       <w:bookmarkEnd w:id="13"/>
-      <w:r>
-        <w:t xml:space="preserve">, </w:t>
-      </w:r>
-      <w:r>
-        <w:t>un champ calculé et un champ related.</w:t>
-      </w:r>
     </w:p>
     <w:p>
       <w:r>
@@ -2745,12 +2757,7 @@
         <w:t>models/cyberware_client.py</w:t>
       </w:r>
       <w:r>
-        <w:t>) pour offrir une fiche patient complète.</w:t>
-      </w:r>
-    </w:p>
-    <w:p>
-      <w:r>
-        <w:t>On y trouve :</w:t>
+        <w:t>) :</w:t>
       </w:r>
     </w:p>
     <w:p>
@@ -2976,7 +2983,7 @@
         <w:pStyle w:val="Titre2"/>
       </w:pPr>
       <w:bookmarkStart w:id="14" w:name="_Toc215649243"/>
-      <w:bookmarkStart w:id="15" w:name="_Toc215649289"/>
+      <w:bookmarkStart w:id="15" w:name="_Toc218604858"/>
       <w:r>
         <w:t>Il y a au moins dans un modèle une méthode qui contrôle des données.</w:t>
       </w:r>
@@ -3045,27 +3052,27 @@
       </w:r>
       <w:proofErr w:type="gramEnd"/>
       <w:r>
-        <w:t xml:space="preserve">. Cette méthode est automatiquement exécutée à chaque création ou modification d'un implant. Elle vérifie spécifiquement que les </w:t>
+        <w:t xml:space="preserve">. Cette méthode est automatiquement exécutée à chaque création ou modification d'un implant. Elle vérifie spécifiquement que les champs </w:t>
+      </w:r>
+      <w:proofErr w:type="spellStart"/>
+      <w:r>
+        <w:t>prix_euro</w:t>
+      </w:r>
+      <w:proofErr w:type="spellEnd"/>
+      <w:r>
+        <w:t xml:space="preserve"> et </w:t>
+      </w:r>
+      <w:proofErr w:type="spellStart"/>
+      <w:r>
+        <w:t>cout_essence</w:t>
+      </w:r>
+      <w:proofErr w:type="spellEnd"/>
+      <w:r>
+        <w:t xml:space="preserve"> ne contiennent pas de valeurs négatives. Si cette règle est enfreinte, le système interrompt l'opération de sauvegarde et déclenche une </w:t>
       </w:r>
       <w:r>
         <w:lastRenderedPageBreak/>
-        <w:t xml:space="preserve">champs </w:t>
-      </w:r>
-      <w:proofErr w:type="spellStart"/>
-      <w:r>
-        <w:t>prix_euro</w:t>
-      </w:r>
-      <w:proofErr w:type="spellEnd"/>
-      <w:r>
-        <w:t xml:space="preserve"> et </w:t>
-      </w:r>
-      <w:proofErr w:type="spellStart"/>
-      <w:r>
-        <w:t>cout_essence</w:t>
-      </w:r>
-      <w:proofErr w:type="spellEnd"/>
-      <w:r>
-        <w:t xml:space="preserve"> ne contiennent pas de valeurs négatives. Si cette règle est enfreinte, le système interrompt l'opération de sauvegarde et déclenche une exception </w:t>
+        <w:t xml:space="preserve">exception </w:t>
       </w:r>
       <w:proofErr w:type="spellStart"/>
       <w:r>
@@ -3078,10 +3085,49 @@
     </w:p>
     <w:p>
       <w:pPr>
+        <w:ind w:firstLine="708"/>
+      </w:pPr>
+      <w:r>
+        <w:t xml:space="preserve">Vous pouvez tester le fonctionnement ce cette fonctionnalité depuis n’importe quel </w:t>
+      </w:r>
+      <w:proofErr w:type="spellStart"/>
+      <w:r>
+        <w:t>cyberware</w:t>
+      </w:r>
+      <w:proofErr w:type="spellEnd"/>
+      <w:r>
+        <w:t xml:space="preserve"> (ex : </w:t>
+      </w:r>
+      <w:hyperlink r:id="rId12" w:history="1">
+        <w:r>
+          <w:rPr>
+            <w:rStyle w:val="Lienhypertexte"/>
+          </w:rPr>
+          <w:t>http://localhost:</w:t>
+        </w:r>
+        <w:r>
+          <w:rPr>
+            <w:rStyle w:val="Lienhypertexte"/>
+          </w:rPr>
+          <w:t>8</w:t>
+        </w:r>
+        <w:r>
+          <w:rPr>
+            <w:rStyle w:val="Lienhypertexte"/>
+          </w:rPr>
+          <w:t>069/odoo/action-480/13</w:t>
+        </w:r>
+      </w:hyperlink>
+      <w:r>
+        <w:t xml:space="preserve">), en faisant une modification « interdite » puis en enregistrant. </w:t>
+      </w:r>
+    </w:p>
+    <w:p>
+      <w:pPr>
         <w:pStyle w:val="Titre2"/>
       </w:pPr>
       <w:bookmarkStart w:id="16" w:name="_Toc215649244"/>
-      <w:bookmarkStart w:id="17" w:name="_Toc215649290"/>
+      <w:bookmarkStart w:id="17" w:name="_Toc218604859"/>
       <w:r>
         <w:t>Il existe au moins une relation un à plusieurs et une relation plusieurs à plusieurs.</w:t>
       </w:r>
@@ -3096,27 +3142,19 @@
         <w:t>J'ai intégré les deux types de relations requises</w:t>
       </w:r>
       <w:r>
-        <w:t xml:space="preserve"> dans </w:t>
-      </w:r>
+        <w:t xml:space="preserve"> dans plusieurs de mes modèles, mais celui que je vais prendre en exemple est le </w:t>
+      </w:r>
+      <w:r>
+        <w:t xml:space="preserve">modèle </w:t>
+      </w:r>
+      <w:proofErr w:type="spellStart"/>
       <w:proofErr w:type="gramStart"/>
       <w:r>
-        <w:t>plusieurs  de</w:t>
-      </w:r>
+        <w:t>cyberware.client</w:t>
+      </w:r>
+      <w:proofErr w:type="spellEnd"/>
       <w:proofErr w:type="gramEnd"/>
       <w:r>
-        <w:t xml:space="preserve"> mes modèles, mais celui que je vais prendre en exemple est le </w:t>
-      </w:r>
-      <w:r>
-        <w:t xml:space="preserve">modèle </w:t>
-      </w:r>
-      <w:proofErr w:type="spellStart"/>
-      <w:proofErr w:type="gramStart"/>
-      <w:r>
-        <w:t>cyberware.client</w:t>
-      </w:r>
-      <w:proofErr w:type="spellEnd"/>
-      <w:proofErr w:type="gramEnd"/>
-      <w:r>
         <w:t xml:space="preserve"> (fichier cyberware_client.py).</w:t>
       </w:r>
     </w:p>
@@ -3124,9 +3162,11 @@
       <w:pPr>
         <w:pStyle w:val="Titre3"/>
       </w:pPr>
+      <w:bookmarkStart w:id="18" w:name="_Toc218604860"/>
       <w:r>
         <w:t>Relation "Un à Plusieurs"</w:t>
       </w:r>
+      <w:bookmarkEnd w:id="18"/>
     </w:p>
     <w:p>
       <w:pPr>
@@ -3155,9 +3195,11 @@
       <w:pPr>
         <w:pStyle w:val="Titre3"/>
       </w:pPr>
+      <w:bookmarkStart w:id="19" w:name="_Toc218604861"/>
       <w:r>
         <w:t>Relation "Plusieurs à Plusieurs"</w:t>
       </w:r>
+      <w:bookmarkEnd w:id="19"/>
     </w:p>
     <w:p>
       <w:pPr>
@@ -3183,13 +3225,13 @@
       <w:pPr>
         <w:pStyle w:val="Titre2"/>
       </w:pPr>
-      <w:bookmarkStart w:id="18" w:name="_Toc215649245"/>
-      <w:bookmarkStart w:id="19" w:name="_Toc215649291"/>
+      <w:bookmarkStart w:id="20" w:name="_Toc215649245"/>
+      <w:bookmarkStart w:id="21" w:name="_Toc218604862"/>
       <w:r>
         <w:t>Il existe des données de démo au format xml. Certains enregistrements sont liés par les relations d'autres non.</w:t>
       </w:r>
-      <w:bookmarkEnd w:id="18"/>
-      <w:bookmarkEnd w:id="19"/>
+      <w:bookmarkEnd w:id="20"/>
+      <w:bookmarkEnd w:id="21"/>
     </w:p>
     <w:p>
       <w:pPr>
@@ -3281,13 +3323,14 @@
       <w:pPr>
         <w:pStyle w:val="Titre2"/>
       </w:pPr>
-      <w:bookmarkStart w:id="20" w:name="_Toc215649246"/>
-      <w:bookmarkStart w:id="21" w:name="_Toc215649292"/>
-      <w:r>
+      <w:bookmarkStart w:id="22" w:name="_Toc215649246"/>
+      <w:bookmarkStart w:id="23" w:name="_Toc218604863"/>
+      <w:r>
+        <w:lastRenderedPageBreak/>
         <w:t>Un des modèles étend un modèle d’Odoo.</w:t>
       </w:r>
-      <w:bookmarkEnd w:id="20"/>
-      <w:bookmarkEnd w:id="21"/>
+      <w:bookmarkEnd w:id="22"/>
+      <w:bookmarkEnd w:id="23"/>
     </w:p>
     <w:p>
       <w:pPr>
@@ -3297,11 +3340,7 @@
         <w:t>J'ai choisi d'intégrer certaines fonctionnalités du module directement sur les fiches de contact existantes dans Odoo plutôt que de recréer une entité de personne</w:t>
       </w:r>
       <w:r>
-        <w:t xml:space="preserve"> </w:t>
-      </w:r>
-      <w:r>
-        <w:lastRenderedPageBreak/>
-        <w:t>(c’est pour cela qu’il fallait activer le module Contacts au début)</w:t>
+        <w:t xml:space="preserve"> (c’est pour cela qu’il fallait activer le module Contacts au début)</w:t>
       </w:r>
       <w:r>
         <w:t xml:space="preserve">. Pour cela, j'ai utilisé l'héritage dans le fichier </w:t>
@@ -3317,7 +3356,6 @@
         <w:t>.</w:t>
       </w:r>
     </w:p>
-    <w:p/>
     <w:p>
       <w:pPr>
         <w:ind w:firstLine="708"/>
@@ -3361,37 +3399,31 @@
       </w:r>
     </w:p>
     <w:p>
-      <w:r>
-        <w:br w:type="page"/>
-      </w:r>
-    </w:p>
-    <w:p>
       <w:pPr>
         <w:pStyle w:val="Titre1"/>
       </w:pPr>
-      <w:bookmarkStart w:id="22" w:name="_Toc215649247"/>
-      <w:bookmarkStart w:id="23" w:name="_Toc215649293"/>
-      <w:r>
-        <w:lastRenderedPageBreak/>
+      <w:bookmarkStart w:id="24" w:name="_Toc215649247"/>
+      <w:bookmarkStart w:id="25" w:name="_Toc218604864"/>
+      <w:r>
         <w:t>Vues</w:t>
-      </w:r>
-      <w:bookmarkEnd w:id="22"/>
-      <w:bookmarkEnd w:id="23"/>
-    </w:p>
-    <w:p>
-      <w:pPr>
-        <w:pStyle w:val="Titre2"/>
-      </w:pPr>
-      <w:bookmarkStart w:id="24" w:name="_Toc215649248"/>
-      <w:bookmarkStart w:id="25" w:name="_Toc215649294"/>
-      <w:r>
-        <w:t>Il existe une vue liste personnalisée.</w:t>
       </w:r>
       <w:bookmarkEnd w:id="24"/>
       <w:bookmarkEnd w:id="25"/>
     </w:p>
     <w:p>
       <w:pPr>
+        <w:pStyle w:val="Titre2"/>
+      </w:pPr>
+      <w:bookmarkStart w:id="26" w:name="_Toc215649248"/>
+      <w:bookmarkStart w:id="27" w:name="_Toc218604865"/>
+      <w:r>
+        <w:t>Il existe une vue liste personnalisée.</w:t>
+      </w:r>
+      <w:bookmarkEnd w:id="26"/>
+      <w:bookmarkEnd w:id="27"/>
+    </w:p>
+    <w:p>
+      <w:pPr>
         <w:ind w:firstLine="708"/>
       </w:pPr>
       <w:r>
@@ -3422,16 +3454,14 @@
       </w:r>
       <w:proofErr w:type="spellEnd"/>
       <w:r>
-        <w:t xml:space="preserve">, est celle qui s'affiche par défaut lorsque l'utilisateur accède au menu des implants. Pour y accéder sur le site, il suffit de naviguer via l'URL </w:t>
-      </w:r>
-      <w:hyperlink r:id="rId12" w:history="1">
+        <w:t xml:space="preserve">. Pour y accéder sur le site, il suffit de naviguer via l'URL </w:t>
+      </w:r>
+      <w:hyperlink r:id="rId13" w:history="1">
         <w:r>
           <w:rPr>
             <w:rStyle w:val="Lienhypertexte"/>
-            <w:b/>
-            <w:bCs/>
-          </w:rPr>
-          <w:t>http://localhost:8069/odoo/action-89?view_type=list</w:t>
+          </w:rPr>
+          <w:t>http://localhost:8069/odoo/action-480?view_type=list</w:t>
         </w:r>
       </w:hyperlink>
       <w:r>
@@ -3458,13 +3488,13 @@
       <w:pPr>
         <w:pStyle w:val="Titre2"/>
       </w:pPr>
-      <w:bookmarkStart w:id="26" w:name="_Toc215649249"/>
-      <w:bookmarkStart w:id="27" w:name="_Toc215649295"/>
+      <w:bookmarkStart w:id="28" w:name="_Toc215649249"/>
+      <w:bookmarkStart w:id="29" w:name="_Toc218604866"/>
       <w:r>
         <w:t>Il existe une vue formulaire personnalisée.</w:t>
       </w:r>
-      <w:bookmarkEnd w:id="26"/>
-      <w:bookmarkEnd w:id="27"/>
+      <w:bookmarkEnd w:id="28"/>
+      <w:bookmarkEnd w:id="29"/>
     </w:p>
     <w:p>
       <w:pPr>
@@ -3506,14 +3536,17 @@
         <w:ind w:firstLine="708"/>
       </w:pPr>
       <w:r>
-        <w:t xml:space="preserve">Accès à la vue sur le site : Cette vue est accessible en cliquant sur n'importe quel enregistrement existant depuis la vue liste. L'URL affichée par Odoo est de la forme : </w:t>
-      </w:r>
-      <w:hyperlink r:id="rId13" w:history="1">
+        <w:t>Accès à la vue sur le site : Cette vue est accessible en cliquant sur n'importe quel enregistrement existant depuis la vue liste. L'URL affichée par Odoo est de la forme :</w:t>
+      </w:r>
+      <w:r>
+        <w:t xml:space="preserve"> </w:t>
+      </w:r>
+      <w:hyperlink r:id="rId14" w:history="1">
         <w:r>
           <w:rPr>
             <w:rStyle w:val="Lienhypertexte"/>
           </w:rPr>
-          <w:t>http://localhost:8069/odoo/action-89/13</w:t>
+          <w:t>http://localhost:8069/odoo/action-480/13</w:t>
         </w:r>
       </w:hyperlink>
       <w:r>
@@ -3524,13 +3557,13 @@
       <w:pPr>
         <w:pStyle w:val="Titre2"/>
       </w:pPr>
-      <w:bookmarkStart w:id="28" w:name="_Toc215649250"/>
-      <w:bookmarkStart w:id="29" w:name="_Toc215649296"/>
+      <w:bookmarkStart w:id="30" w:name="_Toc215649250"/>
+      <w:bookmarkStart w:id="31" w:name="_Toc218604867"/>
       <w:r>
         <w:t>Il existe un champ recherche personnalisé.</w:t>
       </w:r>
-      <w:bookmarkEnd w:id="28"/>
-      <w:bookmarkEnd w:id="29"/>
+      <w:bookmarkEnd w:id="30"/>
+      <w:bookmarkEnd w:id="31"/>
     </w:p>
     <w:p>
       <w:pPr>
@@ -3572,6 +3605,7 @@
         <w:ind w:firstLine="708"/>
       </w:pPr>
       <w:r>
+        <w:lastRenderedPageBreak/>
         <w:t xml:space="preserve">Accès à la vue sur le site : La vue est accessible dans l'interface Odoo via la barre de recherche et les menus Filtres et Grouper par, qui apparaissent lorsque l'on navigue vers le menu </w:t>
       </w:r>
       <w:proofErr w:type="spellStart"/>
@@ -3582,12 +3616,12 @@
       <w:r>
         <w:t xml:space="preserve"> puis Implants (</w:t>
       </w:r>
-      <w:hyperlink r:id="rId14" w:history="1">
+      <w:hyperlink r:id="rId15" w:history="1">
         <w:r>
           <w:rPr>
             <w:rStyle w:val="Lienhypertexte"/>
           </w:rPr>
-          <w:t>http://localhost:8069/odoo/action-89</w:t>
+          <w:t>http://localhost:8069/odoo/action-480</w:t>
         </w:r>
       </w:hyperlink>
       <w:r>
@@ -3614,14 +3648,13 @@
       <w:pPr>
         <w:pStyle w:val="Titre2"/>
       </w:pPr>
-      <w:bookmarkStart w:id="30" w:name="_Toc215649251"/>
-      <w:bookmarkStart w:id="31" w:name="_Toc215649297"/>
-      <w:r>
-        <w:lastRenderedPageBreak/>
+      <w:bookmarkStart w:id="32" w:name="_Toc215649251"/>
+      <w:bookmarkStart w:id="33" w:name="_Toc218604868"/>
+      <w:r>
         <w:t>Il existe une vue calendrier ou une vue kanban.</w:t>
       </w:r>
-      <w:bookmarkEnd w:id="30"/>
-      <w:bookmarkEnd w:id="31"/>
+      <w:bookmarkEnd w:id="32"/>
+      <w:bookmarkEnd w:id="33"/>
     </w:p>
     <w:p>
       <w:r>
@@ -3694,23 +3727,23 @@
       <w:r>
         <w:t xml:space="preserve"> ces liens : </w:t>
       </w:r>
-      <w:hyperlink r:id="rId15" w:history="1">
+      <w:hyperlink r:id="rId16" w:history="1">
         <w:r>
           <w:rPr>
             <w:rStyle w:val="Lienhypertexte"/>
           </w:rPr>
-          <w:t>http://localhost:8069/odoo/action-89</w:t>
+          <w:t>http://localhost:8069/odoo/action-480</w:t>
         </w:r>
       </w:hyperlink>
       <w:r>
         <w:t xml:space="preserve">, </w:t>
       </w:r>
-      <w:hyperlink r:id="rId16" w:history="1">
+      <w:hyperlink r:id="rId17" w:history="1">
         <w:r>
           <w:rPr>
             <w:rStyle w:val="Lienhypertexte"/>
           </w:rPr>
-          <w:t>http://localhost:8069/odoo/action-90</w:t>
+          <w:t>http://localhost:8069/odoo/action-481</w:t>
         </w:r>
       </w:hyperlink>
       <w:r>
@@ -3724,13 +3757,13 @@
       <w:pPr>
         <w:pStyle w:val="Titre2"/>
       </w:pPr>
-      <w:bookmarkStart w:id="32" w:name="_Toc215649252"/>
-      <w:bookmarkStart w:id="33" w:name="_Toc215649298"/>
+      <w:bookmarkStart w:id="34" w:name="_Toc215649252"/>
+      <w:bookmarkStart w:id="35" w:name="_Toc218604869"/>
       <w:r>
         <w:t>Une page web est disponible.</w:t>
       </w:r>
-      <w:bookmarkEnd w:id="32"/>
-      <w:bookmarkEnd w:id="33"/>
+      <w:bookmarkEnd w:id="34"/>
+      <w:bookmarkEnd w:id="35"/>
     </w:p>
     <w:p>
       <w:pPr>
@@ -3825,12 +3858,24 @@
       <w:r>
         <w:t xml:space="preserve">L'interface publique est directement consultable via l'adresse </w:t>
       </w:r>
-      <w:hyperlink r:id="rId17" w:history="1">
+      <w:hyperlink r:id="rId18" w:history="1">
         <w:r>
           <w:rPr>
             <w:rStyle w:val="Lienhypertexte"/>
           </w:rPr>
-          <w:t>http://localhost:8069/cyberware/market</w:t>
+          <w:t>http://localhost:8069/cyberware/</w:t>
+        </w:r>
+        <w:r>
+          <w:rPr>
+            <w:rStyle w:val="Lienhypertexte"/>
+          </w:rPr>
+          <w:t>m</w:t>
+        </w:r>
+        <w:r>
+          <w:rPr>
+            <w:rStyle w:val="Lienhypertexte"/>
+          </w:rPr>
+          <w:t>arket</w:t>
         </w:r>
       </w:hyperlink>
       <w:r>
@@ -3879,7 +3924,7 @@
                     <pic:cNvPicPr/>
                   </pic:nvPicPr>
                   <pic:blipFill>
-                    <a:blip r:embed="rId18"/>
+                    <a:blip r:embed="rId19"/>
                     <a:stretch>
                       <a:fillRect/>
                     </a:stretch>
@@ -3934,16 +3979,17 @@
       <w:pPr>
         <w:pStyle w:val="Titre2"/>
       </w:pPr>
-      <w:bookmarkStart w:id="34" w:name="_Toc215649253"/>
-      <w:bookmarkStart w:id="35" w:name="_Toc215649299"/>
-      <w:r>
+      <w:bookmarkStart w:id="36" w:name="_Toc215649253"/>
+      <w:bookmarkStart w:id="37" w:name="_Toc218604870"/>
+      <w:r>
+        <w:lastRenderedPageBreak/>
         <w:t>D</w:t>
       </w:r>
-      <w:bookmarkEnd w:id="34"/>
-      <w:bookmarkEnd w:id="35"/>
+      <w:bookmarkEnd w:id="36"/>
       <w:r>
         <w:t>ans une des vues on trouve au moins un exemplaire de tous les champs exigés dans les consignes sur les modèles.</w:t>
       </w:r>
+      <w:bookmarkEnd w:id="37"/>
     </w:p>
     <w:p>
       <w:pPr>
@@ -3994,12 +4040,24 @@
       <w:r>
         <w:t xml:space="preserve">En consultant la fiche d'un client (accessible via </w:t>
       </w:r>
-      <w:hyperlink r:id="rId19" w:history="1">
+      <w:hyperlink r:id="rId20" w:history="1">
         <w:r>
           <w:rPr>
             <w:rStyle w:val="Lienhypertexte"/>
           </w:rPr>
-          <w:t>http://localhost:8069/odoo/action-90/3</w:t>
+          <w:t>http://localhos</w:t>
+        </w:r>
+        <w:r>
+          <w:rPr>
+            <w:rStyle w:val="Lienhypertexte"/>
+          </w:rPr>
+          <w:t>t</w:t>
+        </w:r>
+        <w:r>
+          <w:rPr>
+            <w:rStyle w:val="Lienhypertexte"/>
+          </w:rPr>
+          <w:t>:8069/odoo/action-481/3</w:t>
         </w:r>
       </w:hyperlink>
       <w:r>
@@ -4035,7 +4093,6 @@
         </w:numPr>
       </w:pPr>
       <w:r>
-        <w:lastRenderedPageBreak/>
         <w:t>Un champ Date (</w:t>
       </w:r>
       <w:proofErr w:type="spellStart"/>
@@ -4171,9 +4228,11 @@
       <w:pPr>
         <w:pStyle w:val="Titre2"/>
       </w:pPr>
+      <w:bookmarkStart w:id="38" w:name="_Toc218604871"/>
       <w:r>
         <w:t>Un bouton permet d'exécuter la méthode qui contrôle les données</w:t>
       </w:r>
+      <w:bookmarkEnd w:id="38"/>
     </w:p>
     <w:p>
       <w:r>
@@ -4221,12 +4280,24 @@
       <w:r>
         <w:t xml:space="preserve">lien </w:t>
       </w:r>
-      <w:hyperlink r:id="rId20" w:history="1">
+      <w:hyperlink r:id="rId21" w:history="1">
         <w:r>
           <w:rPr>
             <w:rStyle w:val="Lienhypertexte"/>
           </w:rPr>
-          <w:t>http://localhost:8069/odoo/action-486/3</w:t>
+          <w:t>http://localhost:8069/odoo/action-4</w:t>
+        </w:r>
+        <w:r>
+          <w:rPr>
+            <w:rStyle w:val="Lienhypertexte"/>
+          </w:rPr>
+          <w:t>8</w:t>
+        </w:r>
+        <w:r>
+          <w:rPr>
+            <w:rStyle w:val="Lienhypertexte"/>
+          </w:rPr>
+          <w:t>6/3</w:t>
         </w:r>
       </w:hyperlink>
       <w:r>
@@ -4255,9 +4326,11 @@
       <w:pPr>
         <w:pStyle w:val="Titre2"/>
       </w:pPr>
+      <w:bookmarkStart w:id="39" w:name="_Toc218604872"/>
       <w:r>
         <w:t>L'héritage du modèle étendu est utilisé dans une vue (affichage d'un champ parent ou modification d'une des vues du modèle parent)</w:t>
       </w:r>
+      <w:bookmarkEnd w:id="39"/>
     </w:p>
     <w:p>
       <w:r>
@@ -4378,9 +4451,10 @@
     </w:p>
     <w:p>
       <w:r>
+        <w:lastRenderedPageBreak/>
         <w:t xml:space="preserve">Cette extension est visible pour n’importe quel contact (ex : </w:t>
       </w:r>
-      <w:hyperlink r:id="rId21" w:history="1">
+      <w:hyperlink r:id="rId22" w:history="1">
         <w:r>
           <w:rPr>
             <w:rStyle w:val="Lienhypertexte"/>
@@ -4396,13 +4470,13 @@
       <w:pPr>
         <w:pStyle w:val="Titre2"/>
       </w:pPr>
-      <w:bookmarkStart w:id="36" w:name="_Toc215649254"/>
-      <w:bookmarkStart w:id="37" w:name="_Toc215649300"/>
+      <w:bookmarkStart w:id="40" w:name="_Toc215649254"/>
+      <w:bookmarkStart w:id="41" w:name="_Toc218604873"/>
       <w:r>
         <w:t>Un ou plusieurs champs ne sont visibles que pour un groupe d'utilisateur ou en fonction de la valeur d'un autre champ.</w:t>
       </w:r>
-      <w:bookmarkEnd w:id="36"/>
-      <w:bookmarkEnd w:id="37"/>
+      <w:bookmarkEnd w:id="40"/>
+      <w:bookmarkEnd w:id="41"/>
     </w:p>
     <w:p>
       <w:r>
@@ -4481,20 +4555,16 @@
       </w:r>
       <w:proofErr w:type="gramEnd"/>
       <w:r>
+        <w:t xml:space="preserve"> Ainsi, ce champ n'apparaît à l'utilisateur que si la case Est </w:t>
+      </w:r>
+      <w:proofErr w:type="gramStart"/>
+      <w:r>
+        <w:t>un</w:t>
+      </w:r>
+      <w:proofErr w:type="gramEnd"/>
+      <w:r>
         <w:t xml:space="preserve"> </w:t>
       </w:r>
-      <w:r>
-        <w:lastRenderedPageBreak/>
-        <w:t xml:space="preserve">Ainsi, ce champ n'apparaît à l'utilisateur que si la case Est </w:t>
-      </w:r>
-      <w:proofErr w:type="gramStart"/>
-      <w:r>
-        <w:t>un</w:t>
-      </w:r>
-      <w:proofErr w:type="gramEnd"/>
-      <w:r>
-        <w:t xml:space="preserve"> </w:t>
-      </w:r>
       <w:proofErr w:type="spellStart"/>
       <w:r>
         <w:t>Charcudoc</w:t>
@@ -4504,25 +4574,8 @@
         <w:t xml:space="preserve"> est cochée. Cela garantit que les informations spécifiques aux médecins ne sont affichées que pour les contacts qui ont effectivement ce rôle, simplifiant l'interface pour les autres contacts.</w:t>
       </w:r>
     </w:p>
-    <w:p/>
-    <w:p/>
-    <w:p>
-      <w:r>
-        <w:t>A faire : refaire les mises en page des affichages uniques</w:t>
-      </w:r>
-    </w:p>
-    <w:p>
-      <w:r>
-        <w:t>Sur la page http://localhost:8069/odoo/action-89</w:t>
-      </w:r>
-    </w:p>
-    <w:p>
-      <w:r>
-        <w:t>Faire en sorte que les images aient une taille fixe parce que là c'est moche</w:t>
-      </w:r>
-    </w:p>
     <w:sectPr>
-      <w:footerReference w:type="default" r:id="rId22"/>
+      <w:footerReference w:type="default" r:id="rId23"/>
       <w:pgSz w:w="11906" w:h="16838"/>
       <w:pgMar w:top="1417" w:right="1417" w:bottom="1417" w:left="1417" w:header="708" w:footer="708" w:gutter="0"/>
       <w:cols w:space="708"/>

</xml_diff>

<commit_message>
Jsp mais dernière sauvegarde avant fin
</commit_message>
<xml_diff>
--- a/RAPPORT.docx
+++ b/RAPPORT.docx
@@ -44,7 +44,6 @@
       <w:pPr>
         <w:jc w:val="center"/>
       </w:pPr>
-      <w:proofErr w:type="spellStart"/>
       <w:r>
         <w:rPr>
           <w:sz w:val="50"/>
@@ -52,7 +51,6 @@
         </w:rPr>
         <w:t>Cyberware</w:t>
       </w:r>
-      <w:proofErr w:type="spellEnd"/>
     </w:p>
     <w:p>
       <w:r>
@@ -308,15 +306,13 @@
       <w:pPr>
         <w:pStyle w:val="TM1"/>
         <w:rPr>
-          <w:i w:val="0"/>
-          <w:iCs w:val="0"/>
+          <w:i/>
+          <w:iCs/>
           <w:u w:val="single"/>
         </w:rPr>
       </w:pPr>
       <w:r>
         <w:rPr>
-          <w:i w:val="0"/>
-          <w:iCs w:val="0"/>
           <w:u w:val="single"/>
         </w:rPr>
         <w:lastRenderedPageBreak/>
@@ -326,10 +322,683 @@
     <w:p>
       <w:pPr>
         <w:pStyle w:val="TM1"/>
+        <w:tabs>
+          <w:tab w:val="right" w:leader="dot" w:pos="9062"/>
+        </w:tabs>
         <w:rPr>
           <w:rFonts w:eastAsiaTheme="minorEastAsia"/>
           <w:b w:val="0"/>
           <w:bCs w:val="0"/>
+          <w:caps w:val="0"/>
+          <w:noProof/>
+          <w:sz w:val="24"/>
+          <w:szCs w:val="24"/>
+          <w:lang w:eastAsia="fr-FR"/>
+        </w:rPr>
+      </w:pPr>
+      <w:r>
+        <w:fldChar w:fldCharType="begin"/>
+      </w:r>
+      <w:r>
+        <w:instrText xml:space="preserve"> TOC \o "1-3" \h \z \u </w:instrText>
+      </w:r>
+      <w:r>
+        <w:fldChar w:fldCharType="separate"/>
+      </w:r>
+      <w:hyperlink w:anchor="_Toc218839494" w:history="1">
+        <w:r>
+          <w:rPr>
+            <w:rStyle w:val="Lienhypertexte"/>
+            <w:noProof/>
+          </w:rPr>
+          <w:t>Mise en place et Environnement</w:t>
+        </w:r>
+        <w:r>
+          <w:rPr>
+            <w:noProof/>
+            <w:webHidden/>
+          </w:rPr>
+          <w:tab/>
+        </w:r>
+        <w:r>
+          <w:rPr>
+            <w:noProof/>
+            <w:webHidden/>
+          </w:rPr>
+          <w:fldChar w:fldCharType="begin"/>
+        </w:r>
+        <w:r>
+          <w:rPr>
+            <w:noProof/>
+            <w:webHidden/>
+          </w:rPr>
+          <w:instrText xml:space="preserve"> PAGEREF _Toc218839494 \h </w:instrText>
+        </w:r>
+        <w:r>
+          <w:rPr>
+            <w:noProof/>
+            <w:webHidden/>
+          </w:rPr>
+        </w:r>
+        <w:r>
+          <w:rPr>
+            <w:noProof/>
+            <w:webHidden/>
+          </w:rPr>
+          <w:fldChar w:fldCharType="separate"/>
+        </w:r>
+        <w:r>
+          <w:rPr>
+            <w:noProof/>
+            <w:webHidden/>
+          </w:rPr>
+          <w:t>3</w:t>
+        </w:r>
+        <w:r>
+          <w:rPr>
+            <w:noProof/>
+            <w:webHidden/>
+          </w:rPr>
+          <w:fldChar w:fldCharType="end"/>
+        </w:r>
+      </w:hyperlink>
+    </w:p>
+    <w:p>
+      <w:pPr>
+        <w:pStyle w:val="TM1"/>
+        <w:tabs>
+          <w:tab w:val="right" w:leader="dot" w:pos="9062"/>
+        </w:tabs>
+        <w:rPr>
+          <w:rFonts w:eastAsiaTheme="minorEastAsia"/>
+          <w:b w:val="0"/>
+          <w:bCs w:val="0"/>
+          <w:caps w:val="0"/>
+          <w:noProof/>
+          <w:sz w:val="24"/>
+          <w:szCs w:val="24"/>
+          <w:lang w:eastAsia="fr-FR"/>
+        </w:rPr>
+      </w:pPr>
+      <w:hyperlink w:anchor="_Toc218839495" w:history="1">
+        <w:r>
+          <w:rPr>
+            <w:rStyle w:val="Lienhypertexte"/>
+            <w:noProof/>
+          </w:rPr>
+          <w:t>Groupe de sécurité</w:t>
+        </w:r>
+        <w:r>
+          <w:rPr>
+            <w:noProof/>
+            <w:webHidden/>
+          </w:rPr>
+          <w:tab/>
+        </w:r>
+        <w:r>
+          <w:rPr>
+            <w:noProof/>
+            <w:webHidden/>
+          </w:rPr>
+          <w:fldChar w:fldCharType="begin"/>
+        </w:r>
+        <w:r>
+          <w:rPr>
+            <w:noProof/>
+            <w:webHidden/>
+          </w:rPr>
+          <w:instrText xml:space="preserve"> PAGEREF _Toc218839495 \h </w:instrText>
+        </w:r>
+        <w:r>
+          <w:rPr>
+            <w:noProof/>
+            <w:webHidden/>
+          </w:rPr>
+        </w:r>
+        <w:r>
+          <w:rPr>
+            <w:noProof/>
+            <w:webHidden/>
+          </w:rPr>
+          <w:fldChar w:fldCharType="separate"/>
+        </w:r>
+        <w:r>
+          <w:rPr>
+            <w:noProof/>
+            <w:webHidden/>
+          </w:rPr>
+          <w:t>4</w:t>
+        </w:r>
+        <w:r>
+          <w:rPr>
+            <w:noProof/>
+            <w:webHidden/>
+          </w:rPr>
+          <w:fldChar w:fldCharType="end"/>
+        </w:r>
+      </w:hyperlink>
+    </w:p>
+    <w:p>
+      <w:pPr>
+        <w:pStyle w:val="TM2"/>
+        <w:tabs>
+          <w:tab w:val="right" w:leader="dot" w:pos="9062"/>
+        </w:tabs>
+        <w:rPr>
+          <w:rFonts w:eastAsiaTheme="minorEastAsia"/>
+          <w:smallCaps w:val="0"/>
+          <w:noProof/>
+          <w:sz w:val="24"/>
+          <w:szCs w:val="24"/>
+          <w:lang w:eastAsia="fr-FR"/>
+        </w:rPr>
+      </w:pPr>
+      <w:hyperlink w:anchor="_Toc218839496" w:history="1">
+        <w:r>
+          <w:rPr>
+            <w:rStyle w:val="Lienhypertexte"/>
+            <w:noProof/>
+          </w:rPr>
+          <w:t>Il y a aux moins deux groupes de sécurité</w:t>
+        </w:r>
+        <w:r>
+          <w:rPr>
+            <w:noProof/>
+            <w:webHidden/>
+          </w:rPr>
+          <w:tab/>
+        </w:r>
+        <w:r>
+          <w:rPr>
+            <w:noProof/>
+            <w:webHidden/>
+          </w:rPr>
+          <w:fldChar w:fldCharType="begin"/>
+        </w:r>
+        <w:r>
+          <w:rPr>
+            <w:noProof/>
+            <w:webHidden/>
+          </w:rPr>
+          <w:instrText xml:space="preserve"> PAGEREF _Toc218839496 \h </w:instrText>
+        </w:r>
+        <w:r>
+          <w:rPr>
+            <w:noProof/>
+            <w:webHidden/>
+          </w:rPr>
+        </w:r>
+        <w:r>
+          <w:rPr>
+            <w:noProof/>
+            <w:webHidden/>
+          </w:rPr>
+          <w:fldChar w:fldCharType="separate"/>
+        </w:r>
+        <w:r>
+          <w:rPr>
+            <w:noProof/>
+            <w:webHidden/>
+          </w:rPr>
+          <w:t>4</w:t>
+        </w:r>
+        <w:r>
+          <w:rPr>
+            <w:noProof/>
+            <w:webHidden/>
+          </w:rPr>
+          <w:fldChar w:fldCharType="end"/>
+        </w:r>
+      </w:hyperlink>
+    </w:p>
+    <w:p>
+      <w:pPr>
+        <w:pStyle w:val="TM2"/>
+        <w:tabs>
+          <w:tab w:val="right" w:leader="dot" w:pos="9062"/>
+        </w:tabs>
+        <w:rPr>
+          <w:rFonts w:eastAsiaTheme="minorEastAsia"/>
+          <w:smallCaps w:val="0"/>
+          <w:noProof/>
+          <w:sz w:val="24"/>
+          <w:szCs w:val="24"/>
+          <w:lang w:eastAsia="fr-FR"/>
+        </w:rPr>
+      </w:pPr>
+      <w:hyperlink w:anchor="_Toc218839497" w:history="1">
+        <w:r>
+          <w:rPr>
+            <w:rStyle w:val="Lienhypertexte"/>
+            <w:noProof/>
+          </w:rPr>
+          <w:t>Des droits d'accès différents aux modèles ont été accordés aux groupes de sécurité</w:t>
+        </w:r>
+        <w:r>
+          <w:rPr>
+            <w:noProof/>
+            <w:webHidden/>
+          </w:rPr>
+          <w:tab/>
+        </w:r>
+        <w:r>
+          <w:rPr>
+            <w:noProof/>
+            <w:webHidden/>
+          </w:rPr>
+          <w:fldChar w:fldCharType="begin"/>
+        </w:r>
+        <w:r>
+          <w:rPr>
+            <w:noProof/>
+            <w:webHidden/>
+          </w:rPr>
+          <w:instrText xml:space="preserve"> PAGEREF _Toc218839497 \h </w:instrText>
+        </w:r>
+        <w:r>
+          <w:rPr>
+            <w:noProof/>
+            <w:webHidden/>
+          </w:rPr>
+        </w:r>
+        <w:r>
+          <w:rPr>
+            <w:noProof/>
+            <w:webHidden/>
+          </w:rPr>
+          <w:fldChar w:fldCharType="separate"/>
+        </w:r>
+        <w:r>
+          <w:rPr>
+            <w:noProof/>
+            <w:webHidden/>
+          </w:rPr>
+          <w:t>4</w:t>
+        </w:r>
+        <w:r>
+          <w:rPr>
+            <w:noProof/>
+            <w:webHidden/>
+          </w:rPr>
+          <w:fldChar w:fldCharType="end"/>
+        </w:r>
+      </w:hyperlink>
+    </w:p>
+    <w:p>
+      <w:pPr>
+        <w:pStyle w:val="TM1"/>
+        <w:tabs>
+          <w:tab w:val="right" w:leader="dot" w:pos="9062"/>
+        </w:tabs>
+        <w:rPr>
+          <w:rFonts w:eastAsiaTheme="minorEastAsia"/>
+          <w:b w:val="0"/>
+          <w:bCs w:val="0"/>
+          <w:caps w:val="0"/>
+          <w:noProof/>
+          <w:sz w:val="24"/>
+          <w:szCs w:val="24"/>
+          <w:lang w:eastAsia="fr-FR"/>
+        </w:rPr>
+      </w:pPr>
+      <w:hyperlink w:anchor="_Toc218839498" w:history="1">
+        <w:r>
+          <w:rPr>
+            <w:rStyle w:val="Lienhypertexte"/>
+            <w:noProof/>
+          </w:rPr>
+          <w:t>Modèles</w:t>
+        </w:r>
+        <w:r>
+          <w:rPr>
+            <w:noProof/>
+            <w:webHidden/>
+          </w:rPr>
+          <w:tab/>
+        </w:r>
+        <w:r>
+          <w:rPr>
+            <w:noProof/>
+            <w:webHidden/>
+          </w:rPr>
+          <w:fldChar w:fldCharType="begin"/>
+        </w:r>
+        <w:r>
+          <w:rPr>
+            <w:noProof/>
+            <w:webHidden/>
+          </w:rPr>
+          <w:instrText xml:space="preserve"> PAGEREF _Toc218839498 \h </w:instrText>
+        </w:r>
+        <w:r>
+          <w:rPr>
+            <w:noProof/>
+            <w:webHidden/>
+          </w:rPr>
+        </w:r>
+        <w:r>
+          <w:rPr>
+            <w:noProof/>
+            <w:webHidden/>
+          </w:rPr>
+          <w:fldChar w:fldCharType="separate"/>
+        </w:r>
+        <w:r>
+          <w:rPr>
+            <w:noProof/>
+            <w:webHidden/>
+          </w:rPr>
+          <w:t>5</w:t>
+        </w:r>
+        <w:r>
+          <w:rPr>
+            <w:noProof/>
+            <w:webHidden/>
+          </w:rPr>
+          <w:fldChar w:fldCharType="end"/>
+        </w:r>
+      </w:hyperlink>
+    </w:p>
+    <w:p>
+      <w:pPr>
+        <w:pStyle w:val="TM2"/>
+        <w:tabs>
+          <w:tab w:val="right" w:leader="dot" w:pos="9062"/>
+        </w:tabs>
+        <w:rPr>
+          <w:rFonts w:eastAsiaTheme="minorEastAsia"/>
+          <w:smallCaps w:val="0"/>
+          <w:noProof/>
+          <w:sz w:val="24"/>
+          <w:szCs w:val="24"/>
+          <w:lang w:eastAsia="fr-FR"/>
+        </w:rPr>
+      </w:pPr>
+      <w:hyperlink w:anchor="_Toc218839499" w:history="1">
+        <w:r>
+          <w:rPr>
+            <w:rStyle w:val="Lienhypertexte"/>
+            <w:noProof/>
+          </w:rPr>
+          <w:t>Il y a plusieurs modèles.</w:t>
+        </w:r>
+        <w:r>
+          <w:rPr>
+            <w:noProof/>
+            <w:webHidden/>
+          </w:rPr>
+          <w:tab/>
+        </w:r>
+        <w:r>
+          <w:rPr>
+            <w:noProof/>
+            <w:webHidden/>
+          </w:rPr>
+          <w:fldChar w:fldCharType="begin"/>
+        </w:r>
+        <w:r>
+          <w:rPr>
+            <w:noProof/>
+            <w:webHidden/>
+          </w:rPr>
+          <w:instrText xml:space="preserve"> PAGEREF _Toc218839499 \h </w:instrText>
+        </w:r>
+        <w:r>
+          <w:rPr>
+            <w:noProof/>
+            <w:webHidden/>
+          </w:rPr>
+        </w:r>
+        <w:r>
+          <w:rPr>
+            <w:noProof/>
+            <w:webHidden/>
+          </w:rPr>
+          <w:fldChar w:fldCharType="separate"/>
+        </w:r>
+        <w:r>
+          <w:rPr>
+            <w:noProof/>
+            <w:webHidden/>
+          </w:rPr>
+          <w:t>5</w:t>
+        </w:r>
+        <w:r>
+          <w:rPr>
+            <w:noProof/>
+            <w:webHidden/>
+          </w:rPr>
+          <w:fldChar w:fldCharType="end"/>
+        </w:r>
+      </w:hyperlink>
+    </w:p>
+    <w:p>
+      <w:pPr>
+        <w:pStyle w:val="TM2"/>
+        <w:tabs>
+          <w:tab w:val="right" w:leader="dot" w:pos="9062"/>
+        </w:tabs>
+        <w:rPr>
+          <w:rFonts w:eastAsiaTheme="minorEastAsia"/>
+          <w:smallCaps w:val="0"/>
+          <w:noProof/>
+          <w:sz w:val="24"/>
+          <w:szCs w:val="24"/>
+          <w:lang w:eastAsia="fr-FR"/>
+        </w:rPr>
+      </w:pPr>
+      <w:hyperlink w:anchor="_Toc218839500" w:history="1">
+        <w:r>
+          <w:rPr>
+            <w:rStyle w:val="Lienhypertexte"/>
+            <w:noProof/>
+          </w:rPr>
+          <w:t>Il y a dans au moins un modèle un champ textuel, un champ numérique, un champ date, un champ image, un champ select, un champ calculé et un champ related.</w:t>
+        </w:r>
+        <w:r>
+          <w:rPr>
+            <w:noProof/>
+            <w:webHidden/>
+          </w:rPr>
+          <w:tab/>
+        </w:r>
+        <w:r>
+          <w:rPr>
+            <w:noProof/>
+            <w:webHidden/>
+          </w:rPr>
+          <w:fldChar w:fldCharType="begin"/>
+        </w:r>
+        <w:r>
+          <w:rPr>
+            <w:noProof/>
+            <w:webHidden/>
+          </w:rPr>
+          <w:instrText xml:space="preserve"> PAGEREF _Toc218839500 \h </w:instrText>
+        </w:r>
+        <w:r>
+          <w:rPr>
+            <w:noProof/>
+            <w:webHidden/>
+          </w:rPr>
+        </w:r>
+        <w:r>
+          <w:rPr>
+            <w:noProof/>
+            <w:webHidden/>
+          </w:rPr>
+          <w:fldChar w:fldCharType="separate"/>
+        </w:r>
+        <w:r>
+          <w:rPr>
+            <w:noProof/>
+            <w:webHidden/>
+          </w:rPr>
+          <w:t>5</w:t>
+        </w:r>
+        <w:r>
+          <w:rPr>
+            <w:noProof/>
+            <w:webHidden/>
+          </w:rPr>
+          <w:fldChar w:fldCharType="end"/>
+        </w:r>
+      </w:hyperlink>
+    </w:p>
+    <w:p>
+      <w:pPr>
+        <w:pStyle w:val="TM2"/>
+        <w:tabs>
+          <w:tab w:val="right" w:leader="dot" w:pos="9062"/>
+        </w:tabs>
+        <w:rPr>
+          <w:rFonts w:eastAsiaTheme="minorEastAsia"/>
+          <w:smallCaps w:val="0"/>
+          <w:noProof/>
+          <w:sz w:val="24"/>
+          <w:szCs w:val="24"/>
+          <w:lang w:eastAsia="fr-FR"/>
+        </w:rPr>
+      </w:pPr>
+      <w:hyperlink w:anchor="_Toc218839501" w:history="1">
+        <w:r>
+          <w:rPr>
+            <w:rStyle w:val="Lienhypertexte"/>
+            <w:noProof/>
+          </w:rPr>
+          <w:t>Il y a au moins dans un modèle une méthode qui contrôle des données.</w:t>
+        </w:r>
+        <w:r>
+          <w:rPr>
+            <w:noProof/>
+            <w:webHidden/>
+          </w:rPr>
+          <w:tab/>
+        </w:r>
+        <w:r>
+          <w:rPr>
+            <w:noProof/>
+            <w:webHidden/>
+          </w:rPr>
+          <w:fldChar w:fldCharType="begin"/>
+        </w:r>
+        <w:r>
+          <w:rPr>
+            <w:noProof/>
+            <w:webHidden/>
+          </w:rPr>
+          <w:instrText xml:space="preserve"> PAGEREF _Toc218839501 \h </w:instrText>
+        </w:r>
+        <w:r>
+          <w:rPr>
+            <w:noProof/>
+            <w:webHidden/>
+          </w:rPr>
+        </w:r>
+        <w:r>
+          <w:rPr>
+            <w:noProof/>
+            <w:webHidden/>
+          </w:rPr>
+          <w:fldChar w:fldCharType="separate"/>
+        </w:r>
+        <w:r>
+          <w:rPr>
+            <w:noProof/>
+            <w:webHidden/>
+          </w:rPr>
+          <w:t>5</w:t>
+        </w:r>
+        <w:r>
+          <w:rPr>
+            <w:noProof/>
+            <w:webHidden/>
+          </w:rPr>
+          <w:fldChar w:fldCharType="end"/>
+        </w:r>
+      </w:hyperlink>
+    </w:p>
+    <w:p>
+      <w:pPr>
+        <w:pStyle w:val="TM2"/>
+        <w:tabs>
+          <w:tab w:val="right" w:leader="dot" w:pos="9062"/>
+        </w:tabs>
+        <w:rPr>
+          <w:rFonts w:eastAsiaTheme="minorEastAsia"/>
+          <w:smallCaps w:val="0"/>
+          <w:noProof/>
+          <w:sz w:val="24"/>
+          <w:szCs w:val="24"/>
+          <w:lang w:eastAsia="fr-FR"/>
+        </w:rPr>
+      </w:pPr>
+      <w:hyperlink w:anchor="_Toc218839502" w:history="1">
+        <w:r>
+          <w:rPr>
+            <w:rStyle w:val="Lienhypertexte"/>
+            <w:noProof/>
+          </w:rPr>
+          <w:t>Il existe au moins une relation un à plusieurs et une relation plusieurs à plusieurs.</w:t>
+        </w:r>
+        <w:r>
+          <w:rPr>
+            <w:noProof/>
+            <w:webHidden/>
+          </w:rPr>
+          <w:tab/>
+        </w:r>
+        <w:r>
+          <w:rPr>
+            <w:noProof/>
+            <w:webHidden/>
+          </w:rPr>
+          <w:fldChar w:fldCharType="begin"/>
+        </w:r>
+        <w:r>
+          <w:rPr>
+            <w:noProof/>
+            <w:webHidden/>
+          </w:rPr>
+          <w:instrText xml:space="preserve"> PAGEREF _Toc218839502 \h </w:instrText>
+        </w:r>
+        <w:r>
+          <w:rPr>
+            <w:noProof/>
+            <w:webHidden/>
+          </w:rPr>
+        </w:r>
+        <w:r>
+          <w:rPr>
+            <w:noProof/>
+            <w:webHidden/>
+          </w:rPr>
+          <w:fldChar w:fldCharType="separate"/>
+        </w:r>
+        <w:r>
+          <w:rPr>
+            <w:noProof/>
+            <w:webHidden/>
+          </w:rPr>
+          <w:t>6</w:t>
+        </w:r>
+        <w:r>
+          <w:rPr>
+            <w:noProof/>
+            <w:webHidden/>
+          </w:rPr>
+          <w:fldChar w:fldCharType="end"/>
+        </w:r>
+      </w:hyperlink>
+    </w:p>
+    <w:p>
+      <w:pPr>
+        <w:pStyle w:val="TM3"/>
+        <w:tabs>
+          <w:tab w:val="right" w:leader="dot" w:pos="9062"/>
+        </w:tabs>
+        <w:rPr>
+          <w:rFonts w:eastAsiaTheme="minorEastAsia"/>
           <w:i w:val="0"/>
           <w:iCs w:val="0"/>
           <w:noProof/>
@@ -338,22 +1007,13 @@
           <w:lang w:eastAsia="fr-FR"/>
         </w:rPr>
       </w:pPr>
-      <w:r>
-        <w:fldChar w:fldCharType="begin"/>
-      </w:r>
-      <w:r>
-        <w:instrText xml:space="preserve"> TOC \o "1-3" \h \z \u </w:instrText>
-      </w:r>
-      <w:r>
-        <w:fldChar w:fldCharType="separate"/>
-      </w:r>
-      <w:hyperlink w:anchor="_Toc218604851" w:history="1">
+      <w:hyperlink w:anchor="_Toc218839503" w:history="1">
         <w:r>
           <w:rPr>
             <w:rStyle w:val="Lienhypertexte"/>
             <w:noProof/>
           </w:rPr>
-          <w:t>Mise en place et Environnement</w:t>
+          <w:t>Relation "Un à Plusieurs"</w:t>
         </w:r>
         <w:r>
           <w:rPr>
@@ -374,7 +1034,7 @@
             <w:noProof/>
             <w:webHidden/>
           </w:rPr>
-          <w:instrText xml:space="preserve"> PAGEREF _Toc218604851 \h </w:instrText>
+          <w:instrText xml:space="preserve"> PAGEREF _Toc218839503 \h </w:instrText>
         </w:r>
         <w:r>
           <w:rPr>
@@ -394,7 +1054,7 @@
             <w:noProof/>
             <w:webHidden/>
           </w:rPr>
-          <w:t>4</w:t>
+          <w:t>6</w:t>
         </w:r>
         <w:r>
           <w:rPr>
@@ -407,11 +1067,12 @@
     </w:p>
     <w:p>
       <w:pPr>
-        <w:pStyle w:val="TM1"/>
+        <w:pStyle w:val="TM3"/>
+        <w:tabs>
+          <w:tab w:val="right" w:leader="dot" w:pos="9062"/>
+        </w:tabs>
         <w:rPr>
           <w:rFonts w:eastAsiaTheme="minorEastAsia"/>
-          <w:b w:val="0"/>
-          <w:bCs w:val="0"/>
           <w:i w:val="0"/>
           <w:iCs w:val="0"/>
           <w:noProof/>
@@ -420,13 +1081,13 @@
           <w:lang w:eastAsia="fr-FR"/>
         </w:rPr>
       </w:pPr>
-      <w:hyperlink w:anchor="_Toc218604852" w:history="1">
+      <w:hyperlink w:anchor="_Toc218839504" w:history="1">
         <w:r>
           <w:rPr>
             <w:rStyle w:val="Lienhypertexte"/>
             <w:noProof/>
           </w:rPr>
-          <w:t>Groupe de sécurité</w:t>
+          <w:t>Relation "Plusieurs à Plusieurs"</w:t>
         </w:r>
         <w:r>
           <w:rPr>
@@ -447,7 +1108,7 @@
             <w:noProof/>
             <w:webHidden/>
           </w:rPr>
-          <w:instrText xml:space="preserve"> PAGEREF _Toc218604852 \h </w:instrText>
+          <w:instrText xml:space="preserve"> PAGEREF _Toc218839504 \h </w:instrText>
         </w:r>
         <w:r>
           <w:rPr>
@@ -467,7 +1128,7 @@
             <w:noProof/>
             <w:webHidden/>
           </w:rPr>
-          <w:t>5</w:t>
+          <w:t>6</w:t>
         </w:r>
         <w:r>
           <w:rPr>
@@ -482,25 +1143,24 @@
       <w:pPr>
         <w:pStyle w:val="TM2"/>
         <w:tabs>
-          <w:tab w:val="right" w:leader="underscore" w:pos="9062"/>
+          <w:tab w:val="right" w:leader="dot" w:pos="9062"/>
         </w:tabs>
         <w:rPr>
           <w:rFonts w:eastAsiaTheme="minorEastAsia"/>
-          <w:b w:val="0"/>
-          <w:bCs w:val="0"/>
+          <w:smallCaps w:val="0"/>
           <w:noProof/>
           <w:sz w:val="24"/>
           <w:szCs w:val="24"/>
           <w:lang w:eastAsia="fr-FR"/>
         </w:rPr>
       </w:pPr>
-      <w:hyperlink w:anchor="_Toc218604853" w:history="1">
+      <w:hyperlink w:anchor="_Toc218839505" w:history="1">
         <w:r>
           <w:rPr>
             <w:rStyle w:val="Lienhypertexte"/>
             <w:noProof/>
           </w:rPr>
-          <w:t>Il y a aux moins deux groupes de sécurité</w:t>
+          <w:t>Il existe des données de démo au format xml. Certains enregistrements sont liés par les relations d'autres non.</w:t>
         </w:r>
         <w:r>
           <w:rPr>
@@ -521,7 +1181,7 @@
             <w:noProof/>
             <w:webHidden/>
           </w:rPr>
-          <w:instrText xml:space="preserve"> PAGEREF _Toc218604853 \h </w:instrText>
+          <w:instrText xml:space="preserve"> PAGEREF _Toc218839505 \h </w:instrText>
         </w:r>
         <w:r>
           <w:rPr>
@@ -541,7 +1201,7 @@
             <w:noProof/>
             <w:webHidden/>
           </w:rPr>
-          <w:t>5</w:t>
+          <w:t>6</w:t>
         </w:r>
         <w:r>
           <w:rPr>
@@ -556,25 +1216,24 @@
       <w:pPr>
         <w:pStyle w:val="TM2"/>
         <w:tabs>
-          <w:tab w:val="right" w:leader="underscore" w:pos="9062"/>
+          <w:tab w:val="right" w:leader="dot" w:pos="9062"/>
         </w:tabs>
         <w:rPr>
           <w:rFonts w:eastAsiaTheme="minorEastAsia"/>
-          <w:b w:val="0"/>
-          <w:bCs w:val="0"/>
+          <w:smallCaps w:val="0"/>
           <w:noProof/>
           <w:sz w:val="24"/>
           <w:szCs w:val="24"/>
           <w:lang w:eastAsia="fr-FR"/>
         </w:rPr>
       </w:pPr>
-      <w:hyperlink w:anchor="_Toc218604854" w:history="1">
+      <w:hyperlink w:anchor="_Toc218839506" w:history="1">
         <w:r>
           <w:rPr>
             <w:rStyle w:val="Lienhypertexte"/>
             <w:noProof/>
           </w:rPr>
-          <w:t>Des droits d'accès différents aux modèles ont été accordés aux groupes de sécurité</w:t>
+          <w:t>Un des modèles étend un modèle d’Odoo.</w:t>
         </w:r>
         <w:r>
           <w:rPr>
@@ -595,7 +1254,7 @@
             <w:noProof/>
             <w:webHidden/>
           </w:rPr>
-          <w:instrText xml:space="preserve"> PAGEREF _Toc218604854 \h </w:instrText>
+          <w:instrText xml:space="preserve"> PAGEREF _Toc218839506 \h </w:instrText>
         </w:r>
         <w:r>
           <w:rPr>
@@ -615,7 +1274,7 @@
             <w:noProof/>
             <w:webHidden/>
           </w:rPr>
-          <w:t>5</w:t>
+          <w:t>7</w:t>
         </w:r>
         <w:r>
           <w:rPr>
@@ -629,25 +1288,27 @@
     <w:p>
       <w:pPr>
         <w:pStyle w:val="TM1"/>
+        <w:tabs>
+          <w:tab w:val="right" w:leader="dot" w:pos="9062"/>
+        </w:tabs>
         <w:rPr>
           <w:rFonts w:eastAsiaTheme="minorEastAsia"/>
           <w:b w:val="0"/>
           <w:bCs w:val="0"/>
-          <w:i w:val="0"/>
-          <w:iCs w:val="0"/>
+          <w:caps w:val="0"/>
           <w:noProof/>
           <w:sz w:val="24"/>
           <w:szCs w:val="24"/>
           <w:lang w:eastAsia="fr-FR"/>
         </w:rPr>
       </w:pPr>
-      <w:hyperlink w:anchor="_Toc218604855" w:history="1">
+      <w:hyperlink w:anchor="_Toc218839507" w:history="1">
         <w:r>
           <w:rPr>
             <w:rStyle w:val="Lienhypertexte"/>
             <w:noProof/>
           </w:rPr>
-          <w:t>Modèles</w:t>
+          <w:t>Vues</w:t>
         </w:r>
         <w:r>
           <w:rPr>
@@ -668,7 +1329,7 @@
             <w:noProof/>
             <w:webHidden/>
           </w:rPr>
-          <w:instrText xml:space="preserve"> PAGEREF _Toc218604855 \h </w:instrText>
+          <w:instrText xml:space="preserve"> PAGEREF _Toc218839507 \h </w:instrText>
         </w:r>
         <w:r>
           <w:rPr>
@@ -688,7 +1349,7 @@
             <w:noProof/>
             <w:webHidden/>
           </w:rPr>
-          <w:t>6</w:t>
+          <w:t>7</w:t>
         </w:r>
         <w:r>
           <w:rPr>
@@ -703,25 +1364,24 @@
       <w:pPr>
         <w:pStyle w:val="TM2"/>
         <w:tabs>
-          <w:tab w:val="right" w:leader="underscore" w:pos="9062"/>
+          <w:tab w:val="right" w:leader="dot" w:pos="9062"/>
         </w:tabs>
         <w:rPr>
           <w:rFonts w:eastAsiaTheme="minorEastAsia"/>
-          <w:b w:val="0"/>
-          <w:bCs w:val="0"/>
+          <w:smallCaps w:val="0"/>
           <w:noProof/>
           <w:sz w:val="24"/>
           <w:szCs w:val="24"/>
           <w:lang w:eastAsia="fr-FR"/>
         </w:rPr>
       </w:pPr>
-      <w:hyperlink w:anchor="_Toc218604856" w:history="1">
+      <w:hyperlink w:anchor="_Toc218839508" w:history="1">
         <w:r>
           <w:rPr>
             <w:rStyle w:val="Lienhypertexte"/>
             <w:noProof/>
           </w:rPr>
-          <w:t>Il y a plusieurs modèles.</w:t>
+          <w:t>Il existe une vue liste personnalisée.</w:t>
         </w:r>
         <w:r>
           <w:rPr>
@@ -742,7 +1402,7 @@
             <w:noProof/>
             <w:webHidden/>
           </w:rPr>
-          <w:instrText xml:space="preserve"> PAGEREF _Toc218604856 \h </w:instrText>
+          <w:instrText xml:space="preserve"> PAGEREF _Toc218839508 \h </w:instrText>
         </w:r>
         <w:r>
           <w:rPr>
@@ -762,7 +1422,7 @@
             <w:noProof/>
             <w:webHidden/>
           </w:rPr>
-          <w:t>6</w:t>
+          <w:t>7</w:t>
         </w:r>
         <w:r>
           <w:rPr>
@@ -777,25 +1437,24 @@
       <w:pPr>
         <w:pStyle w:val="TM2"/>
         <w:tabs>
-          <w:tab w:val="right" w:leader="underscore" w:pos="9062"/>
+          <w:tab w:val="right" w:leader="dot" w:pos="9062"/>
         </w:tabs>
         <w:rPr>
           <w:rFonts w:eastAsiaTheme="minorEastAsia"/>
-          <w:b w:val="0"/>
-          <w:bCs w:val="0"/>
+          <w:smallCaps w:val="0"/>
           <w:noProof/>
           <w:sz w:val="24"/>
           <w:szCs w:val="24"/>
           <w:lang w:eastAsia="fr-FR"/>
         </w:rPr>
       </w:pPr>
-      <w:hyperlink w:anchor="_Toc218604857" w:history="1">
+      <w:hyperlink w:anchor="_Toc218839509" w:history="1">
         <w:r>
           <w:rPr>
             <w:rStyle w:val="Lienhypertexte"/>
             <w:noProof/>
           </w:rPr>
-          <w:t>Il y a dans au moins un modèle un champ textuel, un champ numérique, un champ date un champ image, un champ select, un champ calculé et un champ related.</w:t>
+          <w:t>Il existe une vue formulaire personnalisée.</w:t>
         </w:r>
         <w:r>
           <w:rPr>
@@ -816,7 +1475,7 @@
             <w:noProof/>
             <w:webHidden/>
           </w:rPr>
-          <w:instrText xml:space="preserve"> PAGEREF _Toc218604857 \h </w:instrText>
+          <w:instrText xml:space="preserve"> PAGEREF _Toc218839509 \h </w:instrText>
         </w:r>
         <w:r>
           <w:rPr>
@@ -836,7 +1495,7 @@
             <w:noProof/>
             <w:webHidden/>
           </w:rPr>
-          <w:t>6</w:t>
+          <w:t>8</w:t>
         </w:r>
         <w:r>
           <w:rPr>
@@ -851,25 +1510,24 @@
       <w:pPr>
         <w:pStyle w:val="TM2"/>
         <w:tabs>
-          <w:tab w:val="right" w:leader="underscore" w:pos="9062"/>
+          <w:tab w:val="right" w:leader="dot" w:pos="9062"/>
         </w:tabs>
         <w:rPr>
           <w:rFonts w:eastAsiaTheme="minorEastAsia"/>
-          <w:b w:val="0"/>
-          <w:bCs w:val="0"/>
+          <w:smallCaps w:val="0"/>
           <w:noProof/>
           <w:sz w:val="24"/>
           <w:szCs w:val="24"/>
           <w:lang w:eastAsia="fr-FR"/>
         </w:rPr>
       </w:pPr>
-      <w:hyperlink w:anchor="_Toc218604858" w:history="1">
+      <w:hyperlink w:anchor="_Toc218839510" w:history="1">
         <w:r>
           <w:rPr>
             <w:rStyle w:val="Lienhypertexte"/>
             <w:noProof/>
           </w:rPr>
-          <w:t>Il y a au moins dans un modèle une méthode qui contrôle des données.</w:t>
+          <w:t>Il existe un champ recherche personnalisé.</w:t>
         </w:r>
         <w:r>
           <w:rPr>
@@ -890,7 +1548,7 @@
             <w:noProof/>
             <w:webHidden/>
           </w:rPr>
-          <w:instrText xml:space="preserve"> PAGEREF _Toc218604858 \h </w:instrText>
+          <w:instrText xml:space="preserve"> PAGEREF _Toc218839510 \h </w:instrText>
         </w:r>
         <w:r>
           <w:rPr>
@@ -910,7 +1568,7 @@
             <w:noProof/>
             <w:webHidden/>
           </w:rPr>
-          <w:t>6</w:t>
+          <w:t>8</w:t>
         </w:r>
         <w:r>
           <w:rPr>
@@ -925,25 +1583,24 @@
       <w:pPr>
         <w:pStyle w:val="TM2"/>
         <w:tabs>
-          <w:tab w:val="right" w:leader="underscore" w:pos="9062"/>
+          <w:tab w:val="right" w:leader="dot" w:pos="9062"/>
         </w:tabs>
         <w:rPr>
           <w:rFonts w:eastAsiaTheme="minorEastAsia"/>
-          <w:b w:val="0"/>
-          <w:bCs w:val="0"/>
+          <w:smallCaps w:val="0"/>
           <w:noProof/>
           <w:sz w:val="24"/>
           <w:szCs w:val="24"/>
           <w:lang w:eastAsia="fr-FR"/>
         </w:rPr>
       </w:pPr>
-      <w:hyperlink w:anchor="_Toc218604859" w:history="1">
+      <w:hyperlink w:anchor="_Toc218839511" w:history="1">
         <w:r>
           <w:rPr>
             <w:rStyle w:val="Lienhypertexte"/>
             <w:noProof/>
           </w:rPr>
-          <w:t>Il existe au moins une relation un à plusieurs et une relation plusieurs à plusieurs.</w:t>
+          <w:t>Il existe une vue calendrier ou une vue kanban.</w:t>
         </w:r>
         <w:r>
           <w:rPr>
@@ -964,7 +1621,7 @@
             <w:noProof/>
             <w:webHidden/>
           </w:rPr>
-          <w:instrText xml:space="preserve"> PAGEREF _Toc218604859 \h </w:instrText>
+          <w:instrText xml:space="preserve"> PAGEREF _Toc218839511 \h </w:instrText>
         </w:r>
         <w:r>
           <w:rPr>
@@ -984,7 +1641,7 @@
             <w:noProof/>
             <w:webHidden/>
           </w:rPr>
-          <w:t>7</w:t>
+          <w:t>8</w:t>
         </w:r>
         <w:r>
           <w:rPr>
@@ -997,25 +1654,26 @@
     </w:p>
     <w:p>
       <w:pPr>
-        <w:pStyle w:val="TM3"/>
-        <w:tabs>
-          <w:tab w:val="right" w:leader="underscore" w:pos="9062"/>
+        <w:pStyle w:val="TM2"/>
+        <w:tabs>
+          <w:tab w:val="right" w:leader="dot" w:pos="9062"/>
         </w:tabs>
         <w:rPr>
           <w:rFonts w:eastAsiaTheme="minorEastAsia"/>
+          <w:smallCaps w:val="0"/>
           <w:noProof/>
           <w:sz w:val="24"/>
           <w:szCs w:val="24"/>
           <w:lang w:eastAsia="fr-FR"/>
         </w:rPr>
       </w:pPr>
-      <w:hyperlink w:anchor="_Toc218604860" w:history="1">
+      <w:hyperlink w:anchor="_Toc218839512" w:history="1">
         <w:r>
           <w:rPr>
             <w:rStyle w:val="Lienhypertexte"/>
             <w:noProof/>
           </w:rPr>
-          <w:t>Relation "Un à Plusieurs"</w:t>
+          <w:t>Une page web est disponible.</w:t>
         </w:r>
         <w:r>
           <w:rPr>
@@ -1036,7 +1694,7 @@
             <w:noProof/>
             <w:webHidden/>
           </w:rPr>
-          <w:instrText xml:space="preserve"> PAGEREF _Toc218604860 \h </w:instrText>
+          <w:instrText xml:space="preserve"> PAGEREF _Toc218839512 \h </w:instrText>
         </w:r>
         <w:r>
           <w:rPr>
@@ -1056,7 +1714,7 @@
             <w:noProof/>
             <w:webHidden/>
           </w:rPr>
-          <w:t>7</w:t>
+          <w:t>9</w:t>
         </w:r>
         <w:r>
           <w:rPr>
@@ -1069,25 +1727,26 @@
     </w:p>
     <w:p>
       <w:pPr>
-        <w:pStyle w:val="TM3"/>
-        <w:tabs>
-          <w:tab w:val="right" w:leader="underscore" w:pos="9062"/>
+        <w:pStyle w:val="TM2"/>
+        <w:tabs>
+          <w:tab w:val="right" w:leader="dot" w:pos="9062"/>
         </w:tabs>
         <w:rPr>
           <w:rFonts w:eastAsiaTheme="minorEastAsia"/>
+          <w:smallCaps w:val="0"/>
           <w:noProof/>
           <w:sz w:val="24"/>
           <w:szCs w:val="24"/>
           <w:lang w:eastAsia="fr-FR"/>
         </w:rPr>
       </w:pPr>
-      <w:hyperlink w:anchor="_Toc218604861" w:history="1">
+      <w:hyperlink w:anchor="_Toc218839513" w:history="1">
         <w:r>
           <w:rPr>
             <w:rStyle w:val="Lienhypertexte"/>
             <w:noProof/>
           </w:rPr>
-          <w:t>Relation "Plusieurs à Plusieurs"</w:t>
+          <w:t>Dans une des vues on trouve au moins un exemplaire de tous les champs exigés dans les consignes sur les modèles.</w:t>
         </w:r>
         <w:r>
           <w:rPr>
@@ -1108,7 +1767,7 @@
             <w:noProof/>
             <w:webHidden/>
           </w:rPr>
-          <w:instrText xml:space="preserve"> PAGEREF _Toc218604861 \h </w:instrText>
+          <w:instrText xml:space="preserve"> PAGEREF _Toc218839513 \h </w:instrText>
         </w:r>
         <w:r>
           <w:rPr>
@@ -1128,7 +1787,7 @@
             <w:noProof/>
             <w:webHidden/>
           </w:rPr>
-          <w:t>7</w:t>
+          <w:t>10</w:t>
         </w:r>
         <w:r>
           <w:rPr>
@@ -1143,25 +1802,24 @@
       <w:pPr>
         <w:pStyle w:val="TM2"/>
         <w:tabs>
-          <w:tab w:val="right" w:leader="underscore" w:pos="9062"/>
+          <w:tab w:val="right" w:leader="dot" w:pos="9062"/>
         </w:tabs>
         <w:rPr>
           <w:rFonts w:eastAsiaTheme="minorEastAsia"/>
-          <w:b w:val="0"/>
-          <w:bCs w:val="0"/>
+          <w:smallCaps w:val="0"/>
           <w:noProof/>
           <w:sz w:val="24"/>
           <w:szCs w:val="24"/>
           <w:lang w:eastAsia="fr-FR"/>
         </w:rPr>
       </w:pPr>
-      <w:hyperlink w:anchor="_Toc218604862" w:history="1">
+      <w:hyperlink w:anchor="_Toc218839514" w:history="1">
         <w:r>
           <w:rPr>
             <w:rStyle w:val="Lienhypertexte"/>
             <w:noProof/>
           </w:rPr>
-          <w:t>Il existe des données de démo au format xml. Certains enregistrements sont liés par les relations d'autres non.</w:t>
+          <w:t>Un bouton permet d'exécuter la méthode qui contrôle les données</w:t>
         </w:r>
         <w:r>
           <w:rPr>
@@ -1182,7 +1840,7 @@
             <w:noProof/>
             <w:webHidden/>
           </w:rPr>
-          <w:instrText xml:space="preserve"> PAGEREF _Toc218604862 \h </w:instrText>
+          <w:instrText xml:space="preserve"> PAGEREF _Toc218839514 \h </w:instrText>
         </w:r>
         <w:r>
           <w:rPr>
@@ -1202,7 +1860,7 @@
             <w:noProof/>
             <w:webHidden/>
           </w:rPr>
-          <w:t>7</w:t>
+          <w:t>10</w:t>
         </w:r>
         <w:r>
           <w:rPr>
@@ -1217,25 +1875,24 @@
       <w:pPr>
         <w:pStyle w:val="TM2"/>
         <w:tabs>
-          <w:tab w:val="right" w:leader="underscore" w:pos="9062"/>
+          <w:tab w:val="right" w:leader="dot" w:pos="9062"/>
         </w:tabs>
         <w:rPr>
           <w:rFonts w:eastAsiaTheme="minorEastAsia"/>
-          <w:b w:val="0"/>
-          <w:bCs w:val="0"/>
+          <w:smallCaps w:val="0"/>
           <w:noProof/>
           <w:sz w:val="24"/>
           <w:szCs w:val="24"/>
           <w:lang w:eastAsia="fr-FR"/>
         </w:rPr>
       </w:pPr>
-      <w:hyperlink w:anchor="_Toc218604863" w:history="1">
+      <w:hyperlink w:anchor="_Toc218839515" w:history="1">
         <w:r>
           <w:rPr>
             <w:rStyle w:val="Lienhypertexte"/>
             <w:noProof/>
           </w:rPr>
-          <w:t>Un des modèles étend un modèle d’Odoo.</w:t>
+          <w:t>L'héritage du modèle étendu est utilisé dans une vue (affichage d'un champ parent ou modification d'une des vues du modèle parent)</w:t>
         </w:r>
         <w:r>
           <w:rPr>
@@ -1256,7 +1913,7 @@
             <w:noProof/>
             <w:webHidden/>
           </w:rPr>
-          <w:instrText xml:space="preserve"> PAGEREF _Toc218604863 \h </w:instrText>
+          <w:instrText xml:space="preserve"> PAGEREF _Toc218839515 \h </w:instrText>
         </w:r>
         <w:r>
           <w:rPr>
@@ -1276,7 +1933,7 @@
             <w:noProof/>
             <w:webHidden/>
           </w:rPr>
-          <w:t>7</w:t>
+          <w:t>11</w:t>
         </w:r>
         <w:r>
           <w:rPr>
@@ -1289,26 +1946,26 @@
     </w:p>
     <w:p>
       <w:pPr>
-        <w:pStyle w:val="TM1"/>
+        <w:pStyle w:val="TM2"/>
+        <w:tabs>
+          <w:tab w:val="right" w:leader="dot" w:pos="9062"/>
+        </w:tabs>
         <w:rPr>
           <w:rFonts w:eastAsiaTheme="minorEastAsia"/>
-          <w:b w:val="0"/>
-          <w:bCs w:val="0"/>
-          <w:i w:val="0"/>
-          <w:iCs w:val="0"/>
+          <w:smallCaps w:val="0"/>
           <w:noProof/>
           <w:sz w:val="24"/>
           <w:szCs w:val="24"/>
           <w:lang w:eastAsia="fr-FR"/>
         </w:rPr>
       </w:pPr>
-      <w:hyperlink w:anchor="_Toc218604864" w:history="1">
+      <w:hyperlink w:anchor="_Toc218839516" w:history="1">
         <w:r>
           <w:rPr>
             <w:rStyle w:val="Lienhypertexte"/>
             <w:noProof/>
           </w:rPr>
-          <w:t>Vues</w:t>
+          <w:t>Un ou plusieurs champs ne sont visibles que pour un groupe d'utilisateur ou en fonction de la valeur d'un autre champ.</w:t>
         </w:r>
         <w:r>
           <w:rPr>
@@ -1329,7 +1986,7 @@
             <w:noProof/>
             <w:webHidden/>
           </w:rPr>
-          <w:instrText xml:space="preserve"> PAGEREF _Toc218604864 \h </w:instrText>
+          <w:instrText xml:space="preserve"> PAGEREF _Toc218839516 \h </w:instrText>
         </w:r>
         <w:r>
           <w:rPr>
@@ -1349,6 +2006,309 @@
             <w:noProof/>
             <w:webHidden/>
           </w:rPr>
+          <w:t>12</w:t>
+        </w:r>
+        <w:r>
+          <w:rPr>
+            <w:noProof/>
+            <w:webHidden/>
+          </w:rPr>
+          <w:fldChar w:fldCharType="end"/>
+        </w:r>
+      </w:hyperlink>
+    </w:p>
+    <w:p>
+      <w:r>
+        <w:fldChar w:fldCharType="end"/>
+      </w:r>
+    </w:p>
+    <w:p>
+      <w:pPr>
+        <w:rPr>
+          <w:b/>
+          <w:bCs/>
+          <w:u w:val="single"/>
+        </w:rPr>
+      </w:pPr>
+      <w:r>
+        <w:rPr>
+          <w:b/>
+          <w:bCs/>
+          <w:u w:val="single"/>
+        </w:rPr>
+        <w:t>Table des illustrations :</w:t>
+      </w:r>
+    </w:p>
+    <w:p>
+      <w:pPr>
+        <w:pStyle w:val="Tabledesillustrations"/>
+        <w:tabs>
+          <w:tab w:val="right" w:leader="dot" w:pos="9062"/>
+        </w:tabs>
+        <w:rPr>
+          <w:noProof/>
+        </w:rPr>
+      </w:pPr>
+      <w:r>
+        <w:fldChar w:fldCharType="begin"/>
+      </w:r>
+      <w:r>
+        <w:instrText xml:space="preserve"> TOC \h \z \c "Figure" </w:instrText>
+      </w:r>
+      <w:r>
+        <w:fldChar w:fldCharType="separate"/>
+      </w:r>
+      <w:hyperlink w:anchor="_Toc218839523" w:history="1">
+        <w:r>
+          <w:rPr>
+            <w:rStyle w:val="Lienhypertexte"/>
+            <w:noProof/>
+          </w:rPr>
+          <w:t>Figure 1 : Remplissage du formulaire de Base de Données</w:t>
+        </w:r>
+        <w:r>
+          <w:rPr>
+            <w:noProof/>
+            <w:webHidden/>
+          </w:rPr>
+          <w:tab/>
+        </w:r>
+        <w:r>
+          <w:rPr>
+            <w:noProof/>
+            <w:webHidden/>
+          </w:rPr>
+          <w:fldChar w:fldCharType="begin"/>
+        </w:r>
+        <w:r>
+          <w:rPr>
+            <w:noProof/>
+            <w:webHidden/>
+          </w:rPr>
+          <w:instrText xml:space="preserve"> PAGEREF _Toc218839523 \h </w:instrText>
+        </w:r>
+        <w:r>
+          <w:rPr>
+            <w:noProof/>
+            <w:webHidden/>
+          </w:rPr>
+        </w:r>
+        <w:r>
+          <w:rPr>
+            <w:noProof/>
+            <w:webHidden/>
+          </w:rPr>
+          <w:fldChar w:fldCharType="separate"/>
+        </w:r>
+        <w:r>
+          <w:rPr>
+            <w:noProof/>
+            <w:webHidden/>
+          </w:rPr>
+          <w:t>3</w:t>
+        </w:r>
+        <w:r>
+          <w:rPr>
+            <w:noProof/>
+            <w:webHidden/>
+          </w:rPr>
+          <w:fldChar w:fldCharType="end"/>
+        </w:r>
+      </w:hyperlink>
+    </w:p>
+    <w:p>
+      <w:pPr>
+        <w:pStyle w:val="Tabledesillustrations"/>
+        <w:tabs>
+          <w:tab w:val="right" w:leader="dot" w:pos="9062"/>
+        </w:tabs>
+        <w:rPr>
+          <w:noProof/>
+        </w:rPr>
+      </w:pPr>
+      <w:hyperlink w:anchor="_Toc218839524" w:history="1">
+        <w:r>
+          <w:rPr>
+            <w:rStyle w:val="Lienhypertexte"/>
+            <w:noProof/>
+          </w:rPr>
+          <w:t>Figure 2 : Sélectionner la vue liste personnalisée</w:t>
+        </w:r>
+        <w:r>
+          <w:rPr>
+            <w:noProof/>
+            <w:webHidden/>
+          </w:rPr>
+          <w:tab/>
+        </w:r>
+        <w:r>
+          <w:rPr>
+            <w:noProof/>
+            <w:webHidden/>
+          </w:rPr>
+          <w:fldChar w:fldCharType="begin"/>
+        </w:r>
+        <w:r>
+          <w:rPr>
+            <w:noProof/>
+            <w:webHidden/>
+          </w:rPr>
+          <w:instrText xml:space="preserve"> PAGEREF _Toc218839524 \h </w:instrText>
+        </w:r>
+        <w:r>
+          <w:rPr>
+            <w:noProof/>
+            <w:webHidden/>
+          </w:rPr>
+        </w:r>
+        <w:r>
+          <w:rPr>
+            <w:noProof/>
+            <w:webHidden/>
+          </w:rPr>
+          <w:fldChar w:fldCharType="separate"/>
+        </w:r>
+        <w:r>
+          <w:rPr>
+            <w:noProof/>
+            <w:webHidden/>
+          </w:rPr>
+          <w:t>7</w:t>
+        </w:r>
+        <w:r>
+          <w:rPr>
+            <w:noProof/>
+            <w:webHidden/>
+          </w:rPr>
+          <w:fldChar w:fldCharType="end"/>
+        </w:r>
+      </w:hyperlink>
+    </w:p>
+    <w:p>
+      <w:pPr>
+        <w:pStyle w:val="Tabledesillustrations"/>
+        <w:tabs>
+          <w:tab w:val="right" w:leader="dot" w:pos="9062"/>
+        </w:tabs>
+        <w:rPr>
+          <w:noProof/>
+        </w:rPr>
+      </w:pPr>
+      <w:hyperlink w:anchor="_Toc218839525" w:history="1">
+        <w:r>
+          <w:rPr>
+            <w:rStyle w:val="Lienhypertexte"/>
+            <w:noProof/>
+          </w:rPr>
+          <w:t>Figure 3 : Localisation des filtres de recherche personnalisé</w:t>
+        </w:r>
+        <w:r>
+          <w:rPr>
+            <w:noProof/>
+            <w:webHidden/>
+          </w:rPr>
+          <w:tab/>
+        </w:r>
+        <w:r>
+          <w:rPr>
+            <w:noProof/>
+            <w:webHidden/>
+          </w:rPr>
+          <w:fldChar w:fldCharType="begin"/>
+        </w:r>
+        <w:r>
+          <w:rPr>
+            <w:noProof/>
+            <w:webHidden/>
+          </w:rPr>
+          <w:instrText xml:space="preserve"> PAGEREF _Toc218839525 \h </w:instrText>
+        </w:r>
+        <w:r>
+          <w:rPr>
+            <w:noProof/>
+            <w:webHidden/>
+          </w:rPr>
+        </w:r>
+        <w:r>
+          <w:rPr>
+            <w:noProof/>
+            <w:webHidden/>
+          </w:rPr>
+          <w:fldChar w:fldCharType="separate"/>
+        </w:r>
+        <w:r>
+          <w:rPr>
+            <w:noProof/>
+            <w:webHidden/>
+          </w:rPr>
+          <w:t>8</w:t>
+        </w:r>
+        <w:r>
+          <w:rPr>
+            <w:noProof/>
+            <w:webHidden/>
+          </w:rPr>
+          <w:fldChar w:fldCharType="end"/>
+        </w:r>
+      </w:hyperlink>
+    </w:p>
+    <w:p>
+      <w:pPr>
+        <w:pStyle w:val="Tabledesillustrations"/>
+        <w:tabs>
+          <w:tab w:val="right" w:leader="dot" w:pos="9062"/>
+        </w:tabs>
+        <w:rPr>
+          <w:noProof/>
+        </w:rPr>
+      </w:pPr>
+      <w:hyperlink w:anchor="_Toc218839526" w:history="1">
+        <w:r>
+          <w:rPr>
+            <w:rStyle w:val="Lienhypertexte"/>
+            <w:noProof/>
+          </w:rPr>
+          <w:t>Figure 4 : Accéder a la vue Kanban</w:t>
+        </w:r>
+        <w:r>
+          <w:rPr>
+            <w:noProof/>
+            <w:webHidden/>
+          </w:rPr>
+          <w:tab/>
+        </w:r>
+        <w:r>
+          <w:rPr>
+            <w:noProof/>
+            <w:webHidden/>
+          </w:rPr>
+          <w:fldChar w:fldCharType="begin"/>
+        </w:r>
+        <w:r>
+          <w:rPr>
+            <w:noProof/>
+            <w:webHidden/>
+          </w:rPr>
+          <w:instrText xml:space="preserve"> PAGEREF _Toc218839526 \h </w:instrText>
+        </w:r>
+        <w:r>
+          <w:rPr>
+            <w:noProof/>
+            <w:webHidden/>
+          </w:rPr>
+        </w:r>
+        <w:r>
+          <w:rPr>
+            <w:noProof/>
+            <w:webHidden/>
+          </w:rPr>
+          <w:fldChar w:fldCharType="separate"/>
+        </w:r>
+        <w:r>
+          <w:rPr>
+            <w:noProof/>
+            <w:webHidden/>
+          </w:rPr>
           <w:t>9</w:t>
         </w:r>
         <w:r>
@@ -1362,27 +2322,21 @@
     </w:p>
     <w:p>
       <w:pPr>
-        <w:pStyle w:val="TM2"/>
-        <w:tabs>
-          <w:tab w:val="right" w:leader="underscore" w:pos="9062"/>
-        </w:tabs>
-        <w:rPr>
-          <w:rFonts w:eastAsiaTheme="minorEastAsia"/>
-          <w:b w:val="0"/>
-          <w:bCs w:val="0"/>
+        <w:pStyle w:val="Tabledesillustrations"/>
+        <w:tabs>
+          <w:tab w:val="right" w:leader="dot" w:pos="9062"/>
+        </w:tabs>
+        <w:rPr>
           <w:noProof/>
-          <w:sz w:val="24"/>
-          <w:szCs w:val="24"/>
-          <w:lang w:eastAsia="fr-FR"/>
-        </w:rPr>
-      </w:pPr>
-      <w:hyperlink w:anchor="_Toc218604865" w:history="1">
+        </w:rPr>
+      </w:pPr>
+      <w:hyperlink w:anchor="_Toc218839527" w:history="1">
         <w:r>
           <w:rPr>
             <w:rStyle w:val="Lienhypertexte"/>
             <w:noProof/>
           </w:rPr>
-          <w:t>Il existe une vue liste personnalisée.</w:t>
+          <w:t>Figure 5 : Localisation bouton Site Web</w:t>
         </w:r>
         <w:r>
           <w:rPr>
@@ -1403,7 +2357,7 @@
             <w:noProof/>
             <w:webHidden/>
           </w:rPr>
-          <w:instrText xml:space="preserve"> PAGEREF _Toc218604865 \h </w:instrText>
+          <w:instrText xml:space="preserve"> PAGEREF _Toc218839527 \h </w:instrText>
         </w:r>
         <w:r>
           <w:rPr>
@@ -1436,27 +2390,21 @@
     </w:p>
     <w:p>
       <w:pPr>
-        <w:pStyle w:val="TM2"/>
-        <w:tabs>
-          <w:tab w:val="right" w:leader="underscore" w:pos="9062"/>
-        </w:tabs>
-        <w:rPr>
-          <w:rFonts w:eastAsiaTheme="minorEastAsia"/>
-          <w:b w:val="0"/>
-          <w:bCs w:val="0"/>
+        <w:pStyle w:val="Tabledesillustrations"/>
+        <w:tabs>
+          <w:tab w:val="right" w:leader="dot" w:pos="9062"/>
+        </w:tabs>
+        <w:rPr>
           <w:noProof/>
-          <w:sz w:val="24"/>
-          <w:szCs w:val="24"/>
-          <w:lang w:eastAsia="fr-FR"/>
-        </w:rPr>
-      </w:pPr>
-      <w:hyperlink w:anchor="_Toc218604866" w:history="1">
+        </w:rPr>
+      </w:pPr>
+      <w:hyperlink w:anchor="_Toc218839528" w:history="1">
         <w:r>
           <w:rPr>
             <w:rStyle w:val="Lienhypertexte"/>
             <w:noProof/>
           </w:rPr>
-          <w:t>Il existe une vue formulaire personnalisée.</w:t>
+          <w:t>Figure 6 : Consulter la fiche d'un client</w:t>
         </w:r>
         <w:r>
           <w:rPr>
@@ -1477,7 +2425,7 @@
             <w:noProof/>
             <w:webHidden/>
           </w:rPr>
-          <w:instrText xml:space="preserve"> PAGEREF _Toc218604866 \h </w:instrText>
+          <w:instrText xml:space="preserve"> PAGEREF _Toc218839528 \h </w:instrText>
         </w:r>
         <w:r>
           <w:rPr>
@@ -1497,7 +2445,7 @@
             <w:noProof/>
             <w:webHidden/>
           </w:rPr>
-          <w:t>9</w:t>
+          <w:t>10</w:t>
         </w:r>
         <w:r>
           <w:rPr>
@@ -1510,27 +2458,21 @@
     </w:p>
     <w:p>
       <w:pPr>
-        <w:pStyle w:val="TM2"/>
-        <w:tabs>
-          <w:tab w:val="right" w:leader="underscore" w:pos="9062"/>
-        </w:tabs>
-        <w:rPr>
-          <w:rFonts w:eastAsiaTheme="minorEastAsia"/>
-          <w:b w:val="0"/>
-          <w:bCs w:val="0"/>
+        <w:pStyle w:val="Tabledesillustrations"/>
+        <w:tabs>
+          <w:tab w:val="right" w:leader="dot" w:pos="9062"/>
+        </w:tabs>
+        <w:rPr>
           <w:noProof/>
-          <w:sz w:val="24"/>
-          <w:szCs w:val="24"/>
-          <w:lang w:eastAsia="fr-FR"/>
-        </w:rPr>
-      </w:pPr>
-      <w:hyperlink w:anchor="_Toc218604867" w:history="1">
+        </w:rPr>
+      </w:pPr>
+      <w:hyperlink w:anchor="_Toc218839529" w:history="1">
         <w:r>
           <w:rPr>
             <w:rStyle w:val="Lienhypertexte"/>
             <w:noProof/>
           </w:rPr>
-          <w:t>Il existe un champ recherche personnalisé.</w:t>
+          <w:t>Figure 7 : Bouton pour vérifier le dossier d'un client</w:t>
         </w:r>
         <w:r>
           <w:rPr>
@@ -1551,7 +2493,7 @@
             <w:noProof/>
             <w:webHidden/>
           </w:rPr>
-          <w:instrText xml:space="preserve"> PAGEREF _Toc218604867 \h </w:instrText>
+          <w:instrText xml:space="preserve"> PAGEREF _Toc218839529 \h </w:instrText>
         </w:r>
         <w:r>
           <w:rPr>
@@ -1571,7 +2513,7 @@
             <w:noProof/>
             <w:webHidden/>
           </w:rPr>
-          <w:t>9</w:t>
+          <w:t>11</w:t>
         </w:r>
         <w:r>
           <w:rPr>
@@ -1583,473 +2525,37 @@
       </w:hyperlink>
     </w:p>
     <w:p>
-      <w:pPr>
-        <w:pStyle w:val="TM2"/>
-        <w:tabs>
-          <w:tab w:val="right" w:leader="underscore" w:pos="9062"/>
-        </w:tabs>
-        <w:rPr>
-          <w:rFonts w:eastAsiaTheme="minorEastAsia"/>
-          <w:b w:val="0"/>
-          <w:bCs w:val="0"/>
-          <w:noProof/>
-          <w:sz w:val="24"/>
-          <w:szCs w:val="24"/>
-          <w:lang w:eastAsia="fr-FR"/>
-        </w:rPr>
-      </w:pPr>
-      <w:hyperlink w:anchor="_Toc218604868" w:history="1">
-        <w:r>
-          <w:rPr>
-            <w:rStyle w:val="Lienhypertexte"/>
-            <w:noProof/>
-          </w:rPr>
-          <w:t>Il existe une vue calendrier ou une vue kanban.</w:t>
-        </w:r>
-        <w:r>
-          <w:rPr>
-            <w:noProof/>
-            <w:webHidden/>
-          </w:rPr>
-          <w:tab/>
-        </w:r>
-        <w:r>
-          <w:rPr>
-            <w:noProof/>
-            <w:webHidden/>
-          </w:rPr>
-          <w:fldChar w:fldCharType="begin"/>
-        </w:r>
-        <w:r>
-          <w:rPr>
-            <w:noProof/>
-            <w:webHidden/>
-          </w:rPr>
-          <w:instrText xml:space="preserve"> PAGEREF _Toc218604868 \h </w:instrText>
-        </w:r>
-        <w:r>
-          <w:rPr>
-            <w:noProof/>
-            <w:webHidden/>
-          </w:rPr>
-        </w:r>
-        <w:r>
-          <w:rPr>
-            <w:noProof/>
-            <w:webHidden/>
-          </w:rPr>
-          <w:fldChar w:fldCharType="separate"/>
-        </w:r>
-        <w:r>
-          <w:rPr>
-            <w:noProof/>
-            <w:webHidden/>
-          </w:rPr>
-          <w:t>10</w:t>
-        </w:r>
-        <w:r>
-          <w:rPr>
-            <w:noProof/>
-            <w:webHidden/>
-          </w:rPr>
-          <w:fldChar w:fldCharType="end"/>
-        </w:r>
-      </w:hyperlink>
-    </w:p>
-    <w:p>
-      <w:pPr>
-        <w:pStyle w:val="TM2"/>
-        <w:tabs>
-          <w:tab w:val="right" w:leader="underscore" w:pos="9062"/>
-        </w:tabs>
-        <w:rPr>
-          <w:rFonts w:eastAsiaTheme="minorEastAsia"/>
-          <w:b w:val="0"/>
-          <w:bCs w:val="0"/>
-          <w:noProof/>
-          <w:sz w:val="24"/>
-          <w:szCs w:val="24"/>
-          <w:lang w:eastAsia="fr-FR"/>
-        </w:rPr>
-      </w:pPr>
-      <w:hyperlink w:anchor="_Toc218604869" w:history="1">
-        <w:r>
-          <w:rPr>
-            <w:rStyle w:val="Lienhypertexte"/>
-            <w:noProof/>
-          </w:rPr>
-          <w:t>Une page web est disponible.</w:t>
-        </w:r>
-        <w:r>
-          <w:rPr>
-            <w:noProof/>
-            <w:webHidden/>
-          </w:rPr>
-          <w:tab/>
-        </w:r>
-        <w:r>
-          <w:rPr>
-            <w:noProof/>
-            <w:webHidden/>
-          </w:rPr>
-          <w:fldChar w:fldCharType="begin"/>
-        </w:r>
-        <w:r>
-          <w:rPr>
-            <w:noProof/>
-            <w:webHidden/>
-          </w:rPr>
-          <w:instrText xml:space="preserve"> PAGEREF _Toc218604869 \h </w:instrText>
-        </w:r>
-        <w:r>
-          <w:rPr>
-            <w:noProof/>
-            <w:webHidden/>
-          </w:rPr>
-        </w:r>
-        <w:r>
-          <w:rPr>
-            <w:noProof/>
-            <w:webHidden/>
-          </w:rPr>
-          <w:fldChar w:fldCharType="separate"/>
-        </w:r>
-        <w:r>
-          <w:rPr>
-            <w:noProof/>
-            <w:webHidden/>
-          </w:rPr>
-          <w:t>10</w:t>
-        </w:r>
-        <w:r>
-          <w:rPr>
-            <w:noProof/>
-            <w:webHidden/>
-          </w:rPr>
-          <w:fldChar w:fldCharType="end"/>
-        </w:r>
-      </w:hyperlink>
-    </w:p>
-    <w:p>
-      <w:pPr>
-        <w:pStyle w:val="TM2"/>
-        <w:tabs>
-          <w:tab w:val="right" w:leader="underscore" w:pos="9062"/>
-        </w:tabs>
-        <w:rPr>
-          <w:rFonts w:eastAsiaTheme="minorEastAsia"/>
-          <w:b w:val="0"/>
-          <w:bCs w:val="0"/>
-          <w:noProof/>
-          <w:sz w:val="24"/>
-          <w:szCs w:val="24"/>
-          <w:lang w:eastAsia="fr-FR"/>
-        </w:rPr>
-      </w:pPr>
-      <w:hyperlink w:anchor="_Toc218604870" w:history="1">
-        <w:r>
-          <w:rPr>
-            <w:rStyle w:val="Lienhypertexte"/>
-            <w:noProof/>
-          </w:rPr>
-          <w:t>Dans une des vues on trouve au moins un exemplaire de tous les champs exigés dans les consignes sur les modèles.</w:t>
-        </w:r>
-        <w:r>
-          <w:rPr>
-            <w:noProof/>
-            <w:webHidden/>
-          </w:rPr>
-          <w:tab/>
-        </w:r>
-        <w:r>
-          <w:rPr>
-            <w:noProof/>
-            <w:webHidden/>
-          </w:rPr>
-          <w:fldChar w:fldCharType="begin"/>
-        </w:r>
-        <w:r>
-          <w:rPr>
-            <w:noProof/>
-            <w:webHidden/>
-          </w:rPr>
-          <w:instrText xml:space="preserve"> PAGEREF _Toc218604870 \h </w:instrText>
-        </w:r>
-        <w:r>
-          <w:rPr>
-            <w:noProof/>
-            <w:webHidden/>
-          </w:rPr>
-        </w:r>
-        <w:r>
-          <w:rPr>
-            <w:noProof/>
-            <w:webHidden/>
-          </w:rPr>
-          <w:fldChar w:fldCharType="separate"/>
-        </w:r>
-        <w:r>
-          <w:rPr>
-            <w:noProof/>
-            <w:webHidden/>
-          </w:rPr>
-          <w:t>10</w:t>
-        </w:r>
-        <w:r>
-          <w:rPr>
-            <w:noProof/>
-            <w:webHidden/>
-          </w:rPr>
-          <w:fldChar w:fldCharType="end"/>
-        </w:r>
-      </w:hyperlink>
-    </w:p>
-    <w:p>
-      <w:pPr>
-        <w:pStyle w:val="TM2"/>
-        <w:tabs>
-          <w:tab w:val="right" w:leader="underscore" w:pos="9062"/>
-        </w:tabs>
-        <w:rPr>
-          <w:rFonts w:eastAsiaTheme="minorEastAsia"/>
-          <w:b w:val="0"/>
-          <w:bCs w:val="0"/>
-          <w:noProof/>
-          <w:sz w:val="24"/>
-          <w:szCs w:val="24"/>
-          <w:lang w:eastAsia="fr-FR"/>
-        </w:rPr>
-      </w:pPr>
-      <w:hyperlink w:anchor="_Toc218604871" w:history="1">
-        <w:r>
-          <w:rPr>
-            <w:rStyle w:val="Lienhypertexte"/>
-            <w:noProof/>
-          </w:rPr>
-          <w:t>Un bouton permet d'exécuter la méthode qui contrôle les données</w:t>
-        </w:r>
-        <w:r>
-          <w:rPr>
-            <w:noProof/>
-            <w:webHidden/>
-          </w:rPr>
-          <w:tab/>
-        </w:r>
-        <w:r>
-          <w:rPr>
-            <w:noProof/>
-            <w:webHidden/>
-          </w:rPr>
-          <w:fldChar w:fldCharType="begin"/>
-        </w:r>
-        <w:r>
-          <w:rPr>
-            <w:noProof/>
-            <w:webHidden/>
-          </w:rPr>
-          <w:instrText xml:space="preserve"> PAGEREF _Toc218604871 \h </w:instrText>
-        </w:r>
-        <w:r>
-          <w:rPr>
-            <w:noProof/>
-            <w:webHidden/>
-          </w:rPr>
-        </w:r>
-        <w:r>
-          <w:rPr>
-            <w:noProof/>
-            <w:webHidden/>
-          </w:rPr>
-          <w:fldChar w:fldCharType="separate"/>
-        </w:r>
-        <w:r>
-          <w:rPr>
-            <w:noProof/>
-            <w:webHidden/>
-          </w:rPr>
-          <w:t>11</w:t>
-        </w:r>
-        <w:r>
-          <w:rPr>
-            <w:noProof/>
-            <w:webHidden/>
-          </w:rPr>
-          <w:fldChar w:fldCharType="end"/>
-        </w:r>
-      </w:hyperlink>
-    </w:p>
-    <w:p>
-      <w:pPr>
-        <w:pStyle w:val="TM2"/>
-        <w:tabs>
-          <w:tab w:val="right" w:leader="underscore" w:pos="9062"/>
-        </w:tabs>
-        <w:rPr>
-          <w:rFonts w:eastAsiaTheme="minorEastAsia"/>
-          <w:b w:val="0"/>
-          <w:bCs w:val="0"/>
-          <w:noProof/>
-          <w:sz w:val="24"/>
-          <w:szCs w:val="24"/>
-          <w:lang w:eastAsia="fr-FR"/>
-        </w:rPr>
-      </w:pPr>
-      <w:hyperlink w:anchor="_Toc218604872" w:history="1">
-        <w:r>
-          <w:rPr>
-            <w:rStyle w:val="Lienhypertexte"/>
-            <w:noProof/>
-          </w:rPr>
-          <w:t>L'héritage du modèle étendu est utilisé dans une vue (affichage d'un champ parent ou modification d'une des vues du modèle parent)</w:t>
-        </w:r>
-        <w:r>
-          <w:rPr>
-            <w:noProof/>
-            <w:webHidden/>
-          </w:rPr>
-          <w:tab/>
-        </w:r>
-        <w:r>
-          <w:rPr>
-            <w:noProof/>
-            <w:webHidden/>
-          </w:rPr>
-          <w:fldChar w:fldCharType="begin"/>
-        </w:r>
-        <w:r>
-          <w:rPr>
-            <w:noProof/>
-            <w:webHidden/>
-          </w:rPr>
-          <w:instrText xml:space="preserve"> PAGEREF _Toc218604872 \h </w:instrText>
-        </w:r>
-        <w:r>
-          <w:rPr>
-            <w:noProof/>
-            <w:webHidden/>
-          </w:rPr>
-        </w:r>
-        <w:r>
-          <w:rPr>
-            <w:noProof/>
-            <w:webHidden/>
-          </w:rPr>
-          <w:fldChar w:fldCharType="separate"/>
-        </w:r>
-        <w:r>
-          <w:rPr>
-            <w:noProof/>
-            <w:webHidden/>
-          </w:rPr>
-          <w:t>11</w:t>
-        </w:r>
-        <w:r>
-          <w:rPr>
-            <w:noProof/>
-            <w:webHidden/>
-          </w:rPr>
-          <w:fldChar w:fldCharType="end"/>
-        </w:r>
-      </w:hyperlink>
-    </w:p>
-    <w:p>
-      <w:pPr>
-        <w:pStyle w:val="TM2"/>
-        <w:tabs>
-          <w:tab w:val="right" w:leader="underscore" w:pos="9062"/>
-        </w:tabs>
-        <w:rPr>
-          <w:rFonts w:eastAsiaTheme="minorEastAsia"/>
-          <w:b w:val="0"/>
-          <w:bCs w:val="0"/>
-          <w:noProof/>
-          <w:sz w:val="24"/>
-          <w:szCs w:val="24"/>
-          <w:lang w:eastAsia="fr-FR"/>
-        </w:rPr>
-      </w:pPr>
-      <w:hyperlink w:anchor="_Toc218604873" w:history="1">
-        <w:r>
-          <w:rPr>
-            <w:rStyle w:val="Lienhypertexte"/>
-            <w:noProof/>
-          </w:rPr>
-          <w:t>Un ou plusieurs champs ne sont visibles que pour un groupe d'utilisateur ou en fonction de la valeur d'un autre champ.</w:t>
-        </w:r>
-        <w:r>
-          <w:rPr>
-            <w:noProof/>
-            <w:webHidden/>
-          </w:rPr>
-          <w:tab/>
-        </w:r>
-        <w:r>
-          <w:rPr>
-            <w:noProof/>
-            <w:webHidden/>
-          </w:rPr>
-          <w:fldChar w:fldCharType="begin"/>
-        </w:r>
-        <w:r>
-          <w:rPr>
-            <w:noProof/>
-            <w:webHidden/>
-          </w:rPr>
-          <w:instrText xml:space="preserve"> PAGEREF _Toc218604873 \h </w:instrText>
-        </w:r>
-        <w:r>
-          <w:rPr>
-            <w:noProof/>
-            <w:webHidden/>
-          </w:rPr>
-        </w:r>
-        <w:r>
-          <w:rPr>
-            <w:noProof/>
-            <w:webHidden/>
-          </w:rPr>
-          <w:fldChar w:fldCharType="separate"/>
-        </w:r>
-        <w:r>
-          <w:rPr>
-            <w:noProof/>
-            <w:webHidden/>
-          </w:rPr>
-          <w:t>11</w:t>
-        </w:r>
-        <w:r>
-          <w:rPr>
-            <w:noProof/>
-            <w:webHidden/>
-          </w:rPr>
-          <w:fldChar w:fldCharType="end"/>
-        </w:r>
-      </w:hyperlink>
-    </w:p>
-    <w:p>
       <w:r>
         <w:fldChar w:fldCharType="end"/>
       </w:r>
     </w:p>
-    <w:p/>
-    <w:p>
-      <w:r>
-        <w:lastRenderedPageBreak/>
-        <w:br w:type="page"/>
-      </w:r>
-    </w:p>
-    <w:p>
-      <w:pPr>
-        <w:pStyle w:val="Titre1"/>
+    <w:p>
+      <w:pPr>
+        <w:rPr>
+          <w:rFonts w:asciiTheme="majorHAnsi" w:eastAsiaTheme="majorEastAsia" w:hAnsiTheme="majorHAnsi" w:cstheme="majorBidi"/>
+          <w:color w:val="0F4761" w:themeColor="accent1" w:themeShade="BF"/>
+          <w:sz w:val="40"/>
+          <w:szCs w:val="40"/>
+        </w:rPr>
       </w:pPr>
       <w:bookmarkStart w:id="0" w:name="_Toc215649236"/>
       <w:bookmarkStart w:id="1" w:name="_Toc218604851"/>
       <w:r>
+        <w:br w:type="page"/>
+      </w:r>
+    </w:p>
+    <w:p>
+      <w:pPr>
+        <w:pStyle w:val="Titre1"/>
+      </w:pPr>
+      <w:bookmarkStart w:id="2" w:name="_Toc218839494"/>
+      <w:r>
         <w:lastRenderedPageBreak/>
         <w:t>Mise en place et Environnement</w:t>
       </w:r>
       <w:bookmarkEnd w:id="0"/>
       <w:bookmarkEnd w:id="1"/>
+      <w:bookmarkEnd w:id="2"/>
     </w:p>
     <w:p>
       <w:r>
@@ -2115,23 +2621,7 @@
             <w:b/>
             <w:bCs/>
           </w:rPr>
-          <w:t>http:</w:t>
-        </w:r>
-        <w:r>
-          <w:rPr>
-            <w:rStyle w:val="Lienhypertexte"/>
-            <w:b/>
-            <w:bCs/>
-          </w:rPr>
-          <w:t>/</w:t>
-        </w:r>
-        <w:r>
-          <w:rPr>
-            <w:rStyle w:val="Lienhypertexte"/>
-            <w:b/>
-            <w:bCs/>
-          </w:rPr>
-          <w:t>/localhost:8069</w:t>
+          <w:t>http://localhost:8069</w:t>
         </w:r>
       </w:hyperlink>
       <w:r>
@@ -2202,30 +2692,22 @@
       <w:pPr>
         <w:pStyle w:val="Lgende"/>
       </w:pPr>
+      <w:bookmarkStart w:id="3" w:name="_Toc218839523"/>
       <w:r>
         <w:t xml:space="preserve">Figure </w:t>
       </w:r>
-      <w:r>
-        <w:fldChar w:fldCharType="begin"/>
-      </w:r>
-      <w:r>
-        <w:instrText xml:space="preserve"> SEQ Figure \* ARABIC </w:instrText>
-      </w:r>
-      <w:r>
-        <w:fldChar w:fldCharType="separate"/>
-      </w:r>
-      <w:r>
-        <w:rPr>
-          <w:noProof/>
-        </w:rPr>
-        <w:t>1</w:t>
-      </w:r>
-      <w:r>
-        <w:fldChar w:fldCharType="end"/>
-      </w:r>
+      <w:fldSimple w:instr=" SEQ Figure \* ARABIC ">
+        <w:r>
+          <w:rPr>
+            <w:noProof/>
+          </w:rPr>
+          <w:t>1</w:t>
+        </w:r>
+      </w:fldSimple>
       <w:r>
         <w:t xml:space="preserve"> : Remplissage du formulaire de Base de Données</w:t>
       </w:r>
+      <w:bookmarkEnd w:id="3"/>
     </w:p>
     <w:p>
       <w:r>
@@ -2299,13 +2781,8 @@
         <w:t>Contacts</w:t>
       </w:r>
       <w:r>
-        <w:t xml:space="preserve">, et évidement </w:t>
-      </w:r>
-      <w:proofErr w:type="spellStart"/>
-      <w:r>
-        <w:t>Cyberware</w:t>
-      </w:r>
-      <w:proofErr w:type="spellEnd"/>
+        <w:t>, et évidement Cyberware</w:t>
+      </w:r>
       <w:r>
         <w:t xml:space="preserve">. </w:t>
       </w:r>
@@ -2314,26 +2791,30 @@
       <w:pPr>
         <w:pStyle w:val="Titre1"/>
       </w:pPr>
-      <w:bookmarkStart w:id="2" w:name="_Toc215649237"/>
-      <w:bookmarkStart w:id="3" w:name="_Toc218604852"/>
+      <w:bookmarkStart w:id="4" w:name="_Toc215649237"/>
+      <w:bookmarkStart w:id="5" w:name="_Toc218604852"/>
+      <w:bookmarkStart w:id="6" w:name="_Toc218839495"/>
       <w:r>
         <w:lastRenderedPageBreak/>
         <w:t>Groupe de sécurité</w:t>
       </w:r>
-      <w:bookmarkEnd w:id="2"/>
-      <w:bookmarkEnd w:id="3"/>
-    </w:p>
-    <w:p>
-      <w:pPr>
-        <w:pStyle w:val="Titre2"/>
-      </w:pPr>
-      <w:bookmarkStart w:id="4" w:name="_Toc215649238"/>
-      <w:bookmarkStart w:id="5" w:name="_Toc218604853"/>
-      <w:r>
-        <w:t>Il y a aux moins deux groupes de sécurité</w:t>
-      </w:r>
       <w:bookmarkEnd w:id="4"/>
       <w:bookmarkEnd w:id="5"/>
+      <w:bookmarkEnd w:id="6"/>
+    </w:p>
+    <w:p>
+      <w:pPr>
+        <w:pStyle w:val="Titre2"/>
+      </w:pPr>
+      <w:bookmarkStart w:id="7" w:name="_Toc215649238"/>
+      <w:bookmarkStart w:id="8" w:name="_Toc218604853"/>
+      <w:bookmarkStart w:id="9" w:name="_Toc218839496"/>
+      <w:r>
+        <w:t>Il y a aux moins deux groupes de sécurité</w:t>
+      </w:r>
+      <w:bookmarkEnd w:id="7"/>
+      <w:bookmarkEnd w:id="8"/>
+      <w:bookmarkEnd w:id="9"/>
     </w:p>
     <w:p>
       <w:r>
@@ -2508,16 +2989,35 @@
       </w:r>
     </w:p>
     <w:p>
+      <w:r>
+        <w:t>Pour vérifier l’existence de ces groupes, vous pouvez aller dans Paramètres -&gt; activer le mode développeur. Ensuite, toujours dans paramètres, cliquer sur « U</w:t>
+      </w:r>
+      <w:r>
+        <w:t xml:space="preserve">tilisateurs </w:t>
+      </w:r>
+      <w:r>
+        <w:t>&amp;</w:t>
+      </w:r>
+      <w:r>
+        <w:t xml:space="preserve"> sociétés</w:t>
+      </w:r>
+      <w:r>
+        <w:t> » -&gt; Groupes -&gt; Rechercher cyberware.</w:t>
+      </w:r>
+    </w:p>
+    <w:p>
       <w:pPr>
         <w:pStyle w:val="Titre2"/>
       </w:pPr>
-      <w:bookmarkStart w:id="6" w:name="_Toc215649239"/>
-      <w:bookmarkStart w:id="7" w:name="_Toc218604854"/>
+      <w:bookmarkStart w:id="10" w:name="_Toc215649239"/>
+      <w:bookmarkStart w:id="11" w:name="_Toc218604854"/>
+      <w:bookmarkStart w:id="12" w:name="_Toc218839497"/>
       <w:r>
         <w:t>Des droits d'accès différents aux modèles ont été accordés aux groupes de sécurité</w:t>
       </w:r>
-      <w:bookmarkEnd w:id="6"/>
-      <w:bookmarkEnd w:id="7"/>
+      <w:bookmarkEnd w:id="10"/>
+      <w:bookmarkEnd w:id="11"/>
+      <w:bookmarkEnd w:id="12"/>
     </w:p>
     <w:p>
       <w:r>
@@ -2604,34 +3104,33 @@
     <w:p/>
     <w:p/>
     <w:p>
-      <w:r>
-        <w:br w:type="page"/>
-      </w:r>
-    </w:p>
-    <w:p>
       <w:pPr>
         <w:pStyle w:val="Titre1"/>
       </w:pPr>
-      <w:bookmarkStart w:id="8" w:name="_Toc215649240"/>
-      <w:bookmarkStart w:id="9" w:name="_Toc218604855"/>
+      <w:bookmarkStart w:id="13" w:name="_Toc215649240"/>
+      <w:bookmarkStart w:id="14" w:name="_Toc218604855"/>
+      <w:bookmarkStart w:id="15" w:name="_Toc218839498"/>
       <w:r>
         <w:lastRenderedPageBreak/>
         <w:t>Modèles</w:t>
       </w:r>
-      <w:bookmarkEnd w:id="8"/>
-      <w:bookmarkEnd w:id="9"/>
+      <w:bookmarkEnd w:id="13"/>
+      <w:bookmarkEnd w:id="14"/>
+      <w:bookmarkEnd w:id="15"/>
     </w:p>
     <w:p>
       <w:pPr>
         <w:pStyle w:val="Titre2"/>
       </w:pPr>
-      <w:bookmarkStart w:id="10" w:name="_Toc215649241"/>
-      <w:bookmarkStart w:id="11" w:name="_Toc218604856"/>
+      <w:bookmarkStart w:id="16" w:name="_Toc215649241"/>
+      <w:bookmarkStart w:id="17" w:name="_Toc218604856"/>
+      <w:bookmarkStart w:id="18" w:name="_Toc218839499"/>
       <w:r>
         <w:t>Il y a plusieurs modèles.</w:t>
       </w:r>
-      <w:bookmarkEnd w:id="10"/>
-      <w:bookmarkEnd w:id="11"/>
+      <w:bookmarkEnd w:id="16"/>
+      <w:bookmarkEnd w:id="17"/>
+      <w:bookmarkEnd w:id="18"/>
     </w:p>
     <w:p>
       <w:pPr>
@@ -2709,8 +3208,9 @@
       <w:pPr>
         <w:pStyle w:val="Titre2"/>
       </w:pPr>
-      <w:bookmarkStart w:id="12" w:name="_Toc215649242"/>
-      <w:bookmarkStart w:id="13" w:name="_Toc218604857"/>
+      <w:bookmarkStart w:id="19" w:name="_Toc215649242"/>
+      <w:bookmarkStart w:id="20" w:name="_Toc218604857"/>
+      <w:bookmarkStart w:id="21" w:name="_Toc218839500"/>
       <w:r>
         <w:t>Il y a dans au moins un modèle un champ textuel, un champ numérique, un champ date</w:t>
       </w:r>
@@ -2726,14 +3226,15 @@
       <w:r>
         <w:t xml:space="preserve"> un champ select</w:t>
       </w:r>
-      <w:bookmarkEnd w:id="12"/>
+      <w:bookmarkEnd w:id="19"/>
       <w:r>
         <w:t xml:space="preserve">, </w:t>
       </w:r>
       <w:r>
         <w:t>un champ calculé et un champ related.</w:t>
       </w:r>
-      <w:bookmarkEnd w:id="13"/>
+      <w:bookmarkEnd w:id="20"/>
+      <w:bookmarkEnd w:id="21"/>
     </w:p>
     <w:p>
       <w:r>
@@ -2982,13 +3483,15 @@
       <w:pPr>
         <w:pStyle w:val="Titre2"/>
       </w:pPr>
-      <w:bookmarkStart w:id="14" w:name="_Toc215649243"/>
-      <w:bookmarkStart w:id="15" w:name="_Toc218604858"/>
+      <w:bookmarkStart w:id="22" w:name="_Toc215649243"/>
+      <w:bookmarkStart w:id="23" w:name="_Toc218604858"/>
+      <w:bookmarkStart w:id="24" w:name="_Toc218839501"/>
       <w:r>
         <w:t>Il y a au moins dans un modèle une méthode qui contrôle des données.</w:t>
       </w:r>
-      <w:bookmarkEnd w:id="14"/>
-      <w:bookmarkEnd w:id="15"/>
+      <w:bookmarkEnd w:id="22"/>
+      <w:bookmarkEnd w:id="23"/>
+      <w:bookmarkEnd w:id="24"/>
     </w:p>
     <w:p>
       <w:pPr>
@@ -3088,36 +3591,19 @@
         <w:ind w:firstLine="708"/>
       </w:pPr>
       <w:r>
-        <w:t xml:space="preserve">Vous pouvez tester le fonctionnement ce cette fonctionnalité depuis n’importe quel </w:t>
-      </w:r>
-      <w:proofErr w:type="spellStart"/>
-      <w:r>
-        <w:t>cyberware</w:t>
-      </w:r>
-      <w:proofErr w:type="spellEnd"/>
-      <w:r>
-        <w:t xml:space="preserve"> (ex : </w:t>
-      </w:r>
-      <w:hyperlink r:id="rId12" w:history="1">
-        <w:r>
-          <w:rPr>
-            <w:rStyle w:val="Lienhypertexte"/>
-          </w:rPr>
-          <w:t>http://localhost:</w:t>
-        </w:r>
-        <w:r>
-          <w:rPr>
-            <w:rStyle w:val="Lienhypertexte"/>
-          </w:rPr>
-          <w:t>8</w:t>
-        </w:r>
-        <w:r>
-          <w:rPr>
-            <w:rStyle w:val="Lienhypertexte"/>
-          </w:rPr>
-          <w:t>069/odoo/action-480/13</w:t>
-        </w:r>
-      </w:hyperlink>
+        <w:t>Vous pouvez tester le fonctionnement ce cette fonctionnalité depuis n’importe quel cyberware (</w:t>
+      </w:r>
+      <w:r>
+        <w:t xml:space="preserve">donc pour y </w:t>
+      </w:r>
+      <w:proofErr w:type="gramStart"/>
+      <w:r>
+        <w:t>accéder,  depuis</w:t>
+      </w:r>
+      <w:proofErr w:type="gramEnd"/>
+      <w:r>
+        <w:t xml:space="preserve"> la page d’accueil, sélectionnez un cyberware</w:t>
+      </w:r>
       <w:r>
         <w:t xml:space="preserve">), en faisant une modification « interdite » puis en enregistrant. </w:t>
       </w:r>
@@ -3126,13 +3612,15 @@
       <w:pPr>
         <w:pStyle w:val="Titre2"/>
       </w:pPr>
-      <w:bookmarkStart w:id="16" w:name="_Toc215649244"/>
-      <w:bookmarkStart w:id="17" w:name="_Toc218604859"/>
+      <w:bookmarkStart w:id="25" w:name="_Toc215649244"/>
+      <w:bookmarkStart w:id="26" w:name="_Toc218604859"/>
+      <w:bookmarkStart w:id="27" w:name="_Toc218839502"/>
       <w:r>
         <w:t>Il existe au moins une relation un à plusieurs et une relation plusieurs à plusieurs.</w:t>
       </w:r>
-      <w:bookmarkEnd w:id="16"/>
-      <w:bookmarkEnd w:id="17"/>
+      <w:bookmarkEnd w:id="25"/>
+      <w:bookmarkEnd w:id="26"/>
+      <w:bookmarkEnd w:id="27"/>
     </w:p>
     <w:p>
       <w:pPr>
@@ -3162,11 +3650,13 @@
       <w:pPr>
         <w:pStyle w:val="Titre3"/>
       </w:pPr>
-      <w:bookmarkStart w:id="18" w:name="_Toc218604860"/>
+      <w:bookmarkStart w:id="28" w:name="_Toc218604860"/>
+      <w:bookmarkStart w:id="29" w:name="_Toc218839503"/>
       <w:r>
         <w:t>Relation "Un à Plusieurs"</w:t>
       </w:r>
-      <w:bookmarkEnd w:id="18"/>
+      <w:bookmarkEnd w:id="28"/>
+      <w:bookmarkEnd w:id="29"/>
     </w:p>
     <w:p>
       <w:pPr>
@@ -3195,11 +3685,13 @@
       <w:pPr>
         <w:pStyle w:val="Titre3"/>
       </w:pPr>
-      <w:bookmarkStart w:id="19" w:name="_Toc218604861"/>
+      <w:bookmarkStart w:id="30" w:name="_Toc218604861"/>
+      <w:bookmarkStart w:id="31" w:name="_Toc218839504"/>
       <w:r>
         <w:t>Relation "Plusieurs à Plusieurs"</w:t>
       </w:r>
-      <w:bookmarkEnd w:id="19"/>
+      <w:bookmarkEnd w:id="30"/>
+      <w:bookmarkEnd w:id="31"/>
     </w:p>
     <w:p>
       <w:pPr>
@@ -3225,13 +3717,15 @@
       <w:pPr>
         <w:pStyle w:val="Titre2"/>
       </w:pPr>
-      <w:bookmarkStart w:id="20" w:name="_Toc215649245"/>
-      <w:bookmarkStart w:id="21" w:name="_Toc218604862"/>
+      <w:bookmarkStart w:id="32" w:name="_Toc215649245"/>
+      <w:bookmarkStart w:id="33" w:name="_Toc218604862"/>
+      <w:bookmarkStart w:id="34" w:name="_Toc218839505"/>
       <w:r>
         <w:t>Il existe des données de démo au format xml. Certains enregistrements sont liés par les relations d'autres non.</w:t>
       </w:r>
-      <w:bookmarkEnd w:id="20"/>
-      <w:bookmarkEnd w:id="21"/>
+      <w:bookmarkEnd w:id="32"/>
+      <w:bookmarkEnd w:id="33"/>
+      <w:bookmarkEnd w:id="34"/>
     </w:p>
     <w:p>
       <w:pPr>
@@ -3323,14 +3817,16 @@
       <w:pPr>
         <w:pStyle w:val="Titre2"/>
       </w:pPr>
-      <w:bookmarkStart w:id="22" w:name="_Toc215649246"/>
-      <w:bookmarkStart w:id="23" w:name="_Toc218604863"/>
+      <w:bookmarkStart w:id="35" w:name="_Toc215649246"/>
+      <w:bookmarkStart w:id="36" w:name="_Toc218604863"/>
+      <w:bookmarkStart w:id="37" w:name="_Toc218839506"/>
       <w:r>
         <w:lastRenderedPageBreak/>
         <w:t>Un des modèles étend un modèle d’Odoo.</w:t>
       </w:r>
-      <w:bookmarkEnd w:id="22"/>
-      <w:bookmarkEnd w:id="23"/>
+      <w:bookmarkEnd w:id="35"/>
+      <w:bookmarkEnd w:id="36"/>
+      <w:bookmarkEnd w:id="37"/>
     </w:p>
     <w:p>
       <w:pPr>
@@ -3402,25 +3898,29 @@
       <w:pPr>
         <w:pStyle w:val="Titre1"/>
       </w:pPr>
-      <w:bookmarkStart w:id="24" w:name="_Toc215649247"/>
-      <w:bookmarkStart w:id="25" w:name="_Toc218604864"/>
+      <w:bookmarkStart w:id="38" w:name="_Toc215649247"/>
+      <w:bookmarkStart w:id="39" w:name="_Toc218604864"/>
+      <w:bookmarkStart w:id="40" w:name="_Toc218839507"/>
       <w:r>
         <w:t>Vues</w:t>
       </w:r>
-      <w:bookmarkEnd w:id="24"/>
-      <w:bookmarkEnd w:id="25"/>
+      <w:bookmarkEnd w:id="38"/>
+      <w:bookmarkEnd w:id="39"/>
+      <w:bookmarkEnd w:id="40"/>
     </w:p>
     <w:p>
       <w:pPr>
         <w:pStyle w:val="Titre2"/>
       </w:pPr>
-      <w:bookmarkStart w:id="26" w:name="_Toc215649248"/>
-      <w:bookmarkStart w:id="27" w:name="_Toc218604865"/>
+      <w:bookmarkStart w:id="41" w:name="_Toc215649248"/>
+      <w:bookmarkStart w:id="42" w:name="_Toc218604865"/>
+      <w:bookmarkStart w:id="43" w:name="_Toc218839508"/>
       <w:r>
         <w:t>Il existe une vue liste personnalisée.</w:t>
       </w:r>
-      <w:bookmarkEnd w:id="26"/>
-      <w:bookmarkEnd w:id="27"/>
+      <w:bookmarkEnd w:id="41"/>
+      <w:bookmarkEnd w:id="42"/>
+      <w:bookmarkEnd w:id="43"/>
     </w:p>
     <w:p>
       <w:pPr>
@@ -3456,7 +3956,7 @@
       <w:r>
         <w:t xml:space="preserve">. Pour y accéder sur le site, il suffit de naviguer via l'URL </w:t>
       </w:r>
-      <w:hyperlink r:id="rId13" w:history="1">
+      <w:hyperlink r:id="rId12" w:history="1">
         <w:r>
           <w:rPr>
             <w:rStyle w:val="Lienhypertexte"/>
@@ -3470,6 +3970,72 @@
     </w:p>
     <w:p>
       <w:pPr>
+        <w:keepNext/>
+      </w:pPr>
+      <w:r>
+        <w:rPr>
+          <w:noProof/>
+        </w:rPr>
+        <w:drawing>
+          <wp:inline distT="0" distB="0" distL="0" distR="0" wp14:anchorId="14B30BC3" wp14:editId="282F798F">
+            <wp:extent cx="5760720" cy="3086100"/>
+            <wp:effectExtent l="0" t="0" r="0" b="0"/>
+            <wp:docPr id="1744188402" name="Image 1" descr="Une image contenant texte, capture d’écran, logiciel, Page web&#10;&#10;Le contenu généré par l’IA peut être incorrect."/>
+            <wp:cNvGraphicFramePr>
+              <a:graphicFrameLocks xmlns:a="http://schemas.openxmlformats.org/drawingml/2006/main" noChangeAspect="1"/>
+            </wp:cNvGraphicFramePr>
+            <a:graphic xmlns:a="http://schemas.openxmlformats.org/drawingml/2006/main">
+              <a:graphicData uri="http://schemas.openxmlformats.org/drawingml/2006/picture">
+                <pic:pic xmlns:pic="http://schemas.openxmlformats.org/drawingml/2006/picture">
+                  <pic:nvPicPr>
+                    <pic:cNvPr id="1744188402" name="Image 1" descr="Une image contenant texte, capture d’écran, logiciel, Page web&#10;&#10;Le contenu généré par l’IA peut être incorrect."/>
+                    <pic:cNvPicPr/>
+                  </pic:nvPicPr>
+                  <pic:blipFill>
+                    <a:blip r:embed="rId13"/>
+                    <a:stretch>
+                      <a:fillRect/>
+                    </a:stretch>
+                  </pic:blipFill>
+                  <pic:spPr>
+                    <a:xfrm>
+                      <a:off x="0" y="0"/>
+                      <a:ext cx="5760720" cy="3086100"/>
+                    </a:xfrm>
+                    <a:prstGeom prst="rect">
+                      <a:avLst/>
+                    </a:prstGeom>
+                  </pic:spPr>
+                </pic:pic>
+              </a:graphicData>
+            </a:graphic>
+          </wp:inline>
+        </w:drawing>
+      </w:r>
+    </w:p>
+    <w:p>
+      <w:pPr>
+        <w:pStyle w:val="Lgende"/>
+      </w:pPr>
+      <w:bookmarkStart w:id="44" w:name="_Toc218839524"/>
+      <w:r>
+        <w:t xml:space="preserve">Figure </w:t>
+      </w:r>
+      <w:fldSimple w:instr=" SEQ Figure \* ARABIC ">
+        <w:r>
+          <w:rPr>
+            <w:noProof/>
+          </w:rPr>
+          <w:t>2</w:t>
+        </w:r>
+      </w:fldSimple>
+      <w:r>
+        <w:t xml:space="preserve"> : Sélectionner la vue liste personnalisée</w:t>
+      </w:r>
+      <w:bookmarkEnd w:id="44"/>
+    </w:p>
+    <w:p>
+      <w:pPr>
         <w:ind w:firstLine="708"/>
       </w:pPr>
       <w:r>
@@ -3481,20 +4047,26 @@
       </w:r>
       <w:proofErr w:type="spellEnd"/>
       <w:r>
-        <w:t>), son type, sa rareté et son prix. Cela permet à l'utilisateur une lecture immédiate et fonctionnelle des produits disponibles.</w:t>
+        <w:t xml:space="preserve">), son type, sa rareté </w:t>
+      </w:r>
+      <w:r>
+        <w:lastRenderedPageBreak/>
+        <w:t>et son prix. Cela permet à l'utilisateur une lecture immédiate et fonctionnelle des produits disponibles.</w:t>
       </w:r>
     </w:p>
     <w:p>
       <w:pPr>
         <w:pStyle w:val="Titre2"/>
       </w:pPr>
-      <w:bookmarkStart w:id="28" w:name="_Toc215649249"/>
-      <w:bookmarkStart w:id="29" w:name="_Toc218604866"/>
+      <w:bookmarkStart w:id="45" w:name="_Toc215649249"/>
+      <w:bookmarkStart w:id="46" w:name="_Toc218604866"/>
+      <w:bookmarkStart w:id="47" w:name="_Toc218839509"/>
       <w:r>
         <w:t>Il existe une vue formulaire personnalisée.</w:t>
       </w:r>
-      <w:bookmarkEnd w:id="28"/>
-      <w:bookmarkEnd w:id="29"/>
+      <w:bookmarkEnd w:id="45"/>
+      <w:bookmarkEnd w:id="46"/>
+      <w:bookmarkEnd w:id="47"/>
     </w:p>
     <w:p>
       <w:pPr>
@@ -3536,19 +4108,11 @@
         <w:ind w:firstLine="708"/>
       </w:pPr>
       <w:r>
-        <w:t>Accès à la vue sur le site : Cette vue est accessible en cliquant sur n'importe quel enregistrement existant depuis la vue liste. L'URL affichée par Odoo est de la forme :</w:t>
-      </w:r>
-      <w:r>
-        <w:t xml:space="preserve"> </w:t>
-      </w:r>
-      <w:hyperlink r:id="rId14" w:history="1">
-        <w:r>
-          <w:rPr>
-            <w:rStyle w:val="Lienhypertexte"/>
-          </w:rPr>
-          <w:t>http://localhost:8069/odoo/action-480/13</w:t>
-        </w:r>
-      </w:hyperlink>
+        <w:t>Accès à la vue sur le site</w:t>
+      </w:r>
+      <w:r>
+        <w:t>, vous pouvez essayer de créer un nouvel implant grâce au bouton dédié de la page d’accueil</w:t>
+      </w:r>
       <w:r>
         <w:t>.</w:t>
       </w:r>
@@ -3557,13 +4121,15 @@
       <w:pPr>
         <w:pStyle w:val="Titre2"/>
       </w:pPr>
-      <w:bookmarkStart w:id="30" w:name="_Toc215649250"/>
-      <w:bookmarkStart w:id="31" w:name="_Toc218604867"/>
+      <w:bookmarkStart w:id="48" w:name="_Toc215649250"/>
+      <w:bookmarkStart w:id="49" w:name="_Toc218604867"/>
+      <w:bookmarkStart w:id="50" w:name="_Toc218839510"/>
       <w:r>
         <w:t>Il existe un champ recherche personnalisé.</w:t>
       </w:r>
-      <w:bookmarkEnd w:id="30"/>
-      <w:bookmarkEnd w:id="31"/>
+      <w:bookmarkEnd w:id="48"/>
+      <w:bookmarkEnd w:id="49"/>
+      <w:bookmarkEnd w:id="50"/>
     </w:p>
     <w:p>
       <w:pPr>
@@ -3605,42 +4171,112 @@
         <w:ind w:firstLine="708"/>
       </w:pPr>
       <w:r>
-        <w:lastRenderedPageBreak/>
-        <w:t xml:space="preserve">Accès à la vue sur le site : La vue est accessible dans l'interface Odoo via la barre de recherche et les menus Filtres et Grouper par, qui apparaissent lorsque l'on navigue vers le menu </w:t>
+        <w:t xml:space="preserve">Accès à la vue sur le site : La vue est accessible dans l'interface Odoo via la barre de recherche et les menus Filtres et </w:t>
+      </w:r>
+      <w:r>
+        <w:t>Reg</w:t>
+      </w:r>
+      <w:r>
+        <w:t xml:space="preserve">rouper par, qui apparaissent lorsque l'on navigue vers le menu Cyberware </w:t>
+      </w:r>
+      <w:r>
+        <w:t>de</w:t>
+      </w:r>
+      <w:r>
+        <w:t>puis</w:t>
+      </w:r>
+      <w:r>
+        <w:t xml:space="preserve"> la page Implants</w:t>
+      </w:r>
+      <w:r>
+        <w:t>.</w:t>
+      </w:r>
+    </w:p>
+    <w:p>
+      <w:pPr>
+        <w:keepNext/>
+      </w:pPr>
+      <w:r>
+        <w:rPr>
+          <w:noProof/>
+        </w:rPr>
+        <w:drawing>
+          <wp:inline distT="0" distB="0" distL="0" distR="0" wp14:anchorId="03F1BA6E" wp14:editId="122A3C7A">
+            <wp:extent cx="5760720" cy="1129030"/>
+            <wp:effectExtent l="0" t="0" r="0" b="0"/>
+            <wp:docPr id="1944239353" name="Image 1" descr="Une image contenant texte, capture d’écran, logiciel, Page web&#10;&#10;Le contenu généré par l’IA peut être incorrect."/>
+            <wp:cNvGraphicFramePr>
+              <a:graphicFrameLocks xmlns:a="http://schemas.openxmlformats.org/drawingml/2006/main" noChangeAspect="1"/>
+            </wp:cNvGraphicFramePr>
+            <a:graphic xmlns:a="http://schemas.openxmlformats.org/drawingml/2006/main">
+              <a:graphicData uri="http://schemas.openxmlformats.org/drawingml/2006/picture">
+                <pic:pic xmlns:pic="http://schemas.openxmlformats.org/drawingml/2006/picture">
+                  <pic:nvPicPr>
+                    <pic:cNvPr id="1944239353" name="Image 1" descr="Une image contenant texte, capture d’écran, logiciel, Page web&#10;&#10;Le contenu généré par l’IA peut être incorrect."/>
+                    <pic:cNvPicPr/>
+                  </pic:nvPicPr>
+                  <pic:blipFill>
+                    <a:blip r:embed="rId14"/>
+                    <a:stretch>
+                      <a:fillRect/>
+                    </a:stretch>
+                  </pic:blipFill>
+                  <pic:spPr>
+                    <a:xfrm>
+                      <a:off x="0" y="0"/>
+                      <a:ext cx="5760720" cy="1129030"/>
+                    </a:xfrm>
+                    <a:prstGeom prst="rect">
+                      <a:avLst/>
+                    </a:prstGeom>
+                  </pic:spPr>
+                </pic:pic>
+              </a:graphicData>
+            </a:graphic>
+          </wp:inline>
+        </w:drawing>
+      </w:r>
+    </w:p>
+    <w:p>
+      <w:pPr>
+        <w:pStyle w:val="Lgende"/>
+      </w:pPr>
+      <w:bookmarkStart w:id="51" w:name="_Toc218839525"/>
+      <w:r>
+        <w:t xml:space="preserve">Figure </w:t>
+      </w:r>
+      <w:fldSimple w:instr=" SEQ Figure \* ARABIC ">
+        <w:r>
+          <w:rPr>
+            <w:noProof/>
+          </w:rPr>
+          <w:t>3</w:t>
+        </w:r>
+      </w:fldSimple>
+      <w:r>
+        <w:t xml:space="preserve"> : Localisation des filtres </w:t>
+      </w:r>
+      <w:r>
+        <w:rPr>
+          <w:noProof/>
+        </w:rPr>
+        <w:t>de recherche personnalisé</w:t>
+      </w:r>
+      <w:bookmarkEnd w:id="51"/>
+    </w:p>
+    <w:p>
+      <w:pPr>
+        <w:ind w:firstLine="708"/>
+      </w:pPr>
+      <w:r>
+        <w:t xml:space="preserve">J'ai configuré des filtres rapides </w:t>
       </w:r>
       <w:proofErr w:type="spellStart"/>
       <w:r>
-        <w:t>Cyberware</w:t>
+        <w:t>pré-définis</w:t>
       </w:r>
       <w:proofErr w:type="spellEnd"/>
       <w:r>
-        <w:t xml:space="preserve"> puis Implants (</w:t>
-      </w:r>
-      <w:hyperlink r:id="rId15" w:history="1">
-        <w:r>
-          <w:rPr>
-            <w:rStyle w:val="Lienhypertexte"/>
-          </w:rPr>
-          <w:t>http://localhost:8069/odoo/action-480</w:t>
-        </w:r>
-      </w:hyperlink>
-      <w:r>
-        <w:t>).</w:t>
-      </w:r>
-    </w:p>
-    <w:p>
-      <w:pPr>
-        <w:ind w:firstLine="708"/>
-      </w:pPr>
-      <w:r>
-        <w:t xml:space="preserve">J'ai configuré des filtres rapides </w:t>
-      </w:r>
-      <w:proofErr w:type="spellStart"/>
-      <w:r>
-        <w:t>pré-définis</w:t>
-      </w:r>
-      <w:proofErr w:type="spellEnd"/>
-      <w:r>
         <w:t>, comme le filtre "Légendaire" ou le filtre "Abordable (&lt; 5000€)". De plus, l'option Grouper par permet à l'utilisateur de classer dynamiquement le catalogue par Type d'implant, Rareté ou Emplacement corporel, ce qui est particulièrement utile avec la vue Kanban.</w:t>
       </w:r>
     </w:p>
@@ -3648,13 +4284,15 @@
       <w:pPr>
         <w:pStyle w:val="Titre2"/>
       </w:pPr>
-      <w:bookmarkStart w:id="32" w:name="_Toc215649251"/>
-      <w:bookmarkStart w:id="33" w:name="_Toc218604868"/>
+      <w:bookmarkStart w:id="52" w:name="_Toc215649251"/>
+      <w:bookmarkStart w:id="53" w:name="_Toc218604868"/>
+      <w:bookmarkStart w:id="54" w:name="_Toc218839511"/>
       <w:r>
         <w:t>Il existe une vue calendrier ou une vue kanban.</w:t>
       </w:r>
-      <w:bookmarkEnd w:id="32"/>
-      <w:bookmarkEnd w:id="33"/>
+      <w:bookmarkEnd w:id="52"/>
+      <w:bookmarkEnd w:id="53"/>
+      <w:bookmarkEnd w:id="54"/>
     </w:p>
     <w:p>
       <w:r>
@@ -3717,53 +4355,99 @@
         <w:t>.</w:t>
       </w:r>
       <w:r>
-        <w:t xml:space="preserve"> Vous pouvez y accéder grâce </w:t>
+        <w:t xml:space="preserve"> </w:t>
+      </w:r>
+    </w:p>
+    <w:p>
+      <w:pPr>
+        <w:keepNext/>
+      </w:pPr>
+      <w:r>
+        <w:rPr>
+          <w:noProof/>
+        </w:rPr>
+        <w:lastRenderedPageBreak/>
+        <w:drawing>
+          <wp:inline distT="0" distB="0" distL="0" distR="0" wp14:anchorId="4E877CA3" wp14:editId="728D1004">
+            <wp:extent cx="5760720" cy="3090545"/>
+            <wp:effectExtent l="0" t="0" r="0" b="0"/>
+            <wp:docPr id="1394947327" name="Image 1" descr="Une image contenant texte, capture d’écran, logiciel, Page web&#10;&#10;Le contenu généré par l’IA peut être incorrect."/>
+            <wp:cNvGraphicFramePr>
+              <a:graphicFrameLocks xmlns:a="http://schemas.openxmlformats.org/drawingml/2006/main" noChangeAspect="1"/>
+            </wp:cNvGraphicFramePr>
+            <a:graphic xmlns:a="http://schemas.openxmlformats.org/drawingml/2006/main">
+              <a:graphicData uri="http://schemas.openxmlformats.org/drawingml/2006/picture">
+                <pic:pic xmlns:pic="http://schemas.openxmlformats.org/drawingml/2006/picture">
+                  <pic:nvPicPr>
+                    <pic:cNvPr id="1394947327" name="Image 1" descr="Une image contenant texte, capture d’écran, logiciel, Page web&#10;&#10;Le contenu généré par l’IA peut être incorrect."/>
+                    <pic:cNvPicPr/>
+                  </pic:nvPicPr>
+                  <pic:blipFill>
+                    <a:blip r:embed="rId15"/>
+                    <a:stretch>
+                      <a:fillRect/>
+                    </a:stretch>
+                  </pic:blipFill>
+                  <pic:spPr>
+                    <a:xfrm>
+                      <a:off x="0" y="0"/>
+                      <a:ext cx="5760720" cy="3090545"/>
+                    </a:xfrm>
+                    <a:prstGeom prst="rect">
+                      <a:avLst/>
+                    </a:prstGeom>
+                  </pic:spPr>
+                </pic:pic>
+              </a:graphicData>
+            </a:graphic>
+          </wp:inline>
+        </w:drawing>
+      </w:r>
+    </w:p>
+    <w:p>
+      <w:pPr>
+        <w:pStyle w:val="Lgende"/>
+      </w:pPr>
+      <w:bookmarkStart w:id="55" w:name="_Toc218839526"/>
+      <w:r>
+        <w:t xml:space="preserve">Figure </w:t>
+      </w:r>
+      <w:fldSimple w:instr=" SEQ Figure \* ARABIC ">
+        <w:r>
+          <w:rPr>
+            <w:noProof/>
+          </w:rPr>
+          <w:t>4</w:t>
+        </w:r>
+      </w:fldSimple>
+      <w:r>
+        <w:t xml:space="preserve"> : Accéder </w:t>
       </w:r>
       <w:proofErr w:type="spellStart"/>
+      <w:proofErr w:type="gramStart"/>
       <w:r>
         <w:t>a</w:t>
       </w:r>
       <w:proofErr w:type="spellEnd"/>
-      <w:r>
-        <w:t xml:space="preserve"> ces liens : </w:t>
-      </w:r>
-      <w:hyperlink r:id="rId16" w:history="1">
-        <w:r>
-          <w:rPr>
-            <w:rStyle w:val="Lienhypertexte"/>
-          </w:rPr>
-          <w:t>http://localhost:8069/odoo/action-480</w:t>
-        </w:r>
-      </w:hyperlink>
-      <w:r>
-        <w:t xml:space="preserve">, </w:t>
-      </w:r>
-      <w:hyperlink r:id="rId17" w:history="1">
-        <w:r>
-          <w:rPr>
-            <w:rStyle w:val="Lienhypertexte"/>
-          </w:rPr>
-          <w:t>http://localhost:8069/odoo/action-481</w:t>
-        </w:r>
-      </w:hyperlink>
-      <w:r>
-        <w:t>.</w:t>
-      </w:r>
-      <w:r>
-        <w:t xml:space="preserve"> </w:t>
-      </w:r>
+      <w:proofErr w:type="gramEnd"/>
+      <w:r>
+        <w:t xml:space="preserve"> la vue Kanban</w:t>
+      </w:r>
+      <w:bookmarkEnd w:id="55"/>
     </w:p>
     <w:p>
       <w:pPr>
         <w:pStyle w:val="Titre2"/>
       </w:pPr>
-      <w:bookmarkStart w:id="34" w:name="_Toc215649252"/>
-      <w:bookmarkStart w:id="35" w:name="_Toc218604869"/>
+      <w:bookmarkStart w:id="56" w:name="_Toc215649252"/>
+      <w:bookmarkStart w:id="57" w:name="_Toc218604869"/>
+      <w:bookmarkStart w:id="58" w:name="_Toc218839512"/>
       <w:r>
         <w:t>Une page web est disponible.</w:t>
       </w:r>
-      <w:bookmarkEnd w:id="34"/>
-      <w:bookmarkEnd w:id="35"/>
+      <w:bookmarkEnd w:id="56"/>
+      <w:bookmarkEnd w:id="57"/>
+      <w:bookmarkEnd w:id="58"/>
     </w:p>
     <w:p>
       <w:pPr>
@@ -3789,15 +4473,7 @@
         <w:t>controllers/cyberware_controller.py</w:t>
       </w:r>
       <w:r>
-        <w:t xml:space="preserve"> définit spécifiquement la route publique à l'URL /</w:t>
-      </w:r>
-      <w:proofErr w:type="spellStart"/>
-      <w:r>
-        <w:t>cyberware</w:t>
-      </w:r>
-      <w:proofErr w:type="spellEnd"/>
-      <w:r>
-        <w:t>/</w:t>
+        <w:t xml:space="preserve"> définit spécifiquement la route publique à l'URL /cyberware/</w:t>
       </w:r>
       <w:proofErr w:type="spellStart"/>
       <w:r>
@@ -3858,24 +4534,12 @@
       <w:r>
         <w:t xml:space="preserve">L'interface publique est directement consultable via l'adresse </w:t>
       </w:r>
-      <w:hyperlink r:id="rId18" w:history="1">
+      <w:hyperlink r:id="rId16" w:history="1">
         <w:r>
           <w:rPr>
             <w:rStyle w:val="Lienhypertexte"/>
           </w:rPr>
-          <w:t>http://localhost:8069/cyberware/</w:t>
-        </w:r>
-        <w:r>
-          <w:rPr>
-            <w:rStyle w:val="Lienhypertexte"/>
-          </w:rPr>
-          <w:t>m</w:t>
-        </w:r>
-        <w:r>
-          <w:rPr>
-            <w:rStyle w:val="Lienhypertexte"/>
-          </w:rPr>
-          <w:t>arket</w:t>
+          <w:t>http://localhost:8069/cyberware/market</w:t>
         </w:r>
       </w:hyperlink>
       <w:r>
@@ -3891,15 +4555,7 @@
         </w:numPr>
       </w:pPr>
       <w:r>
-        <w:t xml:space="preserve">J'ai configuré une action de type URL, qui est liée à un bouton dans le menu principal d'Odoo, à côté de l'application </w:t>
-      </w:r>
-      <w:proofErr w:type="spellStart"/>
-      <w:r>
-        <w:t>Cyberware</w:t>
-      </w:r>
-      <w:proofErr w:type="spellEnd"/>
-      <w:r>
-        <w:t>. Ce lien ouvre le catalogue dans le navigateur, permettant un accès facile depuis le backend.</w:t>
+        <w:t>J'ai configuré une action de type URL, qui est liée à un bouton dans le menu principal d'Odoo, à côté de l'application Cyberware. Ce lien ouvre le catalogue dans le navigateur, permettant un accès facile depuis le backend.</w:t>
       </w:r>
       <w:r>
         <w:br/>
@@ -3924,7 +4580,7 @@
                     <pic:cNvPicPr/>
                   </pic:nvPicPr>
                   <pic:blipFill>
-                    <a:blip r:embed="rId19"/>
+                    <a:blip r:embed="rId17"/>
                     <a:stretch>
                       <a:fillRect/>
                     </a:stretch>
@@ -3949,47 +4605,41 @@
       <w:pPr>
         <w:pStyle w:val="Lgende"/>
       </w:pPr>
+      <w:bookmarkStart w:id="59" w:name="_Toc218839527"/>
       <w:r>
         <w:t xml:space="preserve">Figure </w:t>
       </w:r>
-      <w:r>
-        <w:fldChar w:fldCharType="begin"/>
-      </w:r>
-      <w:r>
-        <w:instrText xml:space="preserve"> SEQ Figure \* ARABIC </w:instrText>
-      </w:r>
-      <w:r>
-        <w:fldChar w:fldCharType="separate"/>
-      </w:r>
-      <w:r>
-        <w:rPr>
-          <w:noProof/>
-        </w:rPr>
-        <w:t>2</w:t>
-      </w:r>
-      <w:r>
-        <w:fldChar w:fldCharType="end"/>
-      </w:r>
+      <w:fldSimple w:instr=" SEQ Figure \* ARABIC ">
+        <w:r>
+          <w:rPr>
+            <w:noProof/>
+          </w:rPr>
+          <w:t>5</w:t>
+        </w:r>
+      </w:fldSimple>
       <w:r>
         <w:t xml:space="preserve"> : Localisation bouton Site Web</w:t>
       </w:r>
+      <w:bookmarkEnd w:id="59"/>
     </w:p>
     <w:p/>
     <w:p>
       <w:pPr>
         <w:pStyle w:val="Titre2"/>
       </w:pPr>
-      <w:bookmarkStart w:id="36" w:name="_Toc215649253"/>
-      <w:bookmarkStart w:id="37" w:name="_Toc218604870"/>
+      <w:bookmarkStart w:id="60" w:name="_Toc215649253"/>
+      <w:bookmarkStart w:id="61" w:name="_Toc218604870"/>
+      <w:bookmarkStart w:id="62" w:name="_Toc218839513"/>
       <w:r>
         <w:lastRenderedPageBreak/>
         <w:t>D</w:t>
       </w:r>
-      <w:bookmarkEnd w:id="36"/>
+      <w:bookmarkEnd w:id="60"/>
       <w:r>
         <w:t>ans une des vues on trouve au moins un exemplaire de tous les champs exigés dans les consignes sur les modèles.</w:t>
       </w:r>
-      <w:bookmarkEnd w:id="37"/>
+      <w:bookmarkEnd w:id="61"/>
+      <w:bookmarkEnd w:id="62"/>
     </w:p>
     <w:p>
       <w:pPr>
@@ -4038,30 +4688,13 @@
     </w:p>
     <w:p>
       <w:r>
-        <w:t xml:space="preserve">En consultant la fiche d'un client (accessible via </w:t>
-      </w:r>
-      <w:hyperlink r:id="rId20" w:history="1">
-        <w:r>
-          <w:rPr>
-            <w:rStyle w:val="Lienhypertexte"/>
-          </w:rPr>
-          <w:t>http://localhos</w:t>
-        </w:r>
-        <w:r>
-          <w:rPr>
-            <w:rStyle w:val="Lienhypertexte"/>
-          </w:rPr>
-          <w:t>t</w:t>
-        </w:r>
-        <w:r>
-          <w:rPr>
-            <w:rStyle w:val="Lienhypertexte"/>
-          </w:rPr>
-          <w:t>:8069/odoo/action-481/3</w:t>
-        </w:r>
-      </w:hyperlink>
-      <w:r>
-        <w:t>), on peut identifier :</w:t>
+        <w:t>En consultant la fiche d'un client</w:t>
+      </w:r>
+      <w:r>
+        <w:t xml:space="preserve">, </w:t>
+      </w:r>
+      <w:r>
+        <w:t>on peut identifier :</w:t>
       </w:r>
     </w:p>
     <w:p>
@@ -4226,13 +4859,90 @@
     </w:p>
     <w:p>
       <w:pPr>
+        <w:keepNext/>
+      </w:pPr>
+      <w:r>
+        <w:rPr>
+          <w:noProof/>
+        </w:rPr>
+        <w:drawing>
+          <wp:inline distT="0" distB="0" distL="0" distR="0" wp14:anchorId="1F590965" wp14:editId="72FA52AC">
+            <wp:extent cx="5697822" cy="1864178"/>
+            <wp:effectExtent l="0" t="0" r="0" b="3175"/>
+            <wp:docPr id="1750980283" name="Image 1" descr="Une image contenant texte, logiciel, Icône d’ordinateur, Logiciel multimédia&#10;&#10;Le contenu généré par l’IA peut être incorrect."/>
+            <wp:cNvGraphicFramePr>
+              <a:graphicFrameLocks xmlns:a="http://schemas.openxmlformats.org/drawingml/2006/main" noChangeAspect="1"/>
+            </wp:cNvGraphicFramePr>
+            <a:graphic xmlns:a="http://schemas.openxmlformats.org/drawingml/2006/main">
+              <a:graphicData uri="http://schemas.openxmlformats.org/drawingml/2006/picture">
+                <pic:pic xmlns:pic="http://schemas.openxmlformats.org/drawingml/2006/picture">
+                  <pic:nvPicPr>
+                    <pic:cNvPr id="1750980283" name="Image 1" descr="Une image contenant texte, logiciel, Icône d’ordinateur, Logiciel multimédia&#10;&#10;Le contenu généré par l’IA peut être incorrect."/>
+                    <pic:cNvPicPr/>
+                  </pic:nvPicPr>
+                  <pic:blipFill rotWithShape="1">
+                    <a:blip r:embed="rId18"/>
+                    <a:srcRect l="551" t="1121" r="508"/>
+                    <a:stretch>
+                      <a:fillRect/>
+                    </a:stretch>
+                  </pic:blipFill>
+                  <pic:spPr bwMode="auto">
+                    <a:xfrm>
+                      <a:off x="0" y="0"/>
+                      <a:ext cx="5699745" cy="1864807"/>
+                    </a:xfrm>
+                    <a:prstGeom prst="rect">
+                      <a:avLst/>
+                    </a:prstGeom>
+                    <a:ln>
+                      <a:noFill/>
+                    </a:ln>
+                    <a:extLst>
+                      <a:ext uri="{53640926-AAD7-44D8-BBD7-CCE9431645EC}">
+                        <a14:shadowObscured xmlns:a14="http://schemas.microsoft.com/office/drawing/2010/main"/>
+                      </a:ext>
+                    </a:extLst>
+                  </pic:spPr>
+                </pic:pic>
+              </a:graphicData>
+            </a:graphic>
+          </wp:inline>
+        </w:drawing>
+      </w:r>
+    </w:p>
+    <w:p>
+      <w:pPr>
+        <w:pStyle w:val="Lgende"/>
+      </w:pPr>
+      <w:bookmarkStart w:id="63" w:name="_Toc218839528"/>
+      <w:r>
+        <w:t xml:space="preserve">Figure </w:t>
+      </w:r>
+      <w:fldSimple w:instr=" SEQ Figure \* ARABIC ">
+        <w:r>
+          <w:rPr>
+            <w:noProof/>
+          </w:rPr>
+          <w:t>6</w:t>
+        </w:r>
+      </w:fldSimple>
+      <w:r>
+        <w:t xml:space="preserve"> : Consulter la fiche d'un client</w:t>
+      </w:r>
+      <w:bookmarkEnd w:id="63"/>
+    </w:p>
+    <w:p>
+      <w:pPr>
         <w:pStyle w:val="Titre2"/>
       </w:pPr>
-      <w:bookmarkStart w:id="38" w:name="_Toc218604871"/>
+      <w:bookmarkStart w:id="64" w:name="_Toc218604871"/>
+      <w:bookmarkStart w:id="65" w:name="_Toc218839514"/>
       <w:r>
         <w:t>Un bouton permet d'exécuter la méthode qui contrôle les données</w:t>
       </w:r>
-      <w:bookmarkEnd w:id="38"/>
+      <w:bookmarkEnd w:id="64"/>
+      <w:bookmarkEnd w:id="65"/>
     </w:p>
     <w:p>
       <w:r>
@@ -4280,24 +4990,12 @@
       <w:r>
         <w:t xml:space="preserve">lien </w:t>
       </w:r>
-      <w:hyperlink r:id="rId21" w:history="1">
+      <w:hyperlink r:id="rId19" w:history="1">
         <w:r>
           <w:rPr>
             <w:rStyle w:val="Lienhypertexte"/>
           </w:rPr>
-          <w:t>http://localhost:8069/odoo/action-4</w:t>
-        </w:r>
-        <w:r>
-          <w:rPr>
-            <w:rStyle w:val="Lienhypertexte"/>
-          </w:rPr>
-          <w:t>8</w:t>
-        </w:r>
-        <w:r>
-          <w:rPr>
-            <w:rStyle w:val="Lienhypertexte"/>
-          </w:rPr>
-          <w:t>6/3</w:t>
+          <w:t>http://localhost:8069/odoo/action-486/3</w:t>
         </w:r>
       </w:hyperlink>
       <w:r>
@@ -4322,15 +5020,94 @@
         <w:t xml:space="preserve">. </w:t>
       </w:r>
     </w:p>
+    <w:p/>
+    <w:p>
+      <w:pPr>
+        <w:keepNext/>
+      </w:pPr>
+      <w:r>
+        <w:rPr>
+          <w:noProof/>
+        </w:rPr>
+        <w:lastRenderedPageBreak/>
+        <w:drawing>
+          <wp:inline distT="0" distB="0" distL="0" distR="0" wp14:anchorId="4A1542D8" wp14:editId="37099633">
+            <wp:extent cx="5692537" cy="1679487"/>
+            <wp:effectExtent l="0" t="0" r="3810" b="0"/>
+            <wp:docPr id="1022585236" name="Image 1" descr="Une image contenant texte, capture d’écran, logiciel, Icône d’ordinateur&#10;&#10;Le contenu généré par l’IA peut être incorrect."/>
+            <wp:cNvGraphicFramePr>
+              <a:graphicFrameLocks xmlns:a="http://schemas.openxmlformats.org/drawingml/2006/main" noChangeAspect="1"/>
+            </wp:cNvGraphicFramePr>
+            <a:graphic xmlns:a="http://schemas.openxmlformats.org/drawingml/2006/main">
+              <a:graphicData uri="http://schemas.openxmlformats.org/drawingml/2006/picture">
+                <pic:pic xmlns:pic="http://schemas.openxmlformats.org/drawingml/2006/picture">
+                  <pic:nvPicPr>
+                    <pic:cNvPr id="1022585236" name="Image 1" descr="Une image contenant texte, capture d’écran, logiciel, Icône d’ordinateur&#10;&#10;Le contenu généré par l’IA peut être incorrect."/>
+                    <pic:cNvPicPr/>
+                  </pic:nvPicPr>
+                  <pic:blipFill rotWithShape="1">
+                    <a:blip r:embed="rId20"/>
+                    <a:srcRect l="826" t="3050" r="324"/>
+                    <a:stretch>
+                      <a:fillRect/>
+                    </a:stretch>
+                  </pic:blipFill>
+                  <pic:spPr bwMode="auto">
+                    <a:xfrm>
+                      <a:off x="0" y="0"/>
+                      <a:ext cx="5694477" cy="1680059"/>
+                    </a:xfrm>
+                    <a:prstGeom prst="rect">
+                      <a:avLst/>
+                    </a:prstGeom>
+                    <a:ln>
+                      <a:noFill/>
+                    </a:ln>
+                    <a:extLst>
+                      <a:ext uri="{53640926-AAD7-44D8-BBD7-CCE9431645EC}">
+                        <a14:shadowObscured xmlns:a14="http://schemas.microsoft.com/office/drawing/2010/main"/>
+                      </a:ext>
+                    </a:extLst>
+                  </pic:spPr>
+                </pic:pic>
+              </a:graphicData>
+            </a:graphic>
+          </wp:inline>
+        </w:drawing>
+      </w:r>
+    </w:p>
+    <w:p>
+      <w:pPr>
+        <w:pStyle w:val="Lgende"/>
+      </w:pPr>
+      <w:bookmarkStart w:id="66" w:name="_Toc218839529"/>
+      <w:r>
+        <w:t xml:space="preserve">Figure </w:t>
+      </w:r>
+      <w:fldSimple w:instr=" SEQ Figure \* ARABIC ">
+        <w:r>
+          <w:rPr>
+            <w:noProof/>
+          </w:rPr>
+          <w:t>7</w:t>
+        </w:r>
+      </w:fldSimple>
+      <w:r>
+        <w:t xml:space="preserve"> : Bouton pour vérifier le dossier d'un client</w:t>
+      </w:r>
+      <w:bookmarkEnd w:id="66"/>
+    </w:p>
     <w:p>
       <w:pPr>
         <w:pStyle w:val="Titre2"/>
       </w:pPr>
-      <w:bookmarkStart w:id="39" w:name="_Toc218604872"/>
+      <w:bookmarkStart w:id="67" w:name="_Toc218604872"/>
+      <w:bookmarkStart w:id="68" w:name="_Toc218839515"/>
       <w:r>
         <w:t>L'héritage du modèle étendu est utilisé dans une vue (affichage d'un champ parent ou modification d'une des vues du modèle parent)</w:t>
       </w:r>
-      <w:bookmarkEnd w:id="39"/>
+      <w:bookmarkEnd w:id="67"/>
+      <w:bookmarkEnd w:id="68"/>
     </w:p>
     <w:p>
       <w:r>
@@ -4451,32 +5228,78 @@
     </w:p>
     <w:p>
       <w:r>
+        <w:t>Cette extension est visible pour n’importe quel contact</w:t>
+      </w:r>
+      <w:r>
+        <w:t>.</w:t>
+      </w:r>
+    </w:p>
+    <w:p/>
+    <w:p>
+      <w:r>
+        <w:rPr>
+          <w:noProof/>
+        </w:rPr>
+        <w:drawing>
+          <wp:inline distT="0" distB="0" distL="0" distR="0" wp14:anchorId="06F1DD00" wp14:editId="567A7D2D">
+            <wp:extent cx="5622591" cy="2341245"/>
+            <wp:effectExtent l="0" t="0" r="0" b="1905"/>
+            <wp:docPr id="1252913525" name="Image 1" descr="Une image contenant texte, capture d’écran, logiciel, Page web&#10;&#10;Le contenu généré par l’IA peut être incorrect."/>
+            <wp:cNvGraphicFramePr>
+              <a:graphicFrameLocks xmlns:a="http://schemas.openxmlformats.org/drawingml/2006/main" noChangeAspect="1"/>
+            </wp:cNvGraphicFramePr>
+            <a:graphic xmlns:a="http://schemas.openxmlformats.org/drawingml/2006/main">
+              <a:graphicData uri="http://schemas.openxmlformats.org/drawingml/2006/picture">
+                <pic:pic xmlns:pic="http://schemas.openxmlformats.org/drawingml/2006/picture">
+                  <pic:nvPicPr>
+                    <pic:cNvPr id="1252913525" name="Image 1" descr="Une image contenant texte, capture d’écran, logiciel, Page web&#10;&#10;Le contenu généré par l’IA peut être incorrect."/>
+                    <pic:cNvPicPr/>
+                  </pic:nvPicPr>
+                  <pic:blipFill rotWithShape="1">
+                    <a:blip r:embed="rId21"/>
+                    <a:srcRect l="1009" t="2949" r="1363" b="9969"/>
+                    <a:stretch>
+                      <a:fillRect/>
+                    </a:stretch>
+                  </pic:blipFill>
+                  <pic:spPr bwMode="auto">
+                    <a:xfrm>
+                      <a:off x="0" y="0"/>
+                      <a:ext cx="5624010" cy="2341836"/>
+                    </a:xfrm>
+                    <a:prstGeom prst="rect">
+                      <a:avLst/>
+                    </a:prstGeom>
+                    <a:ln>
+                      <a:noFill/>
+                    </a:ln>
+                    <a:extLst>
+                      <a:ext uri="{53640926-AAD7-44D8-BBD7-CCE9431645EC}">
+                        <a14:shadowObscured xmlns:a14="http://schemas.microsoft.com/office/drawing/2010/main"/>
+                      </a:ext>
+                    </a:extLst>
+                  </pic:spPr>
+                </pic:pic>
+              </a:graphicData>
+            </a:graphic>
+          </wp:inline>
+        </w:drawing>
+      </w:r>
+    </w:p>
+    <w:p>
+      <w:pPr>
+        <w:pStyle w:val="Titre2"/>
+      </w:pPr>
+      <w:bookmarkStart w:id="69" w:name="_Toc215649254"/>
+      <w:bookmarkStart w:id="70" w:name="_Toc218604873"/>
+      <w:bookmarkStart w:id="71" w:name="_Toc218839516"/>
+      <w:r>
         <w:lastRenderedPageBreak/>
-        <w:t xml:space="preserve">Cette extension est visible pour n’importe quel contact (ex : </w:t>
-      </w:r>
-      <w:hyperlink r:id="rId22" w:history="1">
-        <w:r>
-          <w:rPr>
-            <w:rStyle w:val="Lienhypertexte"/>
-          </w:rPr>
-          <w:t>http://localhost:8069/odoo/contacts/27</w:t>
-        </w:r>
-      </w:hyperlink>
-      <w:r>
-        <w:t>).</w:t>
-      </w:r>
-    </w:p>
-    <w:p>
-      <w:pPr>
-        <w:pStyle w:val="Titre2"/>
-      </w:pPr>
-      <w:bookmarkStart w:id="40" w:name="_Toc215649254"/>
-      <w:bookmarkStart w:id="41" w:name="_Toc218604873"/>
-      <w:r>
         <w:t>Un ou plusieurs champs ne sont visibles que pour un groupe d'utilisateur ou en fonction de la valeur d'un autre champ.</w:t>
       </w:r>
-      <w:bookmarkEnd w:id="40"/>
-      <w:bookmarkEnd w:id="41"/>
+      <w:bookmarkEnd w:id="69"/>
+      <w:bookmarkEnd w:id="70"/>
+      <w:bookmarkEnd w:id="71"/>
     </w:p>
     <w:p>
       <w:r>
@@ -4549,21 +5372,8 @@
         <w:t>is_charcudoc</w:t>
       </w:r>
       <w:proofErr w:type="spellEnd"/>
-      <w:proofErr w:type="gramStart"/>
-      <w:r>
-        <w:t>" .</w:t>
-      </w:r>
-      <w:proofErr w:type="gramEnd"/>
-      <w:r>
-        <w:t xml:space="preserve"> Ainsi, ce champ n'apparaît à l'utilisateur que si la case Est </w:t>
-      </w:r>
-      <w:proofErr w:type="gramStart"/>
-      <w:r>
-        <w:t>un</w:t>
-      </w:r>
-      <w:proofErr w:type="gramEnd"/>
-      <w:r>
-        <w:t xml:space="preserve"> </w:t>
+      <w:r>
+        <w:t xml:space="preserve">". Ainsi, ce champ n'apparaît à l'utilisateur que si la case Est un </w:t>
       </w:r>
       <w:proofErr w:type="spellStart"/>
       <w:r>
@@ -4575,7 +5385,7 @@
       </w:r>
     </w:p>
     <w:sectPr>
-      <w:footerReference w:type="default" r:id="rId23"/>
+      <w:footerReference w:type="default" r:id="rId22"/>
       <w:pgSz w:w="11906" w:h="16838"/>
       <w:pgMar w:top="1417" w:right="1417" w:bottom="1417" w:left="1417" w:header="708" w:footer="708" w:gutter="0"/>
       <w:cols w:space="708"/>
@@ -7191,6 +8001,7 @@
   <w:style w:type="character" w:default="1" w:styleId="Policepardfaut">
     <w:name w:val="Default Paragraph Font"/>
     <w:uiPriority w:val="1"/>
+    <w:semiHidden/>
     <w:unhideWhenUsed/>
   </w:style>
   <w:style w:type="table" w:default="1" w:styleId="TableauNormal">
@@ -7575,18 +8386,14 @@
     <w:unhideWhenUsed/>
     <w:rsid w:val="007B3E23"/>
     <w:pPr>
-      <w:tabs>
-        <w:tab w:val="right" w:leader="underscore" w:pos="9062"/>
-      </w:tabs>
-      <w:spacing w:before="120" w:after="0"/>
+      <w:spacing w:before="120" w:after="120"/>
     </w:pPr>
     <w:rPr>
       <w:b/>
       <w:bCs/>
-      <w:i/>
-      <w:iCs/>
-      <w:sz w:val="40"/>
-      <w:szCs w:val="40"/>
+      <w:caps/>
+      <w:sz w:val="20"/>
+      <w:szCs w:val="20"/>
     </w:rPr>
   </w:style>
   <w:style w:type="paragraph" w:styleId="TM2">
@@ -7598,14 +8405,13 @@
     <w:unhideWhenUsed/>
     <w:rsid w:val="007B3E23"/>
     <w:pPr>
-      <w:spacing w:before="120" w:after="0"/>
+      <w:spacing w:after="0"/>
       <w:ind w:left="240"/>
     </w:pPr>
     <w:rPr>
-      <w:b/>
-      <w:bCs/>
-      <w:sz w:val="22"/>
-      <w:szCs w:val="22"/>
+      <w:smallCaps/>
+      <w:sz w:val="20"/>
+      <w:szCs w:val="20"/>
     </w:rPr>
   </w:style>
   <w:style w:type="character" w:styleId="Lienhypertexte">
@@ -7632,6 +8438,8 @@
       <w:ind w:left="480"/>
     </w:pPr>
     <w:rPr>
+      <w:i/>
+      <w:iCs/>
       <w:sz w:val="20"/>
       <w:szCs w:val="20"/>
     </w:rPr>
@@ -7649,8 +8457,8 @@
       <w:ind w:left="720"/>
     </w:pPr>
     <w:rPr>
-      <w:sz w:val="20"/>
-      <w:szCs w:val="20"/>
+      <w:sz w:val="18"/>
+      <w:szCs w:val="18"/>
     </w:rPr>
   </w:style>
   <w:style w:type="paragraph" w:styleId="TM5">
@@ -7666,8 +8474,8 @@
       <w:ind w:left="960"/>
     </w:pPr>
     <w:rPr>
-      <w:sz w:val="20"/>
-      <w:szCs w:val="20"/>
+      <w:sz w:val="18"/>
+      <w:szCs w:val="18"/>
     </w:rPr>
   </w:style>
   <w:style w:type="paragraph" w:styleId="TM6">
@@ -7683,8 +8491,8 @@
       <w:ind w:left="1200"/>
     </w:pPr>
     <w:rPr>
-      <w:sz w:val="20"/>
-      <w:szCs w:val="20"/>
+      <w:sz w:val="18"/>
+      <w:szCs w:val="18"/>
     </w:rPr>
   </w:style>
   <w:style w:type="paragraph" w:styleId="TM7">
@@ -7700,8 +8508,8 @@
       <w:ind w:left="1440"/>
     </w:pPr>
     <w:rPr>
-      <w:sz w:val="20"/>
-      <w:szCs w:val="20"/>
+      <w:sz w:val="18"/>
+      <w:szCs w:val="18"/>
     </w:rPr>
   </w:style>
   <w:style w:type="paragraph" w:styleId="TM8">
@@ -7717,8 +8525,8 @@
       <w:ind w:left="1680"/>
     </w:pPr>
     <w:rPr>
-      <w:sz w:val="20"/>
-      <w:szCs w:val="20"/>
+      <w:sz w:val="18"/>
+      <w:szCs w:val="18"/>
     </w:rPr>
   </w:style>
   <w:style w:type="paragraph" w:styleId="TM9">
@@ -7734,8 +8542,8 @@
       <w:ind w:left="1920"/>
     </w:pPr>
     <w:rPr>
-      <w:sz w:val="20"/>
-      <w:szCs w:val="20"/>
+      <w:sz w:val="18"/>
+      <w:szCs w:val="18"/>
     </w:rPr>
   </w:style>
   <w:style w:type="character" w:styleId="Mentionnonrsolue">
@@ -7791,6 +8599,17 @@
       <w:color w:val="96607D" w:themeColor="followedHyperlink"/>
       <w:u w:val="single"/>
     </w:rPr>
+  </w:style>
+  <w:style w:type="paragraph" w:styleId="Tabledesillustrations">
+    <w:name w:val="table of figures"/>
+    <w:basedOn w:val="Normal"/>
+    <w:next w:val="Normal"/>
+    <w:uiPriority w:val="99"/>
+    <w:unhideWhenUsed/>
+    <w:rsid w:val="003850B2"/>
+    <w:pPr>
+      <w:spacing w:after="0"/>
+    </w:pPr>
   </w:style>
 </w:styles>
 </file>

</xml_diff>